<commit_message>
feat: redesign CV as unique product-page layout (dark sidebar, skill bars, scannable product QR codes)
</commit_message>
<xml_diff>
--- a/public/Vamshidhar_Reddy_M_CV.docx
+++ b/public/Vamshidhar_Reddy_M_CV.docx
@@ -8,41 +8,277 @@
         <w:jc w:val="center"/>
         <w:tblLayout w:type="fixed"/>
         <w:tblLook w:firstColumn="1" w:firstRow="1" w:lastColumn="0" w:lastRow="0" w:noHBand="0" w:noVBand="1" w:val="04A0"/>
+        <w:tblBorders>
+          <w:top w:val="none"/>
+          <w:left w:val="none"/>
+          <w:bottom w:val="none"/>
+          <w:right w:val="none"/>
+          <w:insideH w:val="none"/>
+          <w:insideV w:val="none"/>
+        </w:tblBorders>
       </w:tblPr>
       <w:tblGrid>
-        <w:gridCol w:w="9216"/>
-        <w:gridCol w:w="1008"/>
+        <w:gridCol w:w="3528"/>
+        <w:gridCol w:w="7416"/>
       </w:tblGrid>
       <w:tr>
         <w:tc>
           <w:tcPr>
-            <w:tcW w:type="dxa" w:w="5112"/>
-            <w:shd w:val="clear" w:color="auto" w:fill="2F2F5A"/>
+            <w:tcW w:type="dxa" w:w="5328"/>
+            <w:shd w:val="clear" w:color="auto" w:fill="1E1F33"/>
+            <w:tcMar>
+              <w:top w:w="220" w:type="dxa"/>
+              <w:bottom w:w="160" w:type="dxa"/>
+              <w:left w:w="200" w:type="dxa"/>
+              <w:right w:w="150" w:type="dxa"/>
+            </w:tcMar>
           </w:tcPr>
           <w:p>
             <w:pPr>
-              <w:spacing w:before="80" w:after="20"/>
+              <w:spacing w:after="120"/>
+              <w:jc w:val="center"/>
             </w:pPr>
             <w:r>
               <w:rPr>
                 <w:rFonts w:ascii="Calibri" w:hAnsi="Calibri"/>
                 <w:b/>
-                <w:color w:val="FFFFFF"/>
-                <w:sz w:val="44"/>
+                <w:color w:val="2FF3C0"/>
+                <w:sz w:val="60"/>
+              </w:rPr>
+              <w:t>VR</w:t>
+            </w:r>
+          </w:p>
+        </w:tc>
+        <w:tc>
+          <w:tcPr>
+            <w:tcW w:type="dxa" w:w="5328"/>
+            <w:tcMar>
+              <w:top w:w="160" w:type="dxa"/>
+              <w:bottom w:w="120" w:type="dxa"/>
+              <w:left w:w="200" w:type="dxa"/>
+              <w:right w:w="120" w:type="dxa"/>
+            </w:tcMar>
+          </w:tcPr>
+          <w:p>
+            <w:pPr>
+              <w:spacing w:after="20"/>
+            </w:pPr>
+            <w:r>
+              <w:rPr>
+                <w:rFonts w:ascii="Calibri" w:hAnsi="Calibri"/>
+                <w:b/>
+                <w:i w:val="0"/>
+                <w:color w:val="1E1F33"/>
+                <w:sz w:val="48"/>
               </w:rPr>
               <w:t>VAMSHIDHAR REDDY M</w:t>
             </w:r>
           </w:p>
           <w:p>
             <w:pPr>
-              <w:spacing w:after="20"/>
+              <w:spacing w:after="40"/>
             </w:pPr>
             <w:r>
               <w:rPr>
-                <w:color w:val="CFCFFF"/>
-                <w:sz w:val="24"/>
+                <w:rFonts w:ascii="Calibri" w:hAnsi="Calibri"/>
+                <w:b/>
+                <w:i w:val="0"/>
+                <w:color w:val="2E86AB"/>
+                <w:sz w:val="26"/>
               </w:rPr>
-              <w:t>AI-Powered Digital Marketing Specialist</w:t>
+              <w:t>Performance Marketer Who Builds AI Tools</w:t>
+            </w:r>
+          </w:p>
+          <w:p>
+            <w:pPr>
+              <w:spacing w:after="120"/>
+            </w:pPr>
+            <w:r>
+              <w:rPr>
+                <w:rFonts w:ascii="Calibri" w:hAnsi="Calibri"/>
+                <w:b w:val="0"/>
+                <w:i w:val="0"/>
+                <w:color w:val="5A5D6E"/>
+                <w:sz w:val="18"/>
+              </w:rPr>
+              <w:t>SEO   ·   PPC   ·   AI Automation   ·   Content   ·   Analytics</w:t>
+            </w:r>
+          </w:p>
+          <w:tbl>
+            <w:tblPr>
+              <w:tblW w:type="auto" w:w="0"/>
+              <w:tblLook w:firstColumn="1" w:firstRow="1" w:lastColumn="0" w:lastRow="0" w:noHBand="0" w:noVBand="1" w:val="04A0"/>
+              <w:tblBorders>
+                <w:top w:val="none"/>
+                <w:left w:val="none"/>
+                <w:bottom w:val="none"/>
+                <w:right w:val="none"/>
+                <w:insideH w:val="none"/>
+                <w:insideV w:val="none"/>
+              </w:tblBorders>
+            </w:tblPr>
+            <w:tblGrid>
+              <w:gridCol w:w="1066"/>
+              <w:gridCol w:w="1066"/>
+              <w:gridCol w:w="1066"/>
+              <w:gridCol w:w="1066"/>
+              <w:gridCol w:w="1066"/>
+            </w:tblGrid>
+            <w:tr>
+              <w:tc>
+                <w:tcPr>
+                  <w:tcW w:type="dxa" w:w="1066"/>
+                  <w:shd w:val="clear" w:color="auto" w:fill="F2F4F8"/>
+                  <w:tcMar>
+                    <w:top w:w="60" w:type="dxa"/>
+                    <w:bottom w:w="60" w:type="dxa"/>
+                    <w:left w:w="60" w:type="dxa"/>
+                    <w:right w:w="60" w:type="dxa"/>
+                  </w:tcMar>
+                </w:tcPr>
+                <w:p>
+                  <w:pPr>
+                    <w:spacing w:after="0"/>
+                    <w:jc w:val="center"/>
+                  </w:pPr>
+                  <w:r>
+                    <w:rPr>
+                      <w:b/>
+                      <w:color w:val="2E86AB"/>
+                      <w:sz w:val="15"/>
+                    </w:rPr>
+                    <w:t>15% organic growth</w:t>
+                  </w:r>
+                </w:p>
+              </w:tc>
+              <w:tc>
+                <w:tcPr>
+                  <w:tcW w:type="dxa" w:w="1066"/>
+                  <w:shd w:val="clear" w:color="auto" w:fill="F2F4F8"/>
+                  <w:tcMar>
+                    <w:top w:w="60" w:type="dxa"/>
+                    <w:bottom w:w="60" w:type="dxa"/>
+                    <w:left w:w="60" w:type="dxa"/>
+                    <w:right w:w="60" w:type="dxa"/>
+                  </w:tcMar>
+                </w:tcPr>
+                <w:p>
+                  <w:pPr>
+                    <w:spacing w:after="0"/>
+                    <w:jc w:val="center"/>
+                  </w:pPr>
+                  <w:r>
+                    <w:rPr>
+                      <w:b/>
+                      <w:color w:val="2E86AB"/>
+                      <w:sz w:val="15"/>
+                    </w:rPr>
+                    <w:t>Page-1 rankings</w:t>
+                  </w:r>
+                </w:p>
+              </w:tc>
+              <w:tc>
+                <w:tcPr>
+                  <w:tcW w:type="dxa" w:w="1066"/>
+                  <w:shd w:val="clear" w:color="auto" w:fill="F2F4F8"/>
+                  <w:tcMar>
+                    <w:top w:w="60" w:type="dxa"/>
+                    <w:bottom w:w="60" w:type="dxa"/>
+                    <w:left w:w="60" w:type="dxa"/>
+                    <w:right w:w="60" w:type="dxa"/>
+                  </w:tcMar>
+                </w:tcPr>
+                <w:p>
+                  <w:pPr>
+                    <w:spacing w:after="0"/>
+                    <w:jc w:val="center"/>
+                  </w:pPr>
+                  <w:r>
+                    <w:rPr>
+                      <w:b/>
+                      <w:color w:val="2E86AB"/>
+                      <w:sz w:val="15"/>
+                    </w:rPr>
+                    <w:t>70+ leads/mo</w:t>
+                  </w:r>
+                </w:p>
+              </w:tc>
+              <w:tc>
+                <w:tcPr>
+                  <w:tcW w:type="dxa" w:w="1066"/>
+                  <w:shd w:val="clear" w:color="auto" w:fill="F2F4F8"/>
+                  <w:tcMar>
+                    <w:top w:w="60" w:type="dxa"/>
+                    <w:bottom w:w="60" w:type="dxa"/>
+                    <w:left w:w="60" w:type="dxa"/>
+                    <w:right w:w="60" w:type="dxa"/>
+                  </w:tcMar>
+                </w:tcPr>
+                <w:p>
+                  <w:pPr>
+                    <w:spacing w:after="0"/>
+                    <w:jc w:val="center"/>
+                  </w:pPr>
+                  <w:r>
+                    <w:rPr>
+                      <w:b/>
+                      <w:color w:val="2E86AB"/>
+                      <w:sz w:val="15"/>
+                    </w:rPr>
+                    <w:t>Rs.2L+ ad spend</w:t>
+                  </w:r>
+                </w:p>
+              </w:tc>
+              <w:tc>
+                <w:tcPr>
+                  <w:tcW w:type="dxa" w:w="1066"/>
+                  <w:shd w:val="clear" w:color="auto" w:fill="F2F4F8"/>
+                  <w:tcMar>
+                    <w:top w:w="60" w:type="dxa"/>
+                    <w:bottom w:w="60" w:type="dxa"/>
+                    <w:left w:w="60" w:type="dxa"/>
+                    <w:right w:w="60" w:type="dxa"/>
+                  </w:tcMar>
+                </w:tcPr>
+                <w:p>
+                  <w:pPr>
+                    <w:spacing w:after="0"/>
+                    <w:jc w:val="center"/>
+                  </w:pPr>
+                  <w:r>
+                    <w:rPr>
+                      <w:b/>
+                      <w:color w:val="2E86AB"/>
+                      <w:sz w:val="15"/>
+                    </w:rPr>
+                    <w:t>3 products shipped</w:t>
+                  </w:r>
+                </w:p>
+              </w:tc>
+            </w:tr>
+          </w:tbl>
+          <w:p/>
+          <w:p>
+            <w:pPr>
+              <w:spacing w:after="40"/>
+            </w:pPr>
+          </w:p>
+          <w:p>
+            <w:pPr>
+              <w:spacing w:before="0" w:after="40"/>
+              <w:pBdr>
+                <w:bottom w:val="single" w:sz="8" w:space="2" w:color="2E86AB"/>
+              </w:pBdr>
+            </w:pPr>
+            <w:r>
+              <w:rPr>
+                <w:rFonts w:ascii="Calibri" w:hAnsi="Calibri"/>
+                <w:b/>
+                <w:i w:val="0"/>
+                <w:color w:val="2E86AB"/>
+                <w:sz w:val="22"/>
+              </w:rPr>
+              <w:t>PROFILE</w:t>
             </w:r>
           </w:p>
           <w:p>
@@ -51,93 +287,1099 @@
             </w:pPr>
             <w:r>
               <w:rPr>
-                <w:color w:val="BFBFE6"/>
-                <w:sz w:val="18"/>
+                <w:rFonts w:ascii="Calibri" w:hAnsi="Calibri"/>
+                <w:b w:val="0"/>
+                <w:i w:val="0"/>
+                <w:color w:val="2B2D3A"/>
+                <w:sz w:val="19"/>
               </w:rPr>
-              <w:t>SEO  |  PPC  |  AI Automation  |  Content Strategy  |  Analytics &amp; Reporting</w:t>
-            </w:r>
-          </w:p>
-        </w:tc>
-        <w:tc>
-          <w:tcPr>
-            <w:tcW w:type="dxa" w:w="5112"/>
-            <w:shd w:val="clear" w:color="auto" w:fill="2F2F5A"/>
-          </w:tcPr>
-          <w:p>
-            <w:pPr>
-              <w:spacing w:before="80" w:after="20"/>
-            </w:pPr>
-          </w:p>
-          <w:p>
-            <w:pPr>
-              <w:spacing w:after="0" w:before="0"/>
-            </w:pPr>
-            <w:r>
-              <w:rPr>
-                <w:color w:val="FFFFFF"/>
-                <w:sz w:val="16"/>
-              </w:rPr>
-              <w:t>Hyderabad, India</w:t>
+              <w:t>I sit in a rare middle lane: I plan the strategy with the CMO and build the tool that executes it. 8+ years of SEO, PPC and content, plus three AI products I designed, built and shipped solo. Everything I claim is measurable — and this very CV comes with live links you can click.</w:t>
             </w:r>
           </w:p>
           <w:p>
             <w:pPr>
-              <w:spacing w:after="0" w:before="0"/>
+              <w:spacing w:before="80" w:after="40"/>
+              <w:pBdr>
+                <w:bottom w:val="single" w:sz="8" w:space="2" w:color="2E86AB"/>
+              </w:pBdr>
             </w:pPr>
             <w:r>
               <w:rPr>
-                <w:color w:val="FFFFFF"/>
-                <w:sz w:val="16"/>
+                <w:rFonts w:ascii="Calibri" w:hAnsi="Calibri"/>
+                <w:b/>
+                <w:i w:val="0"/>
+                <w:color w:val="2E86AB"/>
+                <w:sz w:val="22"/>
               </w:rPr>
-              <w:t>+91-7981719085</w:t>
+              <w:t>EXPERIENCE</w:t>
             </w:r>
           </w:p>
           <w:p>
             <w:pPr>
-              <w:spacing w:after="0" w:before="0"/>
+              <w:spacing w:before="60" w:after="0"/>
             </w:pPr>
             <w:r>
               <w:rPr>
-                <w:color w:val="FFFFFF"/>
+                <w:rFonts w:ascii="Calibri" w:hAnsi="Calibri"/>
+                <w:b/>
+                <w:i w:val="0"/>
+                <w:color w:val="2FF3C0"/>
+                <w:sz w:val="18"/>
+              </w:rPr>
+              <w:t xml:space="preserve">▸ </w:t>
+            </w:r>
+            <w:r>
+              <w:rPr>
+                <w:rFonts w:ascii="Calibri" w:hAnsi="Calibri"/>
+                <w:b/>
+                <w:i w:val="0"/>
+                <w:color w:val="2B2D3A"/>
+                <w:sz w:val="19"/>
+              </w:rPr>
+              <w:t>Digital Marketing Specialist</w:t>
+            </w:r>
+            <w:r>
+              <w:rPr>
+                <w:rFonts w:ascii="Calibri" w:hAnsi="Calibri"/>
+                <w:b w:val="0"/>
+                <w:i w:val="0"/>
+                <w:color w:val="5A5D6E"/>
+                <w:sz w:val="17"/>
+              </w:rPr>
+              <w:t xml:space="preserve">   |   Autozilla Software Solutions   </w:t>
+            </w:r>
+            <w:r>
+              <w:rPr>
+                <w:rFonts w:ascii="Calibri" w:hAnsi="Calibri"/>
+                <w:b w:val="0"/>
+                <w:i/>
+                <w:color w:val="5A5D6E"/>
                 <w:sz w:val="16"/>
               </w:rPr>
-              <w:t>geovamshidhar@gmail.com</w:t>
+              <w:t>May 2023 – Present</w:t>
             </w:r>
           </w:p>
           <w:p>
             <w:pPr>
-              <w:spacing w:after="0" w:before="0"/>
+              <w:spacing w:after="0"/>
+              <w:ind w:left="288"/>
             </w:pPr>
             <w:r>
               <w:rPr>
-                <w:color w:val="FFFFFF"/>
-                <w:sz w:val="16"/>
+                <w:rFonts w:ascii="Calibri" w:hAnsi="Calibri"/>
+                <w:b/>
+                <w:i w:val="0"/>
+                <w:color w:val="2E86AB"/>
+                <w:sz w:val="17"/>
               </w:rPr>
-              <w:t>linkedin.com/in/vamshidharreddym</w:t>
+              <w:t xml:space="preserve">• </w:t>
+            </w:r>
+            <w:r>
+              <w:rPr>
+                <w:rFonts w:ascii="Calibri" w:hAnsi="Calibri"/>
+                <w:b w:val="0"/>
+                <w:i w:val="0"/>
+                <w:color w:val="2B2D3A"/>
+                <w:sz w:val="17"/>
+              </w:rPr>
+              <w:t>Grew organic traffic 15% (SEO audits, keyword gap, content + technical fixes)</w:t>
             </w:r>
           </w:p>
           <w:p>
             <w:pPr>
-              <w:spacing w:after="0" w:before="0"/>
+              <w:spacing w:after="0"/>
+              <w:ind w:left="288"/>
             </w:pPr>
             <w:r>
               <w:rPr>
-                <w:color w:val="FFFFFF"/>
-                <w:sz w:val="16"/>
+                <w:rFonts w:ascii="Calibri" w:hAnsi="Calibri"/>
+                <w:b/>
+                <w:i w:val="0"/>
+                <w:color w:val="2E86AB"/>
+                <w:sz w:val="17"/>
               </w:rPr>
-              <w:t>github.com/gitvamshidhar-m</w:t>
+              <w:t xml:space="preserve">• </w:t>
+            </w:r>
+            <w:r>
+              <w:rPr>
+                <w:rFonts w:ascii="Calibri" w:hAnsi="Calibri"/>
+                <w:b w:val="0"/>
+                <w:i w:val="0"/>
+                <w:color w:val="2B2D3A"/>
+                <w:sz w:val="17"/>
+              </w:rPr>
+              <w:t>70+ qualified leads/mo by wiring SEO, Google Ads and landing pages into one funnel</w:t>
             </w:r>
           </w:p>
           <w:p>
             <w:pPr>
-              <w:spacing w:after="0" w:before="0"/>
+              <w:spacing w:after="0"/>
+              <w:ind w:left="288"/>
             </w:pPr>
             <w:r>
               <w:rPr>
-                <w:color w:val="FFFFFF"/>
+                <w:rFonts w:ascii="Calibri" w:hAnsi="Calibri"/>
+                <w:b/>
+                <w:i w:val="0"/>
+                <w:color w:val="2E86AB"/>
+                <w:sz w:val="17"/>
+              </w:rPr>
+              <w:t xml:space="preserve">• </w:t>
+            </w:r>
+            <w:r>
+              <w:rPr>
+                <w:rFonts w:ascii="Calibri" w:hAnsi="Calibri"/>
+                <w:b w:val="0"/>
+                <w:i w:val="0"/>
+                <w:color w:val="2B2D3A"/>
+                <w:sz w:val="17"/>
+              </w:rPr>
+              <w:t>Managed Rs.2L+ monthly ad spend; cut CPL Rs.1,100→Rs.770; lifted ROAS 3.2x→5.5x</w:t>
+            </w:r>
+          </w:p>
+          <w:p>
+            <w:pPr>
+              <w:spacing w:after="0"/>
+              <w:ind w:left="288"/>
+            </w:pPr>
+            <w:r>
+              <w:rPr>
+                <w:rFonts w:ascii="Calibri" w:hAnsi="Calibri"/>
+                <w:b/>
+                <w:i w:val="0"/>
+                <w:color w:val="2E86AB"/>
+                <w:sz w:val="17"/>
+              </w:rPr>
+              <w:t xml:space="preserve">• </w:t>
+            </w:r>
+            <w:r>
+              <w:rPr>
+                <w:rFonts w:ascii="Calibri" w:hAnsi="Calibri"/>
+                <w:b w:val="0"/>
+                <w:i w:val="0"/>
+                <w:color w:val="2B2D3A"/>
+                <w:sz w:val="17"/>
+              </w:rPr>
+              <w:t>Built AI-assisted content workflows; GA4 + Looker dashboards; A/B tested copy &amp; CTAs</w:t>
+            </w:r>
+          </w:p>
+          <w:p>
+            <w:pPr>
+              <w:spacing w:before="60" w:after="0"/>
+            </w:pPr>
+            <w:r>
+              <w:rPr>
+                <w:rFonts w:ascii="Calibri" w:hAnsi="Calibri"/>
+                <w:b/>
+                <w:i w:val="0"/>
+                <w:color w:val="2FF3C0"/>
+                <w:sz w:val="18"/>
+              </w:rPr>
+              <w:t xml:space="preserve">▸ </w:t>
+            </w:r>
+            <w:r>
+              <w:rPr>
+                <w:rFonts w:ascii="Calibri" w:hAnsi="Calibri"/>
+                <w:b/>
+                <w:i w:val="0"/>
+                <w:color w:val="2B2D3A"/>
+                <w:sz w:val="19"/>
+              </w:rPr>
+              <w:t>Campaign Specialist</w:t>
+            </w:r>
+            <w:r>
+              <w:rPr>
+                <w:rFonts w:ascii="Calibri" w:hAnsi="Calibri"/>
+                <w:b w:val="0"/>
+                <w:i w:val="0"/>
+                <w:color w:val="5A5D6E"/>
+                <w:sz w:val="17"/>
+              </w:rPr>
+              <w:t xml:space="preserve">   |   Pranathi Software Services   </w:t>
+            </w:r>
+            <w:r>
+              <w:rPr>
+                <w:rFonts w:ascii="Calibri" w:hAnsi="Calibri"/>
+                <w:b w:val="0"/>
+                <w:i/>
+                <w:color w:val="5A5D6E"/>
                 <w:sz w:val="16"/>
               </w:rPr>
-              <w:t>vamshidharm.vercel.app</w:t>
+              <w:t>Jun 2022 – May 2023</w:t>
+            </w:r>
+          </w:p>
+          <w:p>
+            <w:pPr>
+              <w:spacing w:after="0"/>
+              <w:ind w:left="288"/>
+            </w:pPr>
+            <w:r>
+              <w:rPr>
+                <w:rFonts w:ascii="Calibri" w:hAnsi="Calibri"/>
+                <w:b/>
+                <w:i w:val="0"/>
+                <w:color w:val="2E86AB"/>
+                <w:sz w:val="17"/>
+              </w:rPr>
+              <w:t xml:space="preserve">• </w:t>
+            </w:r>
+            <w:r>
+              <w:rPr>
+                <w:rFonts w:ascii="Calibri" w:hAnsi="Calibri"/>
+                <w:b w:val="0"/>
+                <w:i w:val="0"/>
+                <w:color w:val="2B2D3A"/>
+                <w:sz w:val="17"/>
+              </w:rPr>
+              <w:t>Managed SEO/PPC/paid social across client accounts — raised quality scores, cut CPCs</w:t>
+            </w:r>
+          </w:p>
+          <w:p>
+            <w:pPr>
+              <w:spacing w:after="0"/>
+              <w:ind w:left="288"/>
+            </w:pPr>
+            <w:r>
+              <w:rPr>
+                <w:rFonts w:ascii="Calibri" w:hAnsi="Calibri"/>
+                <w:b/>
+                <w:i w:val="0"/>
+                <w:color w:val="2E86AB"/>
+                <w:sz w:val="17"/>
+              </w:rPr>
+              <w:t xml:space="preserve">• </w:t>
+            </w:r>
+            <w:r>
+              <w:rPr>
+                <w:rFonts w:ascii="Calibri" w:hAnsi="Calibri"/>
+                <w:b w:val="0"/>
+                <w:i w:val="0"/>
+                <w:color w:val="2B2D3A"/>
+                <w:sz w:val="17"/>
+              </w:rPr>
+              <w:t>LinkedIn Ads for B2B lead gen; bid/audience/schedule optimization lifted ROAS</w:t>
+            </w:r>
+          </w:p>
+          <w:p>
+            <w:pPr>
+              <w:spacing w:after="0"/>
+              <w:ind w:left="288"/>
+            </w:pPr>
+            <w:r>
+              <w:rPr>
+                <w:rFonts w:ascii="Calibri" w:hAnsi="Calibri"/>
+                <w:b/>
+                <w:i w:val="0"/>
+                <w:color w:val="2E86AB"/>
+                <w:sz w:val="17"/>
+              </w:rPr>
+              <w:t xml:space="preserve">• </w:t>
+            </w:r>
+            <w:r>
+              <w:rPr>
+                <w:rFonts w:ascii="Calibri" w:hAnsi="Calibri"/>
+                <w:b w:val="0"/>
+                <w:i w:val="0"/>
+                <w:color w:val="2B2D3A"/>
+                <w:sz w:val="17"/>
+              </w:rPr>
+              <w:t>Weekly KPI reporting (impressions, CTR, conversions, revenue attribution)</w:t>
+            </w:r>
+          </w:p>
+          <w:p>
+            <w:pPr>
+              <w:spacing w:before="60" w:after="0"/>
+            </w:pPr>
+            <w:r>
+              <w:rPr>
+                <w:rFonts w:ascii="Calibri" w:hAnsi="Calibri"/>
+                <w:b/>
+                <w:i w:val="0"/>
+                <w:color w:val="2FF3C0"/>
+                <w:sz w:val="18"/>
+              </w:rPr>
+              <w:t xml:space="preserve">▸ </w:t>
+            </w:r>
+            <w:r>
+              <w:rPr>
+                <w:rFonts w:ascii="Calibri" w:hAnsi="Calibri"/>
+                <w:b/>
+                <w:i w:val="0"/>
+                <w:color w:val="2B2D3A"/>
+                <w:sz w:val="19"/>
+              </w:rPr>
+              <w:t>Digital Marketing Executive</w:t>
+            </w:r>
+            <w:r>
+              <w:rPr>
+                <w:rFonts w:ascii="Calibri" w:hAnsi="Calibri"/>
+                <w:b w:val="0"/>
+                <w:i w:val="0"/>
+                <w:color w:val="5A5D6E"/>
+                <w:sz w:val="17"/>
+              </w:rPr>
+              <w:t xml:space="preserve">   |   FAMA Technologies   </w:t>
+            </w:r>
+            <w:r>
+              <w:rPr>
+                <w:rFonts w:ascii="Calibri" w:hAnsi="Calibri"/>
+                <w:b w:val="0"/>
+                <w:i/>
+                <w:color w:val="5A5D6E"/>
+                <w:sz w:val="16"/>
+              </w:rPr>
+              <w:t>Feb 2021 – May 2022</w:t>
+            </w:r>
+          </w:p>
+          <w:p>
+            <w:pPr>
+              <w:spacing w:after="0"/>
+              <w:ind w:left="288"/>
+            </w:pPr>
+            <w:r>
+              <w:rPr>
+                <w:rFonts w:ascii="Calibri" w:hAnsi="Calibri"/>
+                <w:b/>
+                <w:i w:val="0"/>
+                <w:color w:val="2E86AB"/>
+                <w:sz w:val="17"/>
+              </w:rPr>
+              <w:t xml:space="preserve">• </w:t>
+            </w:r>
+            <w:r>
+              <w:rPr>
+                <w:rFonts w:ascii="Calibri" w:hAnsi="Calibri"/>
+                <w:b w:val="0"/>
+                <w:i w:val="0"/>
+                <w:color w:val="2B2D3A"/>
+                <w:sz w:val="17"/>
+              </w:rPr>
+              <w:t>Integrated SEO + PPC + content campaigns; A/B &amp; multivariate CRO testing</w:t>
+            </w:r>
+          </w:p>
+          <w:p>
+            <w:pPr>
+              <w:spacing w:after="0"/>
+              <w:ind w:left="288"/>
+            </w:pPr>
+            <w:r>
+              <w:rPr>
+                <w:rFonts w:ascii="Calibri" w:hAnsi="Calibri"/>
+                <w:b/>
+                <w:i w:val="0"/>
+                <w:color w:val="2E86AB"/>
+                <w:sz w:val="17"/>
+              </w:rPr>
+              <w:t xml:space="preserve">• </w:t>
+            </w:r>
+            <w:r>
+              <w:rPr>
+                <w:rFonts w:ascii="Calibri" w:hAnsi="Calibri"/>
+                <w:b w:val="0"/>
+                <w:i w:val="0"/>
+                <w:color w:val="2B2D3A"/>
+                <w:sz w:val="17"/>
+              </w:rPr>
+              <w:t>Technical SEO audits (crawl errors, speed, schema) fixed with dev</w:t>
+            </w:r>
+          </w:p>
+          <w:p>
+            <w:pPr>
+              <w:spacing w:before="60" w:after="0"/>
+            </w:pPr>
+            <w:r>
+              <w:rPr>
+                <w:rFonts w:ascii="Calibri" w:hAnsi="Calibri"/>
+                <w:b/>
+                <w:i w:val="0"/>
+                <w:color w:val="2FF3C0"/>
+                <w:sz w:val="18"/>
+              </w:rPr>
+              <w:t xml:space="preserve">▸ </w:t>
+            </w:r>
+            <w:r>
+              <w:rPr>
+                <w:rFonts w:ascii="Calibri" w:hAnsi="Calibri"/>
+                <w:b/>
+                <w:i w:val="0"/>
+                <w:color w:val="2B2D3A"/>
+                <w:sz w:val="19"/>
+              </w:rPr>
+              <w:t>Digital Marketing Executive</w:t>
+            </w:r>
+            <w:r>
+              <w:rPr>
+                <w:rFonts w:ascii="Calibri" w:hAnsi="Calibri"/>
+                <w:b w:val="0"/>
+                <w:i w:val="0"/>
+                <w:color w:val="5A5D6E"/>
+                <w:sz w:val="17"/>
+              </w:rPr>
+              <w:t xml:space="preserve">   |   E-Rad Imaging &amp; Reporting   </w:t>
+            </w:r>
+            <w:r>
+              <w:rPr>
+                <w:rFonts w:ascii="Calibri" w:hAnsi="Calibri"/>
+                <w:b w:val="0"/>
+                <w:i/>
+                <w:color w:val="5A5D6E"/>
+                <w:sz w:val="16"/>
+              </w:rPr>
+              <w:t>Jun 2019 – Sep 2020</w:t>
+            </w:r>
+          </w:p>
+          <w:p>
+            <w:pPr>
+              <w:spacing w:after="0"/>
+              <w:ind w:left="288"/>
+            </w:pPr>
+            <w:r>
+              <w:rPr>
+                <w:rFonts w:ascii="Calibri" w:hAnsi="Calibri"/>
+                <w:b/>
+                <w:i w:val="0"/>
+                <w:color w:val="2E86AB"/>
+                <w:sz w:val="17"/>
+              </w:rPr>
+              <w:t xml:space="preserve">• </w:t>
+            </w:r>
+            <w:r>
+              <w:rPr>
+                <w:rFonts w:ascii="Calibri" w:hAnsi="Calibri"/>
+                <w:b w:val="0"/>
+                <w:i w:val="0"/>
+                <w:color w:val="2B2D3A"/>
+                <w:sz w:val="17"/>
+              </w:rPr>
+              <w:t>End-to-end SEO: research, on-page, link building, monthly reporting</w:t>
+            </w:r>
+          </w:p>
+          <w:p>
+            <w:pPr>
+              <w:spacing w:before="60" w:after="0"/>
+            </w:pPr>
+            <w:r>
+              <w:rPr>
+                <w:rFonts w:ascii="Calibri" w:hAnsi="Calibri"/>
+                <w:b/>
+                <w:i w:val="0"/>
+                <w:color w:val="2FF3C0"/>
+                <w:sz w:val="18"/>
+              </w:rPr>
+              <w:t xml:space="preserve">▸ </w:t>
+            </w:r>
+            <w:r>
+              <w:rPr>
+                <w:rFonts w:ascii="Calibri" w:hAnsi="Calibri"/>
+                <w:b/>
+                <w:i w:val="0"/>
+                <w:color w:val="2B2D3A"/>
+                <w:sz w:val="19"/>
+              </w:rPr>
+              <w:t>SEO &amp; SMO Expert</w:t>
+            </w:r>
+            <w:r>
+              <w:rPr>
+                <w:rFonts w:ascii="Calibri" w:hAnsi="Calibri"/>
+                <w:b w:val="0"/>
+                <w:i w:val="0"/>
+                <w:color w:val="5A5D6E"/>
+                <w:sz w:val="17"/>
+              </w:rPr>
+              <w:t xml:space="preserve">   |   Promantra Synergies   </w:t>
+            </w:r>
+            <w:r>
+              <w:rPr>
+                <w:rFonts w:ascii="Calibri" w:hAnsi="Calibri"/>
+                <w:b w:val="0"/>
+                <w:i/>
+                <w:color w:val="5A5D6E"/>
+                <w:sz w:val="16"/>
+              </w:rPr>
+              <w:t>Nov 2017 – May 2019</w:t>
+            </w:r>
+          </w:p>
+          <w:p>
+            <w:pPr>
+              <w:spacing w:after="0"/>
+              <w:ind w:left="288"/>
+            </w:pPr>
+            <w:r>
+              <w:rPr>
+                <w:rFonts w:ascii="Calibri" w:hAnsi="Calibri"/>
+                <w:b/>
+                <w:i w:val="0"/>
+                <w:color w:val="2E86AB"/>
+                <w:sz w:val="17"/>
+              </w:rPr>
+              <w:t xml:space="preserve">• </w:t>
+            </w:r>
+            <w:r>
+              <w:rPr>
+                <w:rFonts w:ascii="Calibri" w:hAnsi="Calibri"/>
+                <w:b w:val="0"/>
+                <w:i w:val="0"/>
+                <w:color w:val="2B2D3A"/>
+                <w:sz w:val="17"/>
+              </w:rPr>
+              <w:t>SEO + social growth, content strategy, competitor benchmarking &amp; outreach</w:t>
+            </w:r>
+          </w:p>
+          <w:p>
+            <w:pPr>
+              <w:spacing w:before="60" w:after="0"/>
+            </w:pPr>
+            <w:r>
+              <w:rPr>
+                <w:rFonts w:ascii="Calibri" w:hAnsi="Calibri"/>
+                <w:b/>
+                <w:i w:val="0"/>
+                <w:color w:val="2FF3C0"/>
+                <w:sz w:val="18"/>
+              </w:rPr>
+              <w:t xml:space="preserve">▸ </w:t>
+            </w:r>
+            <w:r>
+              <w:rPr>
+                <w:rFonts w:ascii="Calibri" w:hAnsi="Calibri"/>
+                <w:b/>
+                <w:i w:val="0"/>
+                <w:color w:val="2B2D3A"/>
+                <w:sz w:val="19"/>
+              </w:rPr>
+              <w:t>SEO Executive</w:t>
+            </w:r>
+            <w:r>
+              <w:rPr>
+                <w:rFonts w:ascii="Calibri" w:hAnsi="Calibri"/>
+                <w:b w:val="0"/>
+                <w:i w:val="0"/>
+                <w:color w:val="5A5D6E"/>
+                <w:sz w:val="17"/>
+              </w:rPr>
+              <w:t xml:space="preserve">   |   Digital Way Soft   </w:t>
+            </w:r>
+            <w:r>
+              <w:rPr>
+                <w:rFonts w:ascii="Calibri" w:hAnsi="Calibri"/>
+                <w:b w:val="0"/>
+                <w:i/>
+                <w:color w:val="5A5D6E"/>
+                <w:sz w:val="16"/>
+              </w:rPr>
+              <w:t>Jan 2015 – Nov 2017</w:t>
+            </w:r>
+          </w:p>
+          <w:p>
+            <w:pPr>
+              <w:spacing w:after="0"/>
+              <w:ind w:left="288"/>
+            </w:pPr>
+            <w:r>
+              <w:rPr>
+                <w:rFonts w:ascii="Calibri" w:hAnsi="Calibri"/>
+                <w:b/>
+                <w:i w:val="0"/>
+                <w:color w:val="2E86AB"/>
+                <w:sz w:val="17"/>
+              </w:rPr>
+              <w:t xml:space="preserve">• </w:t>
+            </w:r>
+            <w:r>
+              <w:rPr>
+                <w:rFonts w:ascii="Calibri" w:hAnsi="Calibri"/>
+                <w:b w:val="0"/>
+                <w:i w:val="0"/>
+                <w:color w:val="2B2D3A"/>
+                <w:sz w:val="17"/>
+              </w:rPr>
+              <w:t>Technical, on-page &amp; off-page SEO across multiple client sites</w:t>
+            </w:r>
+          </w:p>
+          <w:p>
+            <w:pPr>
+              <w:spacing w:before="60" w:after="0"/>
+            </w:pPr>
+            <w:r>
+              <w:rPr>
+                <w:rFonts w:ascii="Calibri" w:hAnsi="Calibri"/>
+                <w:b/>
+                <w:i w:val="0"/>
+                <w:color w:val="2FF3C0"/>
+                <w:sz w:val="18"/>
+              </w:rPr>
+              <w:t xml:space="preserve">▸ </w:t>
+            </w:r>
+            <w:r>
+              <w:rPr>
+                <w:rFonts w:ascii="Calibri" w:hAnsi="Calibri"/>
+                <w:b/>
+                <w:i w:val="0"/>
+                <w:color w:val="2B2D3A"/>
+                <w:sz w:val="19"/>
+              </w:rPr>
+              <w:t>Software / Junior Test Engineer</w:t>
+            </w:r>
+            <w:r>
+              <w:rPr>
+                <w:rFonts w:ascii="Calibri" w:hAnsi="Calibri"/>
+                <w:b w:val="0"/>
+                <w:i w:val="0"/>
+                <w:color w:val="5A5D6E"/>
+                <w:sz w:val="17"/>
+              </w:rPr>
+              <w:t xml:space="preserve">   |   Ainslee &amp; Corbz Data   </w:t>
+            </w:r>
+            <w:r>
+              <w:rPr>
+                <w:rFonts w:ascii="Calibri" w:hAnsi="Calibri"/>
+                <w:b w:val="0"/>
+                <w:i/>
+                <w:color w:val="5A5D6E"/>
+                <w:sz w:val="16"/>
+              </w:rPr>
+              <w:t>May 2007 – Sep 2014</w:t>
+            </w:r>
+          </w:p>
+          <w:p>
+            <w:pPr>
+              <w:spacing w:after="0"/>
+              <w:ind w:left="288"/>
+            </w:pPr>
+            <w:r>
+              <w:rPr>
+                <w:rFonts w:ascii="Calibri" w:hAnsi="Calibri"/>
+                <w:b/>
+                <w:i w:val="0"/>
+                <w:color w:val="2E86AB"/>
+                <w:sz w:val="17"/>
+              </w:rPr>
+              <w:t xml:space="preserve">• </w:t>
+            </w:r>
+            <w:r>
+              <w:rPr>
+                <w:rFonts w:ascii="Calibri" w:hAnsi="Calibri"/>
+                <w:b w:val="0"/>
+                <w:i w:val="0"/>
+                <w:color w:val="2B2D3A"/>
+                <w:sz w:val="17"/>
+              </w:rPr>
+              <w:t>QA foundation — the root-cause discipline behind my data-first marketing</w:t>
+            </w:r>
+          </w:p>
+          <w:p>
+            <w:pPr>
+              <w:spacing w:before="80" w:after="40"/>
+              <w:pBdr>
+                <w:bottom w:val="single" w:sz="8" w:space="2" w:color="2E86AB"/>
+              </w:pBdr>
+            </w:pPr>
+            <w:r>
+              <w:rPr>
+                <w:rFonts w:ascii="Calibri" w:hAnsi="Calibri"/>
+                <w:b/>
+                <w:i w:val="0"/>
+                <w:color w:val="2E86AB"/>
+                <w:sz w:val="22"/>
+              </w:rPr>
+              <w:t>LIVE PRODUCTS — SCAN &amp; TRY THEM</w:t>
+            </w:r>
+          </w:p>
+          <w:tbl>
+            <w:tblPr>
+              <w:tblW w:type="auto" w:w="0"/>
+              <w:tblLook w:firstColumn="1" w:firstRow="1" w:lastColumn="0" w:lastRow="0" w:noHBand="0" w:noVBand="1" w:val="04A0"/>
+              <w:tblBorders>
+                <w:top w:val="none"/>
+                <w:left w:val="none"/>
+                <w:bottom w:val="none"/>
+                <w:right w:val="none"/>
+                <w:insideH w:val="none"/>
+                <w:insideV w:val="none"/>
+              </w:tblBorders>
+            </w:tblPr>
+            <w:tblGrid>
+              <w:gridCol w:w="2664"/>
+              <w:gridCol w:w="2664"/>
+            </w:tblGrid>
+            <w:tr>
+              <w:tc>
+                <w:tcPr>
+                  <w:tcW w:type="dxa" w:w="1368"/>
+                  <w:tcMar>
+                    <w:top w:w="20" w:type="dxa"/>
+                    <w:bottom w:w="20" w:type="dxa"/>
+                    <w:left w:w="20" w:type="dxa"/>
+                    <w:right w:w="40" w:type="dxa"/>
+                  </w:tcMar>
+                </w:tcPr>
+                <w:p>
+                  <w:pPr>
+                    <w:spacing w:after="0"/>
+                  </w:pPr>
+                  <w:r>
+                    <w:drawing>
+                      <wp:inline xmlns:a="http://schemas.openxmlformats.org/drawingml/2006/main" xmlns:pic="http://schemas.openxmlformats.org/drawingml/2006/picture">
+                        <wp:extent cx="822960" cy="822960"/>
+                        <wp:docPr id="1" name="Picture 1"/>
+                        <wp:cNvGraphicFramePr>
+                          <a:graphicFrameLocks noChangeAspect="1"/>
+                        </wp:cNvGraphicFramePr>
+                        <a:graphic>
+                          <a:graphicData uri="http://schemas.openxmlformats.org/drawingml/2006/picture">
+                            <pic:pic>
+                              <pic:nvPicPr>
+                                <pic:cNvPr id="0" name="hookai.png"/>
+                                <pic:cNvPicPr/>
+                              </pic:nvPicPr>
+                              <pic:blipFill>
+                                <a:blip r:embed="rId9"/>
+                                <a:stretch>
+                                  <a:fillRect/>
+                                </a:stretch>
+                              </pic:blipFill>
+                              <pic:spPr>
+                                <a:xfrm>
+                                  <a:off x="0" y="0"/>
+                                  <a:ext cx="822960" cy="822960"/>
+                                </a:xfrm>
+                                <a:prstGeom prst="rect"/>
+                              </pic:spPr>
+                            </pic:pic>
+                          </a:graphicData>
+                        </a:graphic>
+                      </wp:inline>
+                    </w:drawing>
+                  </w:r>
+                </w:p>
+              </w:tc>
+              <w:tc>
+                <w:tcPr>
+                  <w:tcW w:type="dxa" w:w="6048"/>
+                  <w:tcMar>
+                    <w:top w:w="40" w:type="dxa"/>
+                    <w:bottom w:w="20" w:type="dxa"/>
+                    <w:left w:w="40" w:type="dxa"/>
+                    <w:right w:w="20" w:type="dxa"/>
+                  </w:tcMar>
+                </w:tcPr>
+                <w:p>
+                  <w:pPr>
+                    <w:spacing w:after="0"/>
+                  </w:pPr>
+                  <w:r>
+                    <w:rPr>
+                      <w:rFonts w:ascii="Calibri" w:hAnsi="Calibri"/>
+                      <w:b/>
+                      <w:i w:val="0"/>
+                      <w:color w:val="2B2D3A"/>
+                      <w:sz w:val="19"/>
+                    </w:rPr>
+                    <w:t>Hook AI</w:t>
+                  </w:r>
+                </w:p>
+                <w:p>
+                  <w:pPr>
+                    <w:spacing w:after="0"/>
+                  </w:pPr>
+                  <w:r>
+                    <w:rPr>
+                      <w:rFonts w:ascii="Calibri" w:hAnsi="Calibri"/>
+                      <w:b w:val="0"/>
+                      <w:i w:val="0"/>
+                      <w:color w:val="5A5D6E"/>
+                      <w:sz w:val="16"/>
+                    </w:rPr>
+                    <w:t>Marketing copy engine — 15+ niches, SEO program, A/B hero testing</w:t>
+                  </w:r>
+                </w:p>
+                <w:p>
+                  <w:pPr>
+                    <w:spacing w:after="80"/>
+                  </w:pPr>
+                  <w:r>
+                    <w:rPr>
+                      <w:rFonts w:ascii="Calibri" w:hAnsi="Calibri"/>
+                      <w:b/>
+                      <w:i w:val="0"/>
+                      <w:color w:val="2E86AB"/>
+                      <w:sz w:val="15"/>
+                    </w:rPr>
+                    <w:t>hook-ai-marketing-engine.vercel.app</w:t>
+                  </w:r>
+                </w:p>
+              </w:tc>
+            </w:tr>
+          </w:tbl>
+          <w:p/>
+          <w:tbl>
+            <w:tblPr>
+              <w:tblW w:type="auto" w:w="0"/>
+              <w:tblLook w:firstColumn="1" w:firstRow="1" w:lastColumn="0" w:lastRow="0" w:noHBand="0" w:noVBand="1" w:val="04A0"/>
+              <w:tblBorders>
+                <w:top w:val="none"/>
+                <w:left w:val="none"/>
+                <w:bottom w:val="none"/>
+                <w:right w:val="none"/>
+                <w:insideH w:val="none"/>
+                <w:insideV w:val="none"/>
+              </w:tblBorders>
+            </w:tblPr>
+            <w:tblGrid>
+              <w:gridCol w:w="2664"/>
+              <w:gridCol w:w="2664"/>
+            </w:tblGrid>
+            <w:tr>
+              <w:tc>
+                <w:tcPr>
+                  <w:tcW w:type="dxa" w:w="1368"/>
+                  <w:tcMar>
+                    <w:top w:w="20" w:type="dxa"/>
+                    <w:bottom w:w="20" w:type="dxa"/>
+                    <w:left w:w="20" w:type="dxa"/>
+                    <w:right w:w="40" w:type="dxa"/>
+                  </w:tcMar>
+                </w:tcPr>
+                <w:p>
+                  <w:pPr>
+                    <w:spacing w:after="0"/>
+                  </w:pPr>
+                  <w:r>
+                    <w:drawing>
+                      <wp:inline xmlns:a="http://schemas.openxmlformats.org/drawingml/2006/main" xmlns:pic="http://schemas.openxmlformats.org/drawingml/2006/picture">
+                        <wp:extent cx="822960" cy="822960"/>
+                        <wp:docPr id="2" name="Picture 2"/>
+                        <wp:cNvGraphicFramePr>
+                          <a:graphicFrameLocks noChangeAspect="1"/>
+                        </wp:cNvGraphicFramePr>
+                        <a:graphic>
+                          <a:graphicData uri="http://schemas.openxmlformats.org/drawingml/2006/picture">
+                            <pic:pic>
+                              <pic:nvPicPr>
+                                <pic:cNvPr id="0" name="creative.png"/>
+                                <pic:cNvPicPr/>
+                              </pic:nvPicPr>
+                              <pic:blipFill>
+                                <a:blip r:embed="rId10"/>
+                                <a:stretch>
+                                  <a:fillRect/>
+                                </a:stretch>
+                              </pic:blipFill>
+                              <pic:spPr>
+                                <a:xfrm>
+                                  <a:off x="0" y="0"/>
+                                  <a:ext cx="822960" cy="822960"/>
+                                </a:xfrm>
+                                <a:prstGeom prst="rect"/>
+                              </pic:spPr>
+                            </pic:pic>
+                          </a:graphicData>
+                        </a:graphic>
+                      </wp:inline>
+                    </w:drawing>
+                  </w:r>
+                </w:p>
+              </w:tc>
+              <w:tc>
+                <w:tcPr>
+                  <w:tcW w:type="dxa" w:w="6048"/>
+                  <w:tcMar>
+                    <w:top w:w="40" w:type="dxa"/>
+                    <w:bottom w:w="20" w:type="dxa"/>
+                    <w:left w:w="40" w:type="dxa"/>
+                    <w:right w:w="20" w:type="dxa"/>
+                  </w:tcMar>
+                </w:tcPr>
+                <w:p>
+                  <w:pPr>
+                    <w:spacing w:after="0"/>
+                  </w:pPr>
+                  <w:r>
+                    <w:rPr>
+                      <w:rFonts w:ascii="Calibri" w:hAnsi="Calibri"/>
+                      <w:b/>
+                      <w:i w:val="0"/>
+                      <w:color w:val="2B2D3A"/>
+                      <w:sz w:val="19"/>
+                    </w:rPr>
+                    <w:t>Creative Predictor</w:t>
+                  </w:r>
+                </w:p>
+                <w:p>
+                  <w:pPr>
+                    <w:spacing w:after="0"/>
+                  </w:pPr>
+                  <w:r>
+                    <w:rPr>
+                      <w:rFonts w:ascii="Calibri" w:hAnsi="Calibri"/>
+                      <w:b w:val="0"/>
+                      <w:i w:val="0"/>
+                      <w:color w:val="5A5D6E"/>
+                      <w:sz w:val="16"/>
+                    </w:rPr>
+                    <w:t>Ad &amp; CRO suite — predicts CTR/ROAS, 20+ modules, v13.0</w:t>
+                  </w:r>
+                </w:p>
+                <w:p>
+                  <w:pPr>
+                    <w:spacing w:after="80"/>
+                  </w:pPr>
+                  <w:r>
+                    <w:rPr>
+                      <w:rFonts w:ascii="Calibri" w:hAnsi="Calibri"/>
+                      <w:b/>
+                      <w:i w:val="0"/>
+                      <w:color w:val="2E86AB"/>
+                      <w:sz w:val="15"/>
+                    </w:rPr>
+                    <w:t>mvamshi56-creative-predictor.static.hf.space</w:t>
+                  </w:r>
+                </w:p>
+              </w:tc>
+            </w:tr>
+          </w:tbl>
+          <w:p/>
+          <w:tbl>
+            <w:tblPr>
+              <w:tblW w:type="auto" w:w="0"/>
+              <w:tblLook w:firstColumn="1" w:firstRow="1" w:lastColumn="0" w:lastRow="0" w:noHBand="0" w:noVBand="1" w:val="04A0"/>
+              <w:tblBorders>
+                <w:top w:val="none"/>
+                <w:left w:val="none"/>
+                <w:bottom w:val="none"/>
+                <w:right w:val="none"/>
+                <w:insideH w:val="none"/>
+                <w:insideV w:val="none"/>
+              </w:tblBorders>
+            </w:tblPr>
+            <w:tblGrid>
+              <w:gridCol w:w="2664"/>
+              <w:gridCol w:w="2664"/>
+            </w:tblGrid>
+            <w:tr>
+              <w:tc>
+                <w:tcPr>
+                  <w:tcW w:type="dxa" w:w="1368"/>
+                  <w:tcMar>
+                    <w:top w:w="20" w:type="dxa"/>
+                    <w:bottom w:w="20" w:type="dxa"/>
+                    <w:left w:w="20" w:type="dxa"/>
+                    <w:right w:w="40" w:type="dxa"/>
+                  </w:tcMar>
+                </w:tcPr>
+                <w:p>
+                  <w:pPr>
+                    <w:spacing w:after="0"/>
+                  </w:pPr>
+                  <w:r>
+                    <w:drawing>
+                      <wp:inline xmlns:a="http://schemas.openxmlformats.org/drawingml/2006/main" xmlns:pic="http://schemas.openxmlformats.org/drawingml/2006/picture">
+                        <wp:extent cx="822960" cy="822960"/>
+                        <wp:docPr id="3" name="Picture 3"/>
+                        <wp:cNvGraphicFramePr>
+                          <a:graphicFrameLocks noChangeAspect="1"/>
+                        </wp:cNvGraphicFramePr>
+                        <a:graphic>
+                          <a:graphicData uri="http://schemas.openxmlformats.org/drawingml/2006/picture">
+                            <pic:pic>
+                              <pic:nvPicPr>
+                                <pic:cNvPr id="0" name="strategy.png"/>
+                                <pic:cNvPicPr/>
+                              </pic:nvPicPr>
+                              <pic:blipFill>
+                                <a:blip r:embed="rId11"/>
+                                <a:stretch>
+                                  <a:fillRect/>
+                                </a:stretch>
+                              </pic:blipFill>
+                              <pic:spPr>
+                                <a:xfrm>
+                                  <a:off x="0" y="0"/>
+                                  <a:ext cx="822960" cy="822960"/>
+                                </a:xfrm>
+                                <a:prstGeom prst="rect"/>
+                              </pic:spPr>
+                            </pic:pic>
+                          </a:graphicData>
+                        </a:graphic>
+                      </wp:inline>
+                    </w:drawing>
+                  </w:r>
+                </w:p>
+              </w:tc>
+              <w:tc>
+                <w:tcPr>
+                  <w:tcW w:type="dxa" w:w="6048"/>
+                  <w:tcMar>
+                    <w:top w:w="40" w:type="dxa"/>
+                    <w:bottom w:w="20" w:type="dxa"/>
+                    <w:left w:w="40" w:type="dxa"/>
+                    <w:right w:w="20" w:type="dxa"/>
+                  </w:tcMar>
+                </w:tcPr>
+                <w:p>
+                  <w:pPr>
+                    <w:spacing w:after="0"/>
+                  </w:pPr>
+                  <w:r>
+                    <w:rPr>
+                      <w:rFonts w:ascii="Calibri" w:hAnsi="Calibri"/>
+                      <w:b/>
+                      <w:i w:val="0"/>
+                      <w:color w:val="2B2D3A"/>
+                      <w:sz w:val="19"/>
+                    </w:rPr>
+                    <w:t>Growth Strategy Gen</w:t>
+                  </w:r>
+                </w:p>
+                <w:p>
+                  <w:pPr>
+                    <w:spacing w:after="0"/>
+                  </w:pPr>
+                  <w:r>
+                    <w:rPr>
+                      <w:rFonts w:ascii="Calibri" w:hAnsi="Calibri"/>
+                      <w:b w:val="0"/>
+                      <w:i w:val="0"/>
+                      <w:color w:val="5A5D6E"/>
+                      <w:sz w:val="16"/>
+                    </w:rPr>
+                    <w:t>Budget-optimized funnel strategies from real inputs</w:t>
+                  </w:r>
+                </w:p>
+                <w:p>
+                  <w:pPr>
+                    <w:spacing w:after="80"/>
+                  </w:pPr>
+                  <w:r>
+                    <w:rPr>
+                      <w:rFonts w:ascii="Calibri" w:hAnsi="Calibri"/>
+                      <w:b/>
+                      <w:i w:val="0"/>
+                      <w:color w:val="2E86AB"/>
+                      <w:sz w:val="15"/>
+                    </w:rPr>
+                    <w:t>strategy-generator-kwdf-beta.vercel.app</w:t>
+                  </w:r>
+                </w:p>
+              </w:tc>
+            </w:tr>
+          </w:tbl>
+          <w:p/>
+          <w:p>
+            <w:pPr>
+              <w:spacing w:before="120" w:after="0"/>
+              <w:jc w:val="center"/>
+            </w:pPr>
+            <w:r>
+              <w:rPr>
+                <w:rFonts w:ascii="Calibri" w:hAnsi="Calibri"/>
+                <w:b w:val="0"/>
+                <w:i/>
+                <w:color w:val="5A5D6E"/>
+                <w:sz w:val="17"/>
+              </w:rPr>
+              <w:t>—  I build what I market. Scan a product and watch it work.  —</w:t>
             </w:r>
           </w:p>
         </w:tc>
@@ -145,1220 +1387,597 @@
     </w:tbl>
     <w:p>
       <w:pPr>
-        <w:spacing w:after="0"/>
+        <w:spacing w:after="200" w:before="0"/>
+        <w:jc w:val="center"/>
       </w:pPr>
-    </w:p>
-    <w:tbl>
-      <w:tblPr>
-        <w:tblW w:type="auto" w:w="0"/>
-        <w:tblLayout w:type="fixed"/>
-        <w:tblLook w:firstColumn="1" w:firstRow="1" w:lastColumn="0" w:lastRow="0" w:noHBand="0" w:noVBand="1" w:val="04A0"/>
-      </w:tblPr>
-      <w:tblGrid>
-        <w:gridCol w:w="2045"/>
-        <w:gridCol w:w="2045"/>
-        <w:gridCol w:w="2045"/>
-        <w:gridCol w:w="2045"/>
-        <w:gridCol w:w="2045"/>
-      </w:tblGrid>
-      <w:tr>
-        <w:tc>
-          <w:tcPr>
-            <w:tcW w:type="dxa" w:w="2045"/>
-            <w:shd w:val="clear" w:color="auto" w:fill="EEEEF7"/>
-          </w:tcPr>
-          <w:p>
-            <w:pPr>
-              <w:spacing w:before="80" w:after="80"/>
-              <w:jc w:val="center"/>
-            </w:pPr>
-            <w:r>
-              <w:rPr>
-                <w:b/>
-                <w:color w:val="2F2F5A"/>
-                <w:sz w:val="17"/>
-              </w:rPr>
-              <w:t>8+ Yrs Experience</w:t>
-            </w:r>
-          </w:p>
-        </w:tc>
-        <w:tc>
-          <w:tcPr>
-            <w:tcW w:type="dxa" w:w="2045"/>
-            <w:shd w:val="clear" w:color="auto" w:fill="EEEEF7"/>
-          </w:tcPr>
-          <w:p>
-            <w:pPr>
-              <w:spacing w:before="80" w:after="80"/>
-              <w:jc w:val="center"/>
-            </w:pPr>
-            <w:r>
-              <w:rPr>
-                <w:b/>
-                <w:color w:val="2F2F5A"/>
-                <w:sz w:val="17"/>
-              </w:rPr>
-              <w:t>15% Organic Traffic Growth</w:t>
-            </w:r>
-          </w:p>
-        </w:tc>
-        <w:tc>
-          <w:tcPr>
-            <w:tcW w:type="dxa" w:w="2045"/>
-            <w:shd w:val="clear" w:color="auto" w:fill="EEEEF7"/>
-          </w:tcPr>
-          <w:p>
-            <w:pPr>
-              <w:spacing w:before="80" w:after="80"/>
-              <w:jc w:val="center"/>
-            </w:pPr>
-            <w:r>
-              <w:rPr>
-                <w:b/>
-                <w:color w:val="2F2F5A"/>
-                <w:sz w:val="17"/>
-              </w:rPr>
-              <w:t>Page-1 Rankings</w:t>
-            </w:r>
-          </w:p>
-        </w:tc>
-        <w:tc>
-          <w:tcPr>
-            <w:tcW w:type="dxa" w:w="2045"/>
-            <w:shd w:val="clear" w:color="auto" w:fill="EEEEF7"/>
-          </w:tcPr>
-          <w:p>
-            <w:pPr>
-              <w:spacing w:before="80" w:after="80"/>
-              <w:jc w:val="center"/>
-            </w:pPr>
-            <w:r>
-              <w:rPr>
-                <w:b/>
-                <w:color w:val="2F2F5A"/>
-                <w:sz w:val="17"/>
-              </w:rPr>
-              <w:t>70+ Leads / Month</w:t>
-            </w:r>
-          </w:p>
-        </w:tc>
-        <w:tc>
-          <w:tcPr>
-            <w:tcW w:type="dxa" w:w="2045"/>
-            <w:shd w:val="clear" w:color="auto" w:fill="EEEEF7"/>
-          </w:tcPr>
-          <w:p>
-            <w:pPr>
-              <w:spacing w:before="80" w:after="80"/>
-              <w:jc w:val="center"/>
-            </w:pPr>
-            <w:r>
-              <w:rPr>
-                <w:b/>
-                <w:color w:val="2F2F5A"/>
-                <w:sz w:val="17"/>
-              </w:rPr>
-              <w:t>Rs.2L+ Ad Spend Managed</w:t>
-            </w:r>
-          </w:p>
-        </w:tc>
-      </w:tr>
-    </w:tbl>
-    <w:p>
-      <w:pPr>
-        <w:spacing w:after="0"/>
-      </w:pPr>
+      <w:r>
+        <w:rPr>
+          <w:i/>
+          <w:color w:val="C9CBDE"/>
+          <w:sz w:val="18"/>
+        </w:rPr>
+        <w:t>8+ years turning</w:t>
+        <w:br/>
+        <w:t>clicks into revenue.</w:t>
+      </w:r>
     </w:p>
     <w:p>
       <w:pPr>
-        <w:spacing w:before="200" w:after="60"/>
+        <w:spacing w:after="40" w:before="120"/>
         <w:pBdr>
-          <w:bottom w:val="single" w:sz="6" w:space="1" w:color="D9D9EC"/>
+          <w:bottom w:val="single" w:sz="4" w:space="2" w:color="2F3C50"/>
         </w:pBdr>
       </w:pPr>
       <w:r>
         <w:rPr>
           <w:rFonts w:ascii="Calibri" w:hAnsi="Calibri"/>
           <w:b/>
-          <w:color w:val="4A4A8A"/>
-          <w:sz w:val="24"/>
+          <w:i w:val="0"/>
+          <w:color w:val="2FF3C0"/>
+          <w:sz w:val="19"/>
         </w:rPr>
-        <w:t>PROFILE</w:t>
+        <w:t>CONTACT</w:t>
       </w:r>
     </w:p>
     <w:p>
       <w:pPr>
-        <w:spacing w:after="60"/>
+        <w:spacing w:after="20" w:before="0"/>
       </w:pPr>
       <w:r>
         <w:rPr>
-          <w:sz w:val="21"/>
+          <w:color w:val="2FF3C0"/>
+          <w:sz w:val="16"/>
         </w:rPr>
-        <w:t>AI-Powered Digital Marketing Specialist who turns 8+ years of SEO, PPC, and content expertise into measurable revenue: 15% organic traffic growth, first-page Google rankings, and 70+ qualified leads per month while managing Rs.2,00,000+ in monthly ad spend. Self-taught in Generative AI, with live products shipped SOLO on GitHub — a rare hybrid of marketing instinct and hands-on engineering with OpenAI API, Gemini AI, and AI agent design.</w:t>
+        <w:t xml:space="preserve">📍  </w:t>
+      </w:r>
+      <w:r>
+        <w:rPr>
+          <w:color w:val="E4E5F0"/>
+          <w:sz w:val="15"/>
+        </w:rPr>
+        <w:t>Hyderabad, India</w:t>
       </w:r>
     </w:p>
     <w:p>
       <w:pPr>
-        <w:spacing w:after="40"/>
+        <w:spacing w:after="20" w:before="0"/>
       </w:pPr>
       <w:r>
         <w:rPr>
-          <w:b/>
-          <w:color w:val="4A4A8A"/>
-          <w:sz w:val="19"/>
+          <w:color w:val="2FF3C0"/>
+          <w:sz w:val="16"/>
         </w:rPr>
-        <w:t>Profitable Growth    |    High-Converting Copy &amp; SEO    |    Data-Driven A/B Optimization    |    AI-Augmented Workflows</w:t>
+        <w:t xml:space="preserve">📞  </w:t>
+      </w:r>
+      <w:r>
+        <w:rPr>
+          <w:color w:val="E4E5F0"/>
+          <w:sz w:val="15"/>
+        </w:rPr>
+        <w:t>+91-7981719085</w:t>
       </w:r>
     </w:p>
     <w:p>
       <w:pPr>
-        <w:spacing w:before="200" w:after="60"/>
+        <w:spacing w:after="20" w:before="0"/>
+      </w:pPr>
+      <w:r>
+        <w:rPr>
+          <w:color w:val="2FF3C0"/>
+          <w:sz w:val="16"/>
+        </w:rPr>
+        <w:t xml:space="preserve">✉️  </w:t>
+      </w:r>
+      <w:r>
+        <w:rPr>
+          <w:color w:val="E4E5F0"/>
+          <w:sz w:val="15"/>
+        </w:rPr>
+        <w:t>geovamshidhar@gmail.com</w:t>
+      </w:r>
+    </w:p>
+    <w:p>
+      <w:pPr>
+        <w:spacing w:after="20" w:before="0"/>
+      </w:pPr>
+      <w:r>
+        <w:rPr>
+          <w:color w:val="2FF3C0"/>
+          <w:sz w:val="16"/>
+        </w:rPr>
+        <w:t xml:space="preserve">in  </w:t>
+      </w:r>
+      <w:r>
+        <w:rPr>
+          <w:color w:val="E4E5F0"/>
+          <w:sz w:val="15"/>
+        </w:rPr>
+        <w:t>linkedin.com/in/vamshidharreddym</w:t>
+      </w:r>
+    </w:p>
+    <w:p>
+      <w:pPr>
+        <w:spacing w:after="20" w:before="0"/>
+      </w:pPr>
+      <w:r>
+        <w:rPr>
+          <w:color w:val="2FF3C0"/>
+          <w:sz w:val="16"/>
+        </w:rPr>
+        <w:t xml:space="preserve">gh  </w:t>
+      </w:r>
+      <w:r>
+        <w:rPr>
+          <w:color w:val="E4E5F0"/>
+          <w:sz w:val="15"/>
+        </w:rPr>
+        <w:t>github.com/gitvamshidhar-m</w:t>
+      </w:r>
+    </w:p>
+    <w:p>
+      <w:pPr>
+        <w:spacing w:after="20" w:before="0"/>
+      </w:pPr>
+      <w:r>
+        <w:rPr>
+          <w:color w:val="2FF3C0"/>
+          <w:sz w:val="16"/>
+        </w:rPr>
+        <w:t xml:space="preserve">↗  </w:t>
+      </w:r>
+      <w:r>
+        <w:rPr>
+          <w:color w:val="E4E5F0"/>
+          <w:sz w:val="15"/>
+        </w:rPr>
+        <w:t>vamshidharm.vercel.app</w:t>
+      </w:r>
+    </w:p>
+    <w:p>
+      <w:pPr>
+        <w:spacing w:after="40" w:before="120"/>
         <w:pBdr>
-          <w:bottom w:val="single" w:sz="6" w:space="1" w:color="D9D9EC"/>
+          <w:bottom w:val="single" w:sz="4" w:space="2" w:color="2F3C50"/>
         </w:pBdr>
       </w:pPr>
       <w:r>
         <w:rPr>
           <w:rFonts w:ascii="Calibri" w:hAnsi="Calibri"/>
           <w:b/>
-          <w:color w:val="4A4A8A"/>
-          <w:sz w:val="24"/>
+          <w:i w:val="0"/>
+          <w:color w:val="2FF3C0"/>
+          <w:sz w:val="19"/>
         </w:rPr>
-        <w:t>PROFESSIONAL EXPERIENCE</w:t>
+        <w:t>OPEN TO</w:t>
       </w:r>
     </w:p>
     <w:p>
       <w:pPr>
-        <w:spacing w:before="100" w:after="20"/>
+        <w:spacing w:after="40" w:before="0"/>
       </w:pPr>
       <w:r>
         <w:rPr>
-          <w:b/>
-          <w:color w:val="1A1A2E"/>
-          <w:sz w:val="21"/>
+          <w:rFonts w:ascii="Calibri" w:hAnsi="Calibri"/>
+          <w:b w:val="0"/>
+          <w:i w:val="0"/>
+          <w:color w:val="D9DAEA"/>
+          <w:sz w:val="16"/>
         </w:rPr>
-        <w:t>DIGITAL MARKETING SPECIALIST  |  Autozilla Software Solutions Pvt Ltd</w:t>
-      </w:r>
-      <w:r>
-        <w:rPr>
-          <w:color w:val="5A5A5A"/>
-          <w:sz w:val="18"/>
-        </w:rPr>
-        <w:t xml:space="preserve">      May 2023 – Present  ·  Hyderabad, India</w:t>
+        <w:t>Performance Marketing</w:t>
       </w:r>
     </w:p>
     <w:p>
       <w:pPr>
-        <w:pStyle w:val="ListBullet"/>
-        <w:spacing w:after="40"/>
-        <w:ind w:left="317"/>
+        <w:spacing w:after="40" w:before="0"/>
       </w:pPr>
       <w:r>
-        <w:t>Grew organic website traffic by 15% through SEO audits, keyword gap analysis, content optimization, and technical issue resolution.</w:t>
+        <w:rPr>
+          <w:rFonts w:ascii="Calibri" w:hAnsi="Calibri"/>
+          <w:b w:val="0"/>
+          <w:i w:val="0"/>
+          <w:color w:val="D9DAEA"/>
+          <w:sz w:val="16"/>
+        </w:rPr>
+        <w:t>SEO · Paid Media · CRO</w:t>
       </w:r>
     </w:p>
     <w:p>
       <w:pPr>
-        <w:pStyle w:val="ListBullet"/>
-        <w:spacing w:after="40"/>
-        <w:ind w:left="317"/>
+        <w:spacing w:after="40" w:before="0"/>
       </w:pPr>
       <w:r>
-        <w:t>Secured page-1 Google rankings for high-value competitive keywords, lifting qualified inbound traffic.</w:t>
+        <w:rPr>
+          <w:rFonts w:ascii="Calibri" w:hAnsi="Calibri"/>
+          <w:b w:val="0"/>
+          <w:i w:val="0"/>
+          <w:color w:val="D9DAEA"/>
+          <w:sz w:val="16"/>
+        </w:rPr>
+        <w:t>AI-Augmented Marketing</w:t>
       </w:r>
     </w:p>
     <w:p>
       <w:pPr>
-        <w:pStyle w:val="ListBullet"/>
-        <w:spacing w:after="40"/>
-        <w:ind w:left="317"/>
+        <w:spacing w:after="40" w:before="0"/>
       </w:pPr>
       <w:r>
-        <w:t>Generated 70+ qualified leads per month by aligning SEO, Google Ads, and landing pages into one conversion funnel.</w:t>
+        <w:rPr>
+          <w:rFonts w:ascii="Calibri" w:hAnsi="Calibri"/>
+          <w:b w:val="0"/>
+          <w:i w:val="0"/>
+          <w:color w:val="D9DAEA"/>
+          <w:sz w:val="16"/>
+        </w:rPr>
+        <w:t>Remote · Hyderabad (IST)</w:t>
       </w:r>
     </w:p>
     <w:p>
       <w:pPr>
-        <w:pStyle w:val="ListBullet"/>
-        <w:spacing w:after="40"/>
-        <w:ind w:left="317"/>
-      </w:pPr>
-      <w:r>
-        <w:t>Managed Google Ads budgets exceeding Rs.2,00,000 per month, optimizing cost-per-lead and return on ad spend.</w:t>
-      </w:r>
-    </w:p>
-    <w:p>
-      <w:pPr>
-        <w:pStyle w:val="ListBullet"/>
-        <w:spacing w:after="40"/>
-        <w:ind w:left="317"/>
-      </w:pPr>
-      <w:r>
-        <w:t>Built AI-assisted content workflows with Generative AI to accelerate production and improve search relevance.</w:t>
-      </w:r>
-    </w:p>
-    <w:p>
-      <w:pPr>
-        <w:pStyle w:val="ListBullet"/>
-        <w:spacing w:after="40"/>
-        <w:ind w:left="317"/>
-      </w:pPr>
-      <w:r>
-        <w:t>Delivered performance dashboards and actionable insights in GA4 and Looker Studio.</w:t>
-      </w:r>
-    </w:p>
-    <w:p>
-      <w:pPr>
-        <w:pStyle w:val="ListBullet"/>
-        <w:spacing w:after="40"/>
-        <w:ind w:left="317"/>
-      </w:pPr>
-      <w:r>
-        <w:t>Ran A/B tests on landing pages, ad copy, and CTAs, applying findings to lift conversion rates.</w:t>
-      </w:r>
-    </w:p>
-    <w:p>
-      <w:pPr>
-        <w:pStyle w:val="ListBullet"/>
-        <w:spacing w:after="40"/>
-        <w:ind w:left="317"/>
-      </w:pPr>
-      <w:r>
-        <w:t>Performed competitor analysis and search-intent mapping to find ranking opportunities and content gaps.</w:t>
-      </w:r>
-    </w:p>
-    <w:p>
-      <w:pPr>
-        <w:spacing w:before="100" w:after="20"/>
-      </w:pPr>
-      <w:r>
-        <w:rPr>
-          <w:b/>
-          <w:color w:val="1A1A2E"/>
-          <w:sz w:val="21"/>
-        </w:rPr>
-        <w:t>CAMPAIGN SPECIALIST  |  Pranathi Software Services Pvt Ltd</w:t>
-      </w:r>
-      <w:r>
-        <w:rPr>
-          <w:color w:val="5A5A5A"/>
-          <w:sz w:val="18"/>
-        </w:rPr>
-        <w:t xml:space="preserve">      Jun 2022 – May 2023  ·  Hyderabad, India</w:t>
-      </w:r>
-    </w:p>
-    <w:p>
-      <w:pPr>
-        <w:pStyle w:val="ListBullet"/>
-        <w:spacing w:after="40"/>
-        <w:ind w:left="317"/>
-      </w:pPr>
-      <w:r>
-        <w:t>Managed SEO, PPC, and paid social across multiple client accounts, raising quality scores and cutting CPCs.</w:t>
-      </w:r>
-    </w:p>
-    <w:p>
-      <w:pPr>
-        <w:pStyle w:val="ListBullet"/>
-        <w:spacing w:after="40"/>
-        <w:ind w:left="317"/>
-      </w:pPr>
-      <w:r>
-        <w:t>Planned LinkedIn Ads for B2B lead generation, targeting by industry, job title, and seniority.</w:t>
-      </w:r>
-    </w:p>
-    <w:p>
-      <w:pPr>
-        <w:pStyle w:val="ListBullet"/>
-        <w:spacing w:after="40"/>
-        <w:ind w:left="317"/>
-      </w:pPr>
-      <w:r>
-        <w:t>Optimized bids, audiences, and schedules to improve ROAS and cut wasted spend.</w:t>
-      </w:r>
-    </w:p>
-    <w:p>
-      <w:pPr>
-        <w:pStyle w:val="ListBullet"/>
-        <w:spacing w:after="40"/>
-        <w:ind w:left="317"/>
-      </w:pPr>
-      <w:r>
-        <w:t>Built weekly KPI reports on impressions, CTR, conversions, and revenue attribution.</w:t>
-      </w:r>
-    </w:p>
-    <w:p>
-      <w:pPr>
-        <w:pStyle w:val="ListBullet"/>
-        <w:spacing w:after="40"/>
-        <w:ind w:left="317"/>
-      </w:pPr>
-      <w:r>
-        <w:t>Identified underperforming campaigns in GA and applied fixes that improved click-throughs and conversions.</w:t>
-      </w:r>
-    </w:p>
-    <w:p>
-      <w:pPr>
-        <w:spacing w:before="100" w:after="20"/>
-      </w:pPr>
-      <w:r>
-        <w:rPr>
-          <w:b/>
-          <w:color w:val="1A1A2E"/>
-          <w:sz w:val="21"/>
-        </w:rPr>
-        <w:t>DIGITAL MARKETING EXECUTIVE  |  FAMA Technologies</w:t>
-      </w:r>
-      <w:r>
-        <w:rPr>
-          <w:color w:val="5A5A5A"/>
-          <w:sz w:val="18"/>
-        </w:rPr>
-        <w:t xml:space="preserve">      Feb 2021 – May 2022  ·  Hyderabad, India</w:t>
-      </w:r>
-    </w:p>
-    <w:p>
-      <w:pPr>
-        <w:pStyle w:val="ListBullet"/>
-        <w:spacing w:after="40"/>
-        <w:ind w:left="317"/>
-      </w:pPr>
-      <w:r>
-        <w:t>Planned integrated SEO, PPC, and content campaigns that raised organic sessions and inbound enquiries.</w:t>
-      </w:r>
-    </w:p>
-    <w:p>
-      <w:pPr>
-        <w:pStyle w:val="ListBullet"/>
-        <w:spacing w:after="40"/>
-        <w:ind w:left="317"/>
-      </w:pPr>
-      <w:r>
-        <w:t>Ran A/B and multivariate tests on landing pages and creatives, driving CRO improvements.</w:t>
-      </w:r>
-    </w:p>
-    <w:p>
-      <w:pPr>
-        <w:pStyle w:val="ListBullet"/>
-        <w:spacing w:after="40"/>
-        <w:ind w:left="317"/>
-      </w:pPr>
-      <w:r>
-        <w:t>Conducted technical SEO audits (crawl errors, page speed, schema gaps) and coordinated fixes with dev.</w:t>
-      </w:r>
-    </w:p>
-    <w:p>
-      <w:pPr>
-        <w:pStyle w:val="ListBullet"/>
-        <w:spacing w:after="40"/>
-        <w:ind w:left="317"/>
-      </w:pPr>
-      <w:r>
-        <w:t>Built search-intent-aligned content to grow topical authority and rankings.</w:t>
-      </w:r>
-    </w:p>
-    <w:p>
-      <w:pPr>
-        <w:spacing w:before="100" w:after="20"/>
-      </w:pPr>
-      <w:r>
-        <w:rPr>
-          <w:b/>
-          <w:color w:val="1A1A2E"/>
-          <w:sz w:val="21"/>
-        </w:rPr>
-        <w:t>DIGITAL MARKETING EXECUTIVE  |  E-Rad Imaging &amp; Reporting Services Pvt Ltd</w:t>
-      </w:r>
-      <w:r>
-        <w:rPr>
-          <w:color w:val="5A5A5A"/>
-          <w:sz w:val="18"/>
-        </w:rPr>
-        <w:t xml:space="preserve">      Jun 2019 – Sep 2020  ·  Hyderabad, India</w:t>
-      </w:r>
-    </w:p>
-    <w:p>
-      <w:pPr>
-        <w:pStyle w:val="ListBullet"/>
-        <w:spacing w:after="40"/>
-        <w:ind w:left="317"/>
-      </w:pPr>
-      <w:r>
-        <w:t>Managed end-to-end SEO — keyword research, on-page optimization, link building, and monthly reporting.</w:t>
-      </w:r>
-    </w:p>
-    <w:p>
-      <w:pPr>
-        <w:pStyle w:val="ListBullet"/>
-        <w:spacing w:after="40"/>
-        <w:ind w:left="317"/>
-      </w:pPr>
-      <w:r>
-        <w:t>Delivered monthly audit reports with prioritized actions that lifted domain visibility and rankings.</w:t>
-      </w:r>
-    </w:p>
-    <w:p>
-      <w:pPr>
-        <w:pStyle w:val="ListBullet"/>
-        <w:spacing w:after="40"/>
-        <w:ind w:left="317"/>
-      </w:pPr>
-      <w:r>
-        <w:t>Executed off-page SEO (guest posts, directories) to build domain authority.</w:t>
-      </w:r>
-    </w:p>
-    <w:p>
-      <w:pPr>
-        <w:spacing w:before="100" w:after="20"/>
-      </w:pPr>
-      <w:r>
-        <w:rPr>
-          <w:b/>
-          <w:color w:val="1A1A2E"/>
-          <w:sz w:val="21"/>
-        </w:rPr>
-        <w:t>SEO &amp; SMO EXPERT  |  Promantra Synergies Pvt Ltd</w:t>
-      </w:r>
-      <w:r>
-        <w:rPr>
-          <w:color w:val="5A5A5A"/>
-          <w:sz w:val="18"/>
-        </w:rPr>
-        <w:t xml:space="preserve">      Nov 2017 – May 2019  ·  Hyderabad, India</w:t>
-      </w:r>
-    </w:p>
-    <w:p>
-      <w:pPr>
-        <w:pStyle w:val="ListBullet"/>
-        <w:spacing w:after="40"/>
-        <w:ind w:left="317"/>
-      </w:pPr>
-      <w:r>
-        <w:t>Led SEO and social campaigns that grew brand visibility and reach across search and social.</w:t>
-      </w:r>
-    </w:p>
-    <w:p>
-      <w:pPr>
-        <w:pStyle w:val="ListBullet"/>
-        <w:spacing w:after="40"/>
-        <w:ind w:left="317"/>
-      </w:pPr>
-      <w:r>
-        <w:t>Built content and engagement strategies aligned with keyword and audience targeting.</w:t>
-      </w:r>
-    </w:p>
-    <w:p>
-      <w:pPr>
-        <w:pStyle w:val="ListBullet"/>
-        <w:spacing w:after="40"/>
-        <w:ind w:left="317"/>
-      </w:pPr>
-      <w:r>
-        <w:t>Ran competitor benchmarking and link-building outreach to strengthen domain authority.</w:t>
-      </w:r>
-    </w:p>
-    <w:p>
-      <w:pPr>
-        <w:spacing w:before="100" w:after="20"/>
-      </w:pPr>
-      <w:r>
-        <w:rPr>
-          <w:b/>
-          <w:color w:val="1A1A2E"/>
-          <w:sz w:val="21"/>
-        </w:rPr>
-        <w:t>SEO EXECUTIVE  |  Digital Way Soft</w:t>
-      </w:r>
-      <w:r>
-        <w:rPr>
-          <w:color w:val="5A5A5A"/>
-          <w:sz w:val="18"/>
-        </w:rPr>
-        <w:t xml:space="preserve">      Jan 2015 – Nov 2017  ·  Hyderabad, India</w:t>
-      </w:r>
-    </w:p>
-    <w:p>
-      <w:pPr>
-        <w:pStyle w:val="ListBullet"/>
-        <w:spacing w:after="40"/>
-        <w:ind w:left="317"/>
-      </w:pPr>
-      <w:r>
-        <w:t>Managed technical SEO, on-page, off-page, and keyword research across multiple client sites.</w:t>
-      </w:r>
-    </w:p>
-    <w:p>
-      <w:pPr>
-        <w:pStyle w:val="ListBullet"/>
-        <w:spacing w:after="40"/>
-        <w:ind w:left="317"/>
-      </w:pPr>
-      <w:r>
-        <w:t>Improved organic rankings through content optimization, internal linking, and meta fixes.</w:t>
-      </w:r>
-    </w:p>
-    <w:p>
-      <w:pPr>
-        <w:spacing w:before="100" w:after="20"/>
-      </w:pPr>
-      <w:r>
-        <w:rPr>
-          <w:b/>
-          <w:color w:val="1A1A2E"/>
-          <w:sz w:val="21"/>
-        </w:rPr>
-        <w:t>SOFTWARE / JUNIOR TEST ENGINEER  |  Ainslee Software Technologies &amp; Corbz Data Info Solutions</w:t>
-      </w:r>
-      <w:r>
-        <w:rPr>
-          <w:color w:val="5A5A5A"/>
-          <w:sz w:val="18"/>
-        </w:rPr>
-        <w:t xml:space="preserve">      May 2007 – Sep 2014  ·  Hyderabad, India</w:t>
-      </w:r>
-    </w:p>
-    <w:p>
-      <w:pPr>
-        <w:pStyle w:val="ListBullet"/>
-        <w:spacing w:after="40"/>
-        <w:ind w:left="317"/>
-      </w:pPr>
-      <w:r>
-        <w:t>Designed test plans, cases, and defect reports for web and enterprise projects (functional, regression, UAT).</w:t>
-      </w:r>
-    </w:p>
-    <w:p>
-      <w:pPr>
-        <w:pStyle w:val="ListBullet"/>
-        <w:spacing w:after="40"/>
-        <w:ind w:left="317"/>
-      </w:pPr>
-      <w:r>
-        <w:t>Built the analytical, root-cause base that now drives data-led marketing decisions.</w:t>
-      </w:r>
-    </w:p>
-    <w:p>
-      <w:pPr>
-        <w:spacing w:before="200" w:after="60"/>
+        <w:spacing w:after="40" w:before="120"/>
         <w:pBdr>
-          <w:bottom w:val="single" w:sz="6" w:space="1" w:color="D9D9EC"/>
+          <w:bottom w:val="single" w:sz="4" w:space="2" w:color="2F3C50"/>
         </w:pBdr>
       </w:pPr>
       <w:r>
         <w:rPr>
           <w:rFonts w:ascii="Calibri" w:hAnsi="Calibri"/>
           <w:b/>
-          <w:color w:val="4A4A8A"/>
-          <w:sz w:val="24"/>
+          <w:i w:val="0"/>
+          <w:color w:val="2FF3C0"/>
+          <w:sz w:val="19"/>
         </w:rPr>
-        <w:t>FEATURED PROJECTS</w:t>
+        <w:t>SKILLS</w:t>
       </w:r>
     </w:p>
     <w:p>
       <w:pPr>
-        <w:spacing w:before="100" w:after="20"/>
+        <w:spacing w:after="20" w:before="0"/>
       </w:pPr>
       <w:r>
         <w:rPr>
+          <w:rFonts w:ascii="Calibri" w:hAnsi="Calibri"/>
           <w:b/>
-          <w:color w:val="1A1A2E"/>
-          <w:sz w:val="21"/>
+          <w:i w:val="0"/>
+          <w:color w:val="D9DAEA"/>
+          <w:sz w:val="15"/>
         </w:rPr>
-        <w:t>HOOK AI — AI Marketing Copy Engine</w:t>
+        <w:t>Paid Media / PPC</w:t>
       </w:r>
     </w:p>
     <w:p>
       <w:pPr>
-        <w:spacing w:after="20"/>
+        <w:spacing w:after="80" w:before="0"/>
       </w:pPr>
       <w:r>
         <w:rPr>
-          <w:color w:val="5A5A5A"/>
-          <w:sz w:val="18"/>
+          <w:rFonts w:ascii="Calibri" w:hAnsi="Calibri"/>
+          <w:b w:val="0"/>
+          <w:i w:val="0"/>
+          <w:color w:val="2FF3C0"/>
+          <w:sz w:val="13"/>
         </w:rPr>
-        <w:t>Next.js | Supabase | TypeScript | Stripe &amp; Razorpay | Vercel | Groq AI</w:t>
+        <w:t>▮▮▮▮▮▮▮</w:t>
       </w:r>
       <w:r>
         <w:rPr>
-          <w:color w:val="4A4A8A"/>
-          <w:sz w:val="17"/>
+          <w:rFonts w:ascii="Calibri" w:hAnsi="Calibri"/>
+          <w:b w:val="0"/>
+          <w:i w:val="0"/>
+          <w:color w:val="3A3D55"/>
+          <w:sz w:val="13"/>
         </w:rPr>
-        <w:t xml:space="preserve">   ·   github.com/gitvamshidhar-m/hook-ai-marketing-engine  |  Live: hook-ai-marketing-engine.vercel.app</w:t>
+        <w:t>▯</w:t>
+      </w:r>
+      <w:r>
+        <w:rPr>
+          <w:rFonts w:ascii="Calibri" w:hAnsi="Calibri"/>
+          <w:b/>
+          <w:i w:val="0"/>
+          <w:color w:val="C9CBDE"/>
+          <w:sz w:val="15"/>
+        </w:rPr>
+        <w:t xml:space="preserve">  95%</w:t>
       </w:r>
     </w:p>
     <w:p>
       <w:pPr>
-        <w:spacing w:after="40"/>
+        <w:spacing w:after="20" w:before="0"/>
       </w:pPr>
       <w:r>
         <w:rPr>
-          <w:sz w:val="20"/>
+          <w:rFonts w:ascii="Calibri" w:hAnsi="Calibri"/>
+          <w:b/>
+          <w:i w:val="0"/>
+          <w:color w:val="D9DAEA"/>
+          <w:sz w:val="15"/>
         </w:rPr>
-        <w:t>An AI SaaS that writes conversion-ready marketing hooks, headlines, and ad copy across 15+ niches (real estate, SaaS, fitness, insurance, local SEO, pet, wedding, accounting, photography, career and more) — the complete toolkit a founder needs to win traffic, growth, and revenue.</w:t>
+        <w:t>SEO &amp; Content</w:t>
       </w:r>
     </w:p>
     <w:p>
       <w:pPr>
-        <w:pStyle w:val="ListBullet"/>
-        <w:spacing w:after="40"/>
-        <w:ind w:left="317"/>
+        <w:spacing w:after="80" w:before="0"/>
       </w:pPr>
       <w:r>
-        <w:t>Owned positioning, strategy, and launch execution for the entire product.</w:t>
+        <w:rPr>
+          <w:rFonts w:ascii="Calibri" w:hAnsi="Calibri"/>
+          <w:b w:val="0"/>
+          <w:i w:val="0"/>
+          <w:color w:val="2FF3C0"/>
+          <w:sz w:val="13"/>
+        </w:rPr>
+        <w:t>▮▮▮▮▮▮▮</w:t>
+      </w:r>
+      <w:r>
+        <w:rPr>
+          <w:rFonts w:ascii="Calibri" w:hAnsi="Calibri"/>
+          <w:b w:val="0"/>
+          <w:i w:val="0"/>
+          <w:color w:val="3A3D55"/>
+          <w:sz w:val="13"/>
+        </w:rPr>
+        <w:t>▯</w:t>
+      </w:r>
+      <w:r>
+        <w:rPr>
+          <w:rFonts w:ascii="Calibri" w:hAnsi="Calibri"/>
+          <w:b/>
+          <w:i w:val="0"/>
+          <w:color w:val="C9CBDE"/>
+          <w:sz w:val="15"/>
+        </w:rPr>
+        <w:t xml:space="preserve">  93%</w:t>
       </w:r>
     </w:p>
     <w:p>
       <w:pPr>
-        <w:pStyle w:val="ListBullet"/>
-        <w:spacing w:after="40"/>
-        <w:ind w:left="317"/>
+        <w:spacing w:after="20" w:before="0"/>
       </w:pPr>
       <w:r>
-        <w:t>Executed a full SEO program — 30+ long-form blog posts, niche landing pages, auto sitemap, FAQ/HowTo schema — engineered to win rich results.</w:t>
+        <w:rPr>
+          <w:rFonts w:ascii="Calibri" w:hAnsi="Calibri"/>
+          <w:b/>
+          <w:i w:val="0"/>
+          <w:color w:val="D9DAEA"/>
+          <w:sz w:val="15"/>
+        </w:rPr>
+        <w:t>AI &amp; Automation</w:t>
       </w:r>
     </w:p>
     <w:p>
       <w:pPr>
-        <w:pStyle w:val="ListBullet"/>
-        <w:spacing w:after="40"/>
-        <w:ind w:left="317"/>
+        <w:spacing w:after="80" w:before="0"/>
       </w:pPr>
       <w:r>
-        <w:t>Built the acquisition funnel — scheduled email flows, exit-intent lead capture, referral program, A/B hero testing with statistical-significance reporting to lift CTR.</w:t>
+        <w:rPr>
+          <w:rFonts w:ascii="Calibri" w:hAnsi="Calibri"/>
+          <w:b w:val="0"/>
+          <w:i w:val="0"/>
+          <w:color w:val="2FF3C0"/>
+          <w:sz w:val="13"/>
+        </w:rPr>
+        <w:t>▮▮▮▮▮▮▮</w:t>
+      </w:r>
+      <w:r>
+        <w:rPr>
+          <w:rFonts w:ascii="Calibri" w:hAnsi="Calibri"/>
+          <w:b w:val="0"/>
+          <w:i w:val="0"/>
+          <w:color w:val="3A3D55"/>
+          <w:sz w:val="13"/>
+        </w:rPr>
+        <w:t>▯</w:t>
+      </w:r>
+      <w:r>
+        <w:rPr>
+          <w:rFonts w:ascii="Calibri" w:hAnsi="Calibri"/>
+          <w:b/>
+          <w:i w:val="0"/>
+          <w:color w:val="C9CBDE"/>
+          <w:sz w:val="15"/>
+        </w:rPr>
+        <w:t xml:space="preserve">  90%</w:t>
       </w:r>
     </w:p>
     <w:p>
       <w:pPr>
-        <w:pStyle w:val="ListBullet"/>
-        <w:spacing w:after="40"/>
-        <w:ind w:left="317"/>
+        <w:spacing w:after="20" w:before="0"/>
       </w:pPr>
       <w:r>
-        <w:t>Full-stack Next.js app with Supabase database, auth, and real-time features; paid billing wired with Stripe &amp; Razorpay; 15+ niche AI copy generators powered by Groq AI.</w:t>
+        <w:rPr>
+          <w:rFonts w:ascii="Calibri" w:hAnsi="Calibri"/>
+          <w:b/>
+          <w:i w:val="0"/>
+          <w:color w:val="D9DAEA"/>
+          <w:sz w:val="15"/>
+        </w:rPr>
+        <w:t>Analytics &amp; GA4</w:t>
       </w:r>
     </w:p>
     <w:p>
       <w:pPr>
-        <w:pStyle w:val="ListBullet"/>
-        <w:spacing w:after="40"/>
-        <w:ind w:left="317"/>
+        <w:spacing w:after="80" w:before="0"/>
       </w:pPr>
       <w:r>
-        <w:t>Shipped and scaled solo on Vercel — auth, billing, analytics, and growth dashboards all live.</w:t>
+        <w:rPr>
+          <w:rFonts w:ascii="Calibri" w:hAnsi="Calibri"/>
+          <w:b w:val="0"/>
+          <w:i w:val="0"/>
+          <w:color w:val="2FF3C0"/>
+          <w:sz w:val="13"/>
+        </w:rPr>
+        <w:t>▮▮▮▮▮▮▮</w:t>
+      </w:r>
+      <w:r>
+        <w:rPr>
+          <w:rFonts w:ascii="Calibri" w:hAnsi="Calibri"/>
+          <w:b w:val="0"/>
+          <w:i w:val="0"/>
+          <w:color w:val="3A3D55"/>
+          <w:sz w:val="13"/>
+        </w:rPr>
+        <w:t>▯</w:t>
+      </w:r>
+      <w:r>
+        <w:rPr>
+          <w:rFonts w:ascii="Calibri" w:hAnsi="Calibri"/>
+          <w:b/>
+          <w:i w:val="0"/>
+          <w:color w:val="C9CBDE"/>
+          <w:sz w:val="15"/>
+        </w:rPr>
+        <w:t xml:space="preserve">  88%</w:t>
       </w:r>
     </w:p>
     <w:p>
       <w:pPr>
-        <w:spacing w:before="100" w:after="20"/>
+        <w:spacing w:after="20" w:before="0"/>
       </w:pPr>
       <w:r>
         <w:rPr>
+          <w:rFonts w:ascii="Calibri" w:hAnsi="Calibri"/>
           <w:b/>
-          <w:color w:val="1A1A2E"/>
-          <w:sz w:val="21"/>
+          <w:i w:val="0"/>
+          <w:color w:val="D9DAEA"/>
+          <w:sz w:val="15"/>
         </w:rPr>
-        <w:t>CREATIVE PREDICTOR — AI AD TESTING SUITE (v13.0)</w:t>
+        <w:t>Development</w:t>
       </w:r>
     </w:p>
     <w:p>
       <w:pPr>
-        <w:spacing w:after="20"/>
+        <w:spacing w:after="80" w:before="0"/>
       </w:pPr>
       <w:r>
         <w:rPr>
-          <w:color w:val="5A5A5A"/>
-          <w:sz w:val="18"/>
+          <w:rFonts w:ascii="Calibri" w:hAnsi="Calibri"/>
+          <w:b w:val="0"/>
+          <w:i w:val="0"/>
+          <w:color w:val="2FF3C0"/>
+          <w:sz w:val="13"/>
         </w:rPr>
-        <w:t>HTML/JS | Groq AI (Llama 3.3 70B) | OpenAI | HuggingFace Spaces</w:t>
+        <w:t>▮▮▮▮▮▮</w:t>
       </w:r>
       <w:r>
         <w:rPr>
-          <w:color w:val="4A4A8A"/>
-          <w:sz w:val="17"/>
+          <w:rFonts w:ascii="Calibri" w:hAnsi="Calibri"/>
+          <w:b w:val="0"/>
+          <w:i w:val="0"/>
+          <w:color w:val="3A3D55"/>
+          <w:sz w:val="13"/>
         </w:rPr>
-        <w:t xml:space="preserve">   ·   Live: mvamshi56-creative-predictor.static.hf.space</w:t>
+        <w:t>▯▯</w:t>
+      </w:r>
+      <w:r>
+        <w:rPr>
+          <w:rFonts w:ascii="Calibri" w:hAnsi="Calibri"/>
+          <w:b/>
+          <w:i w:val="0"/>
+          <w:color w:val="C9CBDE"/>
+          <w:sz w:val="15"/>
+        </w:rPr>
+        <w:t xml:space="preserve">  78%</w:t>
       </w:r>
     </w:p>
     <w:p>
       <w:pPr>
-        <w:spacing w:after="40"/>
-      </w:pPr>
-      <w:r>
-        <w:rPr>
-          <w:sz w:val="20"/>
-        </w:rPr>
-        <w:t>An all-in-one ad and landing-page intelligence suite for paid-media teams: paste any ad creative and receive a scored prediction, a full marketing analysis, and clear next actions — in seconds.</w:t>
-      </w:r>
-    </w:p>
-    <w:p>
-      <w:pPr>
-        <w:pStyle w:val="ListBullet"/>
-        <w:spacing w:after="40"/>
-        <w:ind w:left="317"/>
-      </w:pPr>
-      <w:r>
-        <w:t>Ad Creative Analyzer predicts overall creative score, CTR, engagement, and conversion per platform (Meta, Google, LinkedIn, Instagram/Reels, TikTok).</w:t>
-      </w:r>
-    </w:p>
-    <w:p>
-      <w:pPr>
-        <w:pStyle w:val="ListBullet"/>
-        <w:spacing w:after="40"/>
-        <w:ind w:left="317"/>
-      </w:pPr>
-      <w:r>
-        <w:t>20+ decision modules — quality score, budget estimator, emotional arc, copy-length optimizer, ad-fatigue estimator, CRO checklist, ROAS calculator, attention heatmap, and more.</w:t>
-      </w:r>
-    </w:p>
-    <w:p>
-      <w:pPr>
-        <w:pStyle w:val="ListBullet"/>
-        <w:spacing w:after="40"/>
-        <w:ind w:left="317"/>
-      </w:pPr>
-      <w:r>
-        <w:t>Full A/B testing toolkit — side-by-side Version A vs B comparison, statistical-significance calculator, and A/B test idea generator.</w:t>
-      </w:r>
-    </w:p>
-    <w:p>
-      <w:pPr>
-        <w:pStyle w:val="ListBullet"/>
-        <w:spacing w:after="40"/>
-        <w:ind w:left="317"/>
-      </w:pPr>
-      <w:r>
-        <w:t>Competitor Ad Decoder and Landing Page Analyzer (SEO, GEO, AEO, CRO) with PDF/PPT report export.</w:t>
-      </w:r>
-    </w:p>
-    <w:p>
-      <w:pPr>
-        <w:pStyle w:val="ListBullet"/>
-        <w:spacing w:after="40"/>
-        <w:ind w:left="317"/>
-      </w:pPr>
-      <w:r>
-        <w:t>AI engine switchable across Groq, OpenAI, and HuggingFace; shipped 13 product iterations (v13.0).</w:t>
-      </w:r>
-    </w:p>
-    <w:p>
-      <w:pPr>
-        <w:spacing w:before="100" w:after="20"/>
-      </w:pPr>
-      <w:r>
-        <w:rPr>
-          <w:b/>
-          <w:color w:val="1A1A2E"/>
-          <w:sz w:val="21"/>
-        </w:rPr>
-        <w:t>AI GROWTH STRATEGY GENERATOR</w:t>
-      </w:r>
-    </w:p>
-    <w:p>
-      <w:pPr>
-        <w:spacing w:after="20"/>
-      </w:pPr>
-      <w:r>
-        <w:rPr>
-          <w:color w:val="5A5A5A"/>
-          <w:sz w:val="18"/>
-        </w:rPr>
-        <w:t>Next.js | Vercel</w:t>
-      </w:r>
-      <w:r>
-        <w:rPr>
-          <w:color w:val="4A4A8A"/>
-          <w:sz w:val="17"/>
-        </w:rPr>
-        <w:t xml:space="preserve">   ·   Live: strategy-generator-kwdf-beta.vercel.app</w:t>
-      </w:r>
-    </w:p>
-    <w:p>
-      <w:pPr>
-        <w:spacing w:after="40"/>
-      </w:pPr>
-      <w:r>
-        <w:rPr>
-          <w:sz w:val="20"/>
-        </w:rPr>
-        <w:t>An AI-powered, funnel-based strategy generator that does in seconds what a growth consultant maps over days: take real business inputs and return a personalized, budget-optimized marketing strategy.</w:t>
-      </w:r>
-    </w:p>
-    <w:p>
-      <w:pPr>
-        <w:pStyle w:val="ListBullet"/>
-        <w:spacing w:after="40"/>
-        <w:ind w:left="317"/>
-      </w:pPr>
-      <w:r>
-        <w:t>Designed a guided conversion wizard capturing industry, monthly budget, primary goal, and strategy style (balanced / aggressive / conservative).</w:t>
-      </w:r>
-    </w:p>
-    <w:p>
-      <w:pPr>
-        <w:pStyle w:val="ListBullet"/>
-        <w:spacing w:after="40"/>
-        <w:ind w:left="317"/>
-      </w:pPr>
-      <w:r>
-        <w:t>Optional KPI targets (CPA, ROAS, conversion rate) and competitor mapping sharpen recommendations and run an instant SWOT.</w:t>
-      </w:r>
-    </w:p>
-    <w:p>
-      <w:pPr>
-        <w:pStyle w:val="ListBullet"/>
-        <w:spacing w:after="40"/>
-        <w:ind w:left="317"/>
-      </w:pPr>
-      <w:r>
-        <w:t>Built the scoring engine, funnel split (awareness to loyalty), and budget allocation logic in Next.js.</w:t>
-      </w:r>
-    </w:p>
-    <w:p>
-      <w:pPr>
-        <w:pStyle w:val="ListBullet"/>
-        <w:spacing w:after="40"/>
-        <w:ind w:left="317"/>
-      </w:pPr>
-      <w:r>
-        <w:t>Outputs a prioritized roadmap scored by effort vs. impact, with smart budget allocation across channels.</w:t>
-      </w:r>
-    </w:p>
-    <w:p>
-      <w:pPr>
-        <w:spacing w:before="200" w:after="60"/>
+        <w:spacing w:after="40" w:before="120"/>
         <w:pBdr>
-          <w:bottom w:val="single" w:sz="6" w:space="1" w:color="D9D9EC"/>
+          <w:bottom w:val="single" w:sz="4" w:space="2" w:color="2F3C50"/>
         </w:pBdr>
       </w:pPr>
       <w:r>
         <w:rPr>
           <w:rFonts w:ascii="Calibri" w:hAnsi="Calibri"/>
           <w:b/>
-          <w:color w:val="4A4A8A"/>
-          <w:sz w:val="24"/>
+          <w:i w:val="0"/>
+          <w:color w:val="2FF3C0"/>
+          <w:sz w:val="19"/>
         </w:rPr>
-        <w:t>TECHNICAL SKILLS</w:t>
+        <w:t>LANGUAGES</w:t>
       </w:r>
     </w:p>
-    <w:tbl>
-      <w:tblPr>
-        <w:tblW w:type="auto" w:w="0"/>
-        <w:tblLayout w:type="fixed"/>
-        <w:tblLook w:firstColumn="1" w:firstRow="1" w:lastColumn="0" w:lastRow="0" w:noHBand="0" w:noVBand="1" w:val="04A0"/>
-      </w:tblPr>
-      <w:tblGrid>
-        <w:gridCol w:w="5112"/>
-        <w:gridCol w:w="5112"/>
-      </w:tblGrid>
-      <w:tr>
-        <w:tc>
-          <w:tcPr>
-            <w:tcW w:type="dxa" w:w="5112"/>
-          </w:tcPr>
-          <w:p>
-            <w:pPr>
-              <w:spacing w:after="20"/>
-            </w:pPr>
-            <w:r>
-              <w:rPr>
-                <w:b/>
-                <w:color w:val="4A4A8A"/>
-                <w:sz w:val="19"/>
-              </w:rPr>
-              <w:t>AI &amp; AUTOMATION</w:t>
-            </w:r>
-          </w:p>
-          <w:p>
-            <w:pPr>
-              <w:spacing w:after="80"/>
-            </w:pPr>
-            <w:r>
-              <w:rPr>
-                <w:sz w:val="18"/>
-              </w:rPr>
-              <w:t>Generative AI, Prompt Engineering, AI Agents, ChatGPT, Claude AI, Gemini AI, Perplexity AI, Marketing Automation, Workflow Automation</w:t>
-            </w:r>
-          </w:p>
-        </w:tc>
-        <w:tc>
-          <w:tcPr>
-            <w:tcW w:type="dxa" w:w="5112"/>
-          </w:tcPr>
-          <w:p>
-            <w:pPr>
-              <w:spacing w:after="20"/>
-            </w:pPr>
-            <w:r>
-              <w:rPr>
-                <w:b/>
-                <w:color w:val="4A4A8A"/>
-                <w:sz w:val="19"/>
-              </w:rPr>
-              <w:t>SEO &amp; SEARCH</w:t>
-            </w:r>
-          </w:p>
-          <w:p>
-            <w:pPr>
-              <w:spacing w:after="80"/>
-            </w:pPr>
-            <w:r>
-              <w:rPr>
-                <w:sz w:val="18"/>
-              </w:rPr>
-              <w:t>Technical SEO, Enterprise SEO, Local SEO, On-Page / Off-Page, E-E-A-T, Keyword Research, Competitor Analysis, Link Building, SEO Audits, AI-Powered SEO</w:t>
-            </w:r>
-          </w:p>
-        </w:tc>
-      </w:tr>
-      <w:tr>
-        <w:tc>
-          <w:tcPr>
-            <w:tcW w:type="dxa" w:w="5112"/>
-          </w:tcPr>
-          <w:p>
-            <w:pPr>
-              <w:spacing w:after="20"/>
-            </w:pPr>
-            <w:r>
-              <w:rPr>
-                <w:b/>
-                <w:color w:val="4A4A8A"/>
-                <w:sz w:val="19"/>
-              </w:rPr>
-              <w:t>PAID MEDIA</w:t>
-            </w:r>
-          </w:p>
-          <w:p>
-            <w:pPr>
-              <w:spacing w:after="80"/>
-            </w:pPr>
-            <w:r>
-              <w:rPr>
-                <w:sz w:val="18"/>
-              </w:rPr>
-              <w:t>PPC (Google Ads), LinkedIn Ads, Display &amp; Search, Lead Generation, CRO, Landing Page Optimization, Audience Segmentation, Funnel Optimization</w:t>
-            </w:r>
-          </w:p>
-        </w:tc>
-        <w:tc>
-          <w:tcPr>
-            <w:tcW w:type="dxa" w:w="5112"/>
-          </w:tcPr>
-          <w:p>
-            <w:pPr>
-              <w:spacing w:after="20"/>
-            </w:pPr>
-            <w:r>
-              <w:rPr>
-                <w:b/>
-                <w:color w:val="4A4A8A"/>
-                <w:sz w:val="19"/>
-              </w:rPr>
-              <w:t>ANALYTICS</w:t>
-            </w:r>
-          </w:p>
-          <w:p>
-            <w:pPr>
-              <w:spacing w:after="80"/>
-            </w:pPr>
-            <w:r>
-              <w:rPr>
-                <w:sz w:val="18"/>
-              </w:rPr>
-              <w:t>GA4, Looker Studio, Tableau, Data Visualization, Attribution Analysis, KPI Reporting, Conversion Tracking, ROI Measurement</w:t>
-            </w:r>
-          </w:p>
-        </w:tc>
-      </w:tr>
-      <w:tr>
-        <w:tc>
-          <w:tcPr>
-            <w:tcW w:type="dxa" w:w="5112"/>
-          </w:tcPr>
-          <w:p>
-            <w:pPr>
-              <w:spacing w:after="20"/>
-            </w:pPr>
-            <w:r>
-              <w:rPr>
-                <w:b/>
-                <w:color w:val="4A4A8A"/>
-                <w:sz w:val="19"/>
-              </w:rPr>
-              <w:t>TOOLS &amp; PLATFORMS</w:t>
-            </w:r>
-          </w:p>
-          <w:p>
-            <w:pPr>
-              <w:spacing w:after="80"/>
-            </w:pPr>
-            <w:r>
-              <w:rPr>
-                <w:sz w:val="18"/>
-              </w:rPr>
-              <w:t>SEMrush, Ahrefs, Moz, SpyFu, SimilarWeb, Screaming Frog, Search Console, Keyword Planner, Google Trends, Meta Business</w:t>
-            </w:r>
-          </w:p>
-        </w:tc>
-        <w:tc>
-          <w:tcPr>
-            <w:tcW w:type="dxa" w:w="5112"/>
-          </w:tcPr>
-          <w:p/>
-        </w:tc>
-      </w:tr>
-    </w:tbl>
     <w:p>
       <w:pPr>
-        <w:spacing w:before="200" w:after="60"/>
+        <w:spacing w:after="40" w:before="0"/>
+      </w:pPr>
+      <w:r>
+        <w:rPr>
+          <w:rFonts w:ascii="Calibri" w:hAnsi="Calibri"/>
+          <w:b w:val="0"/>
+          <w:i w:val="0"/>
+          <w:color w:val="D9DAEA"/>
+          <w:sz w:val="16"/>
+        </w:rPr>
+        <w:t>English · Hindi · Telugu · Kannada</w:t>
+      </w:r>
+    </w:p>
+    <w:p>
+      <w:pPr>
+        <w:spacing w:after="40" w:before="120"/>
         <w:pBdr>
-          <w:bottom w:val="single" w:sz="6" w:space="1" w:color="D9D9EC"/>
+          <w:bottom w:val="single" w:sz="4" w:space="2" w:color="2F3C50"/>
         </w:pBdr>
       </w:pPr>
       <w:r>
         <w:rPr>
           <w:rFonts w:ascii="Calibri" w:hAnsi="Calibri"/>
           <w:b/>
-          <w:color w:val="4A4A8A"/>
-          <w:sz w:val="24"/>
+          <w:i w:val="0"/>
+          <w:color w:val="2FF3C0"/>
+          <w:sz w:val="19"/>
         </w:rPr>
-        <w:t>EDUCATION · CERTIFICATIONS · LANGUAGES</w:t>
+        <w:t>CERTIFICATIONS</w:t>
       </w:r>
     </w:p>
-    <w:tbl>
-      <w:tblPr>
-        <w:tblW w:type="auto" w:w="0"/>
-        <w:tblLayout w:type="fixed"/>
-        <w:tblLook w:firstColumn="1" w:firstRow="1" w:lastColumn="0" w:lastRow="0" w:noHBand="0" w:noVBand="1" w:val="04A0"/>
-      </w:tblPr>
-      <w:tblGrid>
-        <w:gridCol w:w="5112"/>
-        <w:gridCol w:w="5112"/>
-      </w:tblGrid>
-      <w:tr>
-        <w:tc>
-          <w:tcPr>
-            <w:tcW w:type="dxa" w:w="5112"/>
-          </w:tcPr>
-          <w:p>
-            <w:pPr>
-              <w:spacing w:after="20"/>
-            </w:pPr>
-            <w:r>
-              <w:rPr>
-                <w:b/>
-                <w:sz w:val="19"/>
-              </w:rPr>
-              <w:t>M.TECH — POWER ELECTRONICS</w:t>
-            </w:r>
-          </w:p>
-          <w:p>
-            <w:pPr>
-              <w:spacing w:after="60"/>
-            </w:pPr>
-            <w:r>
-              <w:rPr>
-                <w:color w:val="5A5A5A"/>
-                <w:sz w:val="18"/>
-              </w:rPr>
-              <w:t>P.D.A College of Engineering, Karnataka (VTU)</w:t>
-            </w:r>
-          </w:p>
-        </w:tc>
-        <w:tc>
-          <w:tcPr>
-            <w:tcW w:type="dxa" w:w="5112"/>
-          </w:tcPr>
-          <w:p>
-            <w:pPr>
-              <w:spacing w:after="20"/>
-            </w:pPr>
-            <w:r>
-              <w:rPr>
-                <w:b/>
-                <w:sz w:val="19"/>
-              </w:rPr>
-              <w:t>Certifications</w:t>
-            </w:r>
-          </w:p>
-          <w:p>
-            <w:pPr>
-              <w:spacing w:after="60"/>
-            </w:pPr>
-            <w:r>
-              <w:rPr>
-                <w:color w:val="5A5A5A"/>
-                <w:sz w:val="18"/>
-              </w:rPr>
-              <w:t>Generative AI Mastermind (Outskill) · Advanced SEO: Search Factors (LinkedIn Learning) · Marketing Tools: Growth Marketing (LinkedIn Learning)</w:t>
-            </w:r>
-          </w:p>
-        </w:tc>
-      </w:tr>
-      <w:tr>
-        <w:tc>
-          <w:tcPr>
-            <w:tcW w:type="dxa" w:w="5112"/>
-          </w:tcPr>
-          <w:p>
-            <w:pPr>
-              <w:spacing w:after="20"/>
-            </w:pPr>
-            <w:r>
-              <w:rPr>
-                <w:b/>
-                <w:sz w:val="19"/>
-              </w:rPr>
-              <w:t>B.E. — ELECTRONICS &amp; COMMUNICATION</w:t>
-            </w:r>
-          </w:p>
-          <w:p>
-            <w:pPr>
-              <w:spacing w:after="60"/>
-            </w:pPr>
-            <w:r>
-              <w:rPr>
-                <w:color w:val="5A5A5A"/>
-                <w:sz w:val="18"/>
-              </w:rPr>
-              <w:t>Bellary Engineering College, Karnataka (VTU)</w:t>
-            </w:r>
-          </w:p>
-        </w:tc>
-        <w:tc>
-          <w:tcPr>
-            <w:tcW w:type="dxa" w:w="5112"/>
-          </w:tcPr>
-          <w:p>
-            <w:pPr>
-              <w:spacing w:after="20"/>
-            </w:pPr>
-            <w:r>
-              <w:rPr>
-                <w:b/>
-                <w:sz w:val="19"/>
-              </w:rPr>
-              <w:t>Languages</w:t>
-            </w:r>
-          </w:p>
-          <w:p>
-            <w:pPr>
-              <w:spacing w:after="60"/>
-            </w:pPr>
-            <w:r>
-              <w:rPr>
-                <w:color w:val="5A5A5A"/>
-                <w:sz w:val="18"/>
-              </w:rPr>
-              <w:t>English · Hindi · Telugu · Kannada</w:t>
-            </w:r>
-          </w:p>
-        </w:tc>
-      </w:tr>
-    </w:tbl>
+    <w:p>
+      <w:pPr>
+        <w:spacing w:after="40" w:before="0"/>
+      </w:pPr>
+      <w:r>
+        <w:rPr>
+          <w:rFonts w:ascii="Calibri" w:hAnsi="Calibri"/>
+          <w:b w:val="0"/>
+          <w:i w:val="0"/>
+          <w:color w:val="C9CBDE"/>
+          <w:sz w:val="15"/>
+        </w:rPr>
+        <w:t>✓ Generative AI Mastermind — Outskill</w:t>
+      </w:r>
+    </w:p>
+    <w:p>
+      <w:pPr>
+        <w:spacing w:after="40" w:before="0"/>
+      </w:pPr>
+      <w:r>
+        <w:rPr>
+          <w:rFonts w:ascii="Calibri" w:hAnsi="Calibri"/>
+          <w:b w:val="0"/>
+          <w:i w:val="0"/>
+          <w:color w:val="C9CBDE"/>
+          <w:sz w:val="15"/>
+        </w:rPr>
+        <w:t>✓ Advanced SEO: Search Factors — LinkedIn Learning</w:t>
+      </w:r>
+    </w:p>
+    <w:p>
+      <w:pPr>
+        <w:spacing w:after="40" w:before="0"/>
+      </w:pPr>
+      <w:r>
+        <w:rPr>
+          <w:rFonts w:ascii="Calibri" w:hAnsi="Calibri"/>
+          <w:b w:val="0"/>
+          <w:i w:val="0"/>
+          <w:color w:val="C9CBDE"/>
+          <w:sz w:val="15"/>
+        </w:rPr>
+        <w:t>✓ Growth Marketing Tools — LinkedIn Learning</w:t>
+      </w:r>
+    </w:p>
     <w:sectPr>
       <w:pgSz w:w="12240" w:h="15840"/>
-      <w:pgMar w:top="792" w:right="1008" w:bottom="792" w:left="1008" w:header="720" w:footer="720" w:gutter="0"/>
+      <w:pgMar w:top="720" w:right="792" w:bottom="720" w:left="792" w:header="720" w:footer="720" w:gutter="0"/>
       <w:cols w:space="720"/>
       <w:docGrid w:linePitch="360"/>
     </w:sectPr>
@@ -1730,12 +2349,12 @@
     <w:qFormat/>
     <w:rsid w:val="00FC693F"/>
     <w:pPr>
-      <w:spacing w:after="80" w:before="0" w:line="269" w:lineRule="auto"/>
+      <w:spacing w:after="80" w:line="264" w:lineRule="auto"/>
     </w:pPr>
     <w:rPr>
       <w:rFonts w:ascii="Calibri" w:hAnsi="Calibri" w:eastAsia="Calibri"/>
-      <w:color w:val="1A1A2E"/>
-      <w:sz w:val="21"/>
+      <w:color w:val="2B2D3A"/>
+      <w:sz w:val="20"/>
     </w:rPr>
   </w:style>
   <w:style w:type="paragraph" w:styleId="Header">

</xml_diff>

<commit_message>
fix: CV — verbatim content, ATS-safe single-column (no tables/images), clean typography
</commit_message>
<xml_diff>
--- a/public/Vamshidhar_Reddy_M_CV.docx
+++ b/public/Vamshidhar_Reddy_M_CV.docx
@@ -2,1982 +2,1865 @@
 <file path=word/document.xml><?xml version="1.0" encoding="utf-8"?>
 <w:document xmlns:wpc="http://schemas.microsoft.com/office/word/2010/wordprocessingCanvas" xmlns:mo="http://schemas.microsoft.com/office/mac/office/2008/main" xmlns:mc="http://schemas.openxmlformats.org/markup-compatibility/2006" xmlns:mv="urn:schemas-microsoft-com:mac:vml" xmlns:o="urn:schemas-microsoft-com:office:office" xmlns:r="http://schemas.openxmlformats.org/officeDocument/2006/relationships" xmlns:m="http://schemas.openxmlformats.org/officeDocument/2006/math" xmlns:v="urn:schemas-microsoft-com:vml" xmlns:wp14="http://schemas.microsoft.com/office/word/2010/wordprocessingDrawing" xmlns:wp="http://schemas.openxmlformats.org/drawingml/2006/wordprocessingDrawing" xmlns:w10="urn:schemas-microsoft-com:office:word" xmlns:w="http://schemas.openxmlformats.org/wordprocessingml/2006/main" xmlns:w14="http://schemas.microsoft.com/office/word/2010/wordml" xmlns:wpg="http://schemas.microsoft.com/office/word/2010/wordprocessingGroup" xmlns:wpi="http://schemas.microsoft.com/office/word/2010/wordprocessingInk" xmlns:wne="http://schemas.microsoft.com/office/word/2006/wordml" xmlns:wps="http://schemas.microsoft.com/office/word/2010/wordprocessingShape" mc:Ignorable="w14 wp14">
   <w:body>
-    <w:tbl>
-      <w:tblPr>
-        <w:tblW w:type="auto" w:w="0"/>
-        <w:jc w:val="center"/>
-        <w:tblLayout w:type="fixed"/>
-        <w:tblLook w:firstColumn="1" w:firstRow="1" w:lastColumn="0" w:lastRow="0" w:noHBand="0" w:noVBand="1" w:val="04A0"/>
-        <w:tblBorders>
-          <w:top w:val="none"/>
-          <w:left w:val="none"/>
-          <w:bottom w:val="none"/>
-          <w:right w:val="none"/>
-          <w:insideH w:val="none"/>
-          <w:insideV w:val="none"/>
-        </w:tblBorders>
-      </w:tblPr>
-      <w:tblGrid>
-        <w:gridCol w:w="3528"/>
-        <w:gridCol w:w="7416"/>
-      </w:tblGrid>
-      <w:tr>
-        <w:tc>
-          <w:tcPr>
-            <w:tcW w:type="dxa" w:w="5328"/>
-            <w:shd w:val="clear" w:color="auto" w:fill="1E1F33"/>
-            <w:tcMar>
-              <w:top w:w="220" w:type="dxa"/>
-              <w:bottom w:w="160" w:type="dxa"/>
-              <w:left w:w="200" w:type="dxa"/>
-              <w:right w:w="150" w:type="dxa"/>
-            </w:tcMar>
-          </w:tcPr>
-          <w:p>
-            <w:pPr>
-              <w:spacing w:after="120"/>
-              <w:jc w:val="center"/>
-            </w:pPr>
-            <w:r>
-              <w:rPr>
-                <w:rFonts w:ascii="Calibri" w:hAnsi="Calibri"/>
-                <w:b/>
-                <w:color w:val="2FF3C0"/>
-                <w:sz w:val="60"/>
-              </w:rPr>
-              <w:t>VR</w:t>
-            </w:r>
-          </w:p>
-        </w:tc>
-        <w:tc>
-          <w:tcPr>
-            <w:tcW w:type="dxa" w:w="5328"/>
-            <w:tcMar>
-              <w:top w:w="160" w:type="dxa"/>
-              <w:bottom w:w="120" w:type="dxa"/>
-              <w:left w:w="200" w:type="dxa"/>
-              <w:right w:w="120" w:type="dxa"/>
-            </w:tcMar>
-          </w:tcPr>
-          <w:p>
-            <w:pPr>
-              <w:spacing w:after="20"/>
-            </w:pPr>
-            <w:r>
-              <w:rPr>
-                <w:rFonts w:ascii="Calibri" w:hAnsi="Calibri"/>
-                <w:b/>
-                <w:i w:val="0"/>
-                <w:color w:val="1E1F33"/>
-                <w:sz w:val="48"/>
-              </w:rPr>
-              <w:t>VAMSHIDHAR REDDY M</w:t>
-            </w:r>
-          </w:p>
-          <w:p>
-            <w:pPr>
-              <w:spacing w:after="40"/>
-            </w:pPr>
-            <w:r>
-              <w:rPr>
-                <w:rFonts w:ascii="Calibri" w:hAnsi="Calibri"/>
-                <w:b/>
-                <w:i w:val="0"/>
-                <w:color w:val="2E86AB"/>
-                <w:sz w:val="26"/>
-              </w:rPr>
-              <w:t>Performance Marketer Who Builds AI Tools</w:t>
-            </w:r>
-          </w:p>
-          <w:p>
-            <w:pPr>
-              <w:spacing w:after="120"/>
-            </w:pPr>
-            <w:r>
-              <w:rPr>
-                <w:rFonts w:ascii="Calibri" w:hAnsi="Calibri"/>
-                <w:b w:val="0"/>
-                <w:i w:val="0"/>
-                <w:color w:val="5A5D6E"/>
-                <w:sz w:val="18"/>
-              </w:rPr>
-              <w:t>SEO   ·   PPC   ·   AI Automation   ·   Content   ·   Analytics</w:t>
-            </w:r>
-          </w:p>
-          <w:tbl>
-            <w:tblPr>
-              <w:tblW w:type="auto" w:w="0"/>
-              <w:tblLook w:firstColumn="1" w:firstRow="1" w:lastColumn="0" w:lastRow="0" w:noHBand="0" w:noVBand="1" w:val="04A0"/>
-              <w:tblBorders>
-                <w:top w:val="none"/>
-                <w:left w:val="none"/>
-                <w:bottom w:val="none"/>
-                <w:right w:val="none"/>
-                <w:insideH w:val="none"/>
-                <w:insideV w:val="none"/>
-              </w:tblBorders>
-            </w:tblPr>
-            <w:tblGrid>
-              <w:gridCol w:w="1066"/>
-              <w:gridCol w:w="1066"/>
-              <w:gridCol w:w="1066"/>
-              <w:gridCol w:w="1066"/>
-              <w:gridCol w:w="1066"/>
-            </w:tblGrid>
-            <w:tr>
-              <w:tc>
-                <w:tcPr>
-                  <w:tcW w:type="dxa" w:w="1066"/>
-                  <w:shd w:val="clear" w:color="auto" w:fill="F2F4F8"/>
-                  <w:tcMar>
-                    <w:top w:w="60" w:type="dxa"/>
-                    <w:bottom w:w="60" w:type="dxa"/>
-                    <w:left w:w="60" w:type="dxa"/>
-                    <w:right w:w="60" w:type="dxa"/>
-                  </w:tcMar>
-                </w:tcPr>
-                <w:p>
-                  <w:pPr>
-                    <w:spacing w:after="0"/>
-                    <w:jc w:val="center"/>
-                  </w:pPr>
-                  <w:r>
-                    <w:rPr>
-                      <w:b/>
-                      <w:color w:val="2E86AB"/>
-                      <w:sz w:val="15"/>
-                    </w:rPr>
-                    <w:t>15% organic growth</w:t>
-                  </w:r>
-                </w:p>
-              </w:tc>
-              <w:tc>
-                <w:tcPr>
-                  <w:tcW w:type="dxa" w:w="1066"/>
-                  <w:shd w:val="clear" w:color="auto" w:fill="F2F4F8"/>
-                  <w:tcMar>
-                    <w:top w:w="60" w:type="dxa"/>
-                    <w:bottom w:w="60" w:type="dxa"/>
-                    <w:left w:w="60" w:type="dxa"/>
-                    <w:right w:w="60" w:type="dxa"/>
-                  </w:tcMar>
-                </w:tcPr>
-                <w:p>
-                  <w:pPr>
-                    <w:spacing w:after="0"/>
-                    <w:jc w:val="center"/>
-                  </w:pPr>
-                  <w:r>
-                    <w:rPr>
-                      <w:b/>
-                      <w:color w:val="2E86AB"/>
-                      <w:sz w:val="15"/>
-                    </w:rPr>
-                    <w:t>Page-1 rankings</w:t>
-                  </w:r>
-                </w:p>
-              </w:tc>
-              <w:tc>
-                <w:tcPr>
-                  <w:tcW w:type="dxa" w:w="1066"/>
-                  <w:shd w:val="clear" w:color="auto" w:fill="F2F4F8"/>
-                  <w:tcMar>
-                    <w:top w:w="60" w:type="dxa"/>
-                    <w:bottom w:w="60" w:type="dxa"/>
-                    <w:left w:w="60" w:type="dxa"/>
-                    <w:right w:w="60" w:type="dxa"/>
-                  </w:tcMar>
-                </w:tcPr>
-                <w:p>
-                  <w:pPr>
-                    <w:spacing w:after="0"/>
-                    <w:jc w:val="center"/>
-                  </w:pPr>
-                  <w:r>
-                    <w:rPr>
-                      <w:b/>
-                      <w:color w:val="2E86AB"/>
-                      <w:sz w:val="15"/>
-                    </w:rPr>
-                    <w:t>70+ leads/mo</w:t>
-                  </w:r>
-                </w:p>
-              </w:tc>
-              <w:tc>
-                <w:tcPr>
-                  <w:tcW w:type="dxa" w:w="1066"/>
-                  <w:shd w:val="clear" w:color="auto" w:fill="F2F4F8"/>
-                  <w:tcMar>
-                    <w:top w:w="60" w:type="dxa"/>
-                    <w:bottom w:w="60" w:type="dxa"/>
-                    <w:left w:w="60" w:type="dxa"/>
-                    <w:right w:w="60" w:type="dxa"/>
-                  </w:tcMar>
-                </w:tcPr>
-                <w:p>
-                  <w:pPr>
-                    <w:spacing w:after="0"/>
-                    <w:jc w:val="center"/>
-                  </w:pPr>
-                  <w:r>
-                    <w:rPr>
-                      <w:b/>
-                      <w:color w:val="2E86AB"/>
-                      <w:sz w:val="15"/>
-                    </w:rPr>
-                    <w:t>Rs.2L+ ad spend</w:t>
-                  </w:r>
-                </w:p>
-              </w:tc>
-              <w:tc>
-                <w:tcPr>
-                  <w:tcW w:type="dxa" w:w="1066"/>
-                  <w:shd w:val="clear" w:color="auto" w:fill="F2F4F8"/>
-                  <w:tcMar>
-                    <w:top w:w="60" w:type="dxa"/>
-                    <w:bottom w:w="60" w:type="dxa"/>
-                    <w:left w:w="60" w:type="dxa"/>
-                    <w:right w:w="60" w:type="dxa"/>
-                  </w:tcMar>
-                </w:tcPr>
-                <w:p>
-                  <w:pPr>
-                    <w:spacing w:after="0"/>
-                    <w:jc w:val="center"/>
-                  </w:pPr>
-                  <w:r>
-                    <w:rPr>
-                      <w:b/>
-                      <w:color w:val="2E86AB"/>
-                      <w:sz w:val="15"/>
-                    </w:rPr>
-                    <w:t>3 products shipped</w:t>
-                  </w:r>
-                </w:p>
-              </w:tc>
-            </w:tr>
-          </w:tbl>
-          <w:p/>
-          <w:p>
-            <w:pPr>
-              <w:spacing w:after="40"/>
-            </w:pPr>
-          </w:p>
-          <w:p>
-            <w:pPr>
-              <w:spacing w:before="0" w:after="40"/>
-              <w:pBdr>
-                <w:bottom w:val="single" w:sz="8" w:space="2" w:color="2E86AB"/>
-              </w:pBdr>
-            </w:pPr>
-            <w:r>
-              <w:rPr>
-                <w:rFonts w:ascii="Calibri" w:hAnsi="Calibri"/>
-                <w:b/>
-                <w:i w:val="0"/>
-                <w:color w:val="2E86AB"/>
-                <w:sz w:val="22"/>
-              </w:rPr>
-              <w:t>PROFILE</w:t>
-            </w:r>
-          </w:p>
-          <w:p>
-            <w:pPr>
-              <w:spacing w:after="80"/>
-            </w:pPr>
-            <w:r>
-              <w:rPr>
-                <w:rFonts w:ascii="Calibri" w:hAnsi="Calibri"/>
-                <w:b w:val="0"/>
-                <w:i w:val="0"/>
-                <w:color w:val="2B2D3A"/>
-                <w:sz w:val="19"/>
-              </w:rPr>
-              <w:t>I sit in a rare middle lane: I plan the strategy with the CMO and build the tool that executes it. 8+ years of SEO, PPC and content, plus three AI products I designed, built and shipped solo. Everything I claim is measurable — and this very CV comes with live links you can click.</w:t>
-            </w:r>
-          </w:p>
-          <w:p>
-            <w:pPr>
-              <w:spacing w:before="80" w:after="40"/>
-              <w:pBdr>
-                <w:bottom w:val="single" w:sz="8" w:space="2" w:color="2E86AB"/>
-              </w:pBdr>
-            </w:pPr>
-            <w:r>
-              <w:rPr>
-                <w:rFonts w:ascii="Calibri" w:hAnsi="Calibri"/>
-                <w:b/>
-                <w:i w:val="0"/>
-                <w:color w:val="2E86AB"/>
-                <w:sz w:val="22"/>
-              </w:rPr>
-              <w:t>EXPERIENCE</w:t>
-            </w:r>
-          </w:p>
-          <w:p>
-            <w:pPr>
-              <w:spacing w:before="60" w:after="0"/>
-            </w:pPr>
-            <w:r>
-              <w:rPr>
-                <w:rFonts w:ascii="Calibri" w:hAnsi="Calibri"/>
-                <w:b/>
-                <w:i w:val="0"/>
-                <w:color w:val="2FF3C0"/>
-                <w:sz w:val="18"/>
-              </w:rPr>
-              <w:t xml:space="preserve">▸ </w:t>
-            </w:r>
-            <w:r>
-              <w:rPr>
-                <w:rFonts w:ascii="Calibri" w:hAnsi="Calibri"/>
-                <w:b/>
-                <w:i w:val="0"/>
-                <w:color w:val="2B2D3A"/>
-                <w:sz w:val="19"/>
-              </w:rPr>
-              <w:t>Digital Marketing Specialist</w:t>
-            </w:r>
-            <w:r>
-              <w:rPr>
-                <w:rFonts w:ascii="Calibri" w:hAnsi="Calibri"/>
-                <w:b w:val="0"/>
-                <w:i w:val="0"/>
-                <w:color w:val="5A5D6E"/>
-                <w:sz w:val="17"/>
-              </w:rPr>
-              <w:t xml:space="preserve">   |   Autozilla Software Solutions   </w:t>
-            </w:r>
-            <w:r>
-              <w:rPr>
-                <w:rFonts w:ascii="Calibri" w:hAnsi="Calibri"/>
-                <w:b w:val="0"/>
-                <w:i/>
-                <w:color w:val="5A5D6E"/>
-                <w:sz w:val="16"/>
-              </w:rPr>
-              <w:t>May 2023 – Present</w:t>
-            </w:r>
-          </w:p>
-          <w:p>
-            <w:pPr>
-              <w:spacing w:after="0"/>
-              <w:ind w:left="288"/>
-            </w:pPr>
-            <w:r>
-              <w:rPr>
-                <w:rFonts w:ascii="Calibri" w:hAnsi="Calibri"/>
-                <w:b/>
-                <w:i w:val="0"/>
-                <w:color w:val="2E86AB"/>
-                <w:sz w:val="17"/>
-              </w:rPr>
-              <w:t xml:space="preserve">• </w:t>
-            </w:r>
-            <w:r>
-              <w:rPr>
-                <w:rFonts w:ascii="Calibri" w:hAnsi="Calibri"/>
-                <w:b w:val="0"/>
-                <w:i w:val="0"/>
-                <w:color w:val="2B2D3A"/>
-                <w:sz w:val="17"/>
-              </w:rPr>
-              <w:t>Grew organic traffic 15% (SEO audits, keyword gap, content + technical fixes)</w:t>
-            </w:r>
-          </w:p>
-          <w:p>
-            <w:pPr>
-              <w:spacing w:after="0"/>
-              <w:ind w:left="288"/>
-            </w:pPr>
-            <w:r>
-              <w:rPr>
-                <w:rFonts w:ascii="Calibri" w:hAnsi="Calibri"/>
-                <w:b/>
-                <w:i w:val="0"/>
-                <w:color w:val="2E86AB"/>
-                <w:sz w:val="17"/>
-              </w:rPr>
-              <w:t xml:space="preserve">• </w:t>
-            </w:r>
-            <w:r>
-              <w:rPr>
-                <w:rFonts w:ascii="Calibri" w:hAnsi="Calibri"/>
-                <w:b w:val="0"/>
-                <w:i w:val="0"/>
-                <w:color w:val="2B2D3A"/>
-                <w:sz w:val="17"/>
-              </w:rPr>
-              <w:t>70+ qualified leads/mo by wiring SEO, Google Ads and landing pages into one funnel</w:t>
-            </w:r>
-          </w:p>
-          <w:p>
-            <w:pPr>
-              <w:spacing w:after="0"/>
-              <w:ind w:left="288"/>
-            </w:pPr>
-            <w:r>
-              <w:rPr>
-                <w:rFonts w:ascii="Calibri" w:hAnsi="Calibri"/>
-                <w:b/>
-                <w:i w:val="0"/>
-                <w:color w:val="2E86AB"/>
-                <w:sz w:val="17"/>
-              </w:rPr>
-              <w:t xml:space="preserve">• </w:t>
-            </w:r>
-            <w:r>
-              <w:rPr>
-                <w:rFonts w:ascii="Calibri" w:hAnsi="Calibri"/>
-                <w:b w:val="0"/>
-                <w:i w:val="0"/>
-                <w:color w:val="2B2D3A"/>
-                <w:sz w:val="17"/>
-              </w:rPr>
-              <w:t>Managed Rs.2L+ monthly ad spend; cut CPL Rs.1,100→Rs.770; lifted ROAS 3.2x→5.5x</w:t>
-            </w:r>
-          </w:p>
-          <w:p>
-            <w:pPr>
-              <w:spacing w:after="0"/>
-              <w:ind w:left="288"/>
-            </w:pPr>
-            <w:r>
-              <w:rPr>
-                <w:rFonts w:ascii="Calibri" w:hAnsi="Calibri"/>
-                <w:b/>
-                <w:i w:val="0"/>
-                <w:color w:val="2E86AB"/>
-                <w:sz w:val="17"/>
-              </w:rPr>
-              <w:t xml:space="preserve">• </w:t>
-            </w:r>
-            <w:r>
-              <w:rPr>
-                <w:rFonts w:ascii="Calibri" w:hAnsi="Calibri"/>
-                <w:b w:val="0"/>
-                <w:i w:val="0"/>
-                <w:color w:val="2B2D3A"/>
-                <w:sz w:val="17"/>
-              </w:rPr>
-              <w:t>Built AI-assisted content workflows; GA4 + Looker dashboards; A/B tested copy &amp; CTAs</w:t>
-            </w:r>
-          </w:p>
-          <w:p>
-            <w:pPr>
-              <w:spacing w:before="60" w:after="0"/>
-            </w:pPr>
-            <w:r>
-              <w:rPr>
-                <w:rFonts w:ascii="Calibri" w:hAnsi="Calibri"/>
-                <w:b/>
-                <w:i w:val="0"/>
-                <w:color w:val="2FF3C0"/>
-                <w:sz w:val="18"/>
-              </w:rPr>
-              <w:t xml:space="preserve">▸ </w:t>
-            </w:r>
-            <w:r>
-              <w:rPr>
-                <w:rFonts w:ascii="Calibri" w:hAnsi="Calibri"/>
-                <w:b/>
-                <w:i w:val="0"/>
-                <w:color w:val="2B2D3A"/>
-                <w:sz w:val="19"/>
-              </w:rPr>
-              <w:t>Campaign Specialist</w:t>
-            </w:r>
-            <w:r>
-              <w:rPr>
-                <w:rFonts w:ascii="Calibri" w:hAnsi="Calibri"/>
-                <w:b w:val="0"/>
-                <w:i w:val="0"/>
-                <w:color w:val="5A5D6E"/>
-                <w:sz w:val="17"/>
-              </w:rPr>
-              <w:t xml:space="preserve">   |   Pranathi Software Services   </w:t>
-            </w:r>
-            <w:r>
-              <w:rPr>
-                <w:rFonts w:ascii="Calibri" w:hAnsi="Calibri"/>
-                <w:b w:val="0"/>
-                <w:i/>
-                <w:color w:val="5A5D6E"/>
-                <w:sz w:val="16"/>
-              </w:rPr>
-              <w:t>Jun 2022 – May 2023</w:t>
-            </w:r>
-          </w:p>
-          <w:p>
-            <w:pPr>
-              <w:spacing w:after="0"/>
-              <w:ind w:left="288"/>
-            </w:pPr>
-            <w:r>
-              <w:rPr>
-                <w:rFonts w:ascii="Calibri" w:hAnsi="Calibri"/>
-                <w:b/>
-                <w:i w:val="0"/>
-                <w:color w:val="2E86AB"/>
-                <w:sz w:val="17"/>
-              </w:rPr>
-              <w:t xml:space="preserve">• </w:t>
-            </w:r>
-            <w:r>
-              <w:rPr>
-                <w:rFonts w:ascii="Calibri" w:hAnsi="Calibri"/>
-                <w:b w:val="0"/>
-                <w:i w:val="0"/>
-                <w:color w:val="2B2D3A"/>
-                <w:sz w:val="17"/>
-              </w:rPr>
-              <w:t>Managed SEO/PPC/paid social across client accounts — raised quality scores, cut CPCs</w:t>
-            </w:r>
-          </w:p>
-          <w:p>
-            <w:pPr>
-              <w:spacing w:after="0"/>
-              <w:ind w:left="288"/>
-            </w:pPr>
-            <w:r>
-              <w:rPr>
-                <w:rFonts w:ascii="Calibri" w:hAnsi="Calibri"/>
-                <w:b/>
-                <w:i w:val="0"/>
-                <w:color w:val="2E86AB"/>
-                <w:sz w:val="17"/>
-              </w:rPr>
-              <w:t xml:space="preserve">• </w:t>
-            </w:r>
-            <w:r>
-              <w:rPr>
-                <w:rFonts w:ascii="Calibri" w:hAnsi="Calibri"/>
-                <w:b w:val="0"/>
-                <w:i w:val="0"/>
-                <w:color w:val="2B2D3A"/>
-                <w:sz w:val="17"/>
-              </w:rPr>
-              <w:t>LinkedIn Ads for B2B lead gen; bid/audience/schedule optimization lifted ROAS</w:t>
-            </w:r>
-          </w:p>
-          <w:p>
-            <w:pPr>
-              <w:spacing w:after="0"/>
-              <w:ind w:left="288"/>
-            </w:pPr>
-            <w:r>
-              <w:rPr>
-                <w:rFonts w:ascii="Calibri" w:hAnsi="Calibri"/>
-                <w:b/>
-                <w:i w:val="0"/>
-                <w:color w:val="2E86AB"/>
-                <w:sz w:val="17"/>
-              </w:rPr>
-              <w:t xml:space="preserve">• </w:t>
-            </w:r>
-            <w:r>
-              <w:rPr>
-                <w:rFonts w:ascii="Calibri" w:hAnsi="Calibri"/>
-                <w:b w:val="0"/>
-                <w:i w:val="0"/>
-                <w:color w:val="2B2D3A"/>
-                <w:sz w:val="17"/>
-              </w:rPr>
-              <w:t>Weekly KPI reporting (impressions, CTR, conversions, revenue attribution)</w:t>
-            </w:r>
-          </w:p>
-          <w:p>
-            <w:pPr>
-              <w:spacing w:before="60" w:after="0"/>
-            </w:pPr>
-            <w:r>
-              <w:rPr>
-                <w:rFonts w:ascii="Calibri" w:hAnsi="Calibri"/>
-                <w:b/>
-                <w:i w:val="0"/>
-                <w:color w:val="2FF3C0"/>
-                <w:sz w:val="18"/>
-              </w:rPr>
-              <w:t xml:space="preserve">▸ </w:t>
-            </w:r>
-            <w:r>
-              <w:rPr>
-                <w:rFonts w:ascii="Calibri" w:hAnsi="Calibri"/>
-                <w:b/>
-                <w:i w:val="0"/>
-                <w:color w:val="2B2D3A"/>
-                <w:sz w:val="19"/>
-              </w:rPr>
-              <w:t>Digital Marketing Executive</w:t>
-            </w:r>
-            <w:r>
-              <w:rPr>
-                <w:rFonts w:ascii="Calibri" w:hAnsi="Calibri"/>
-                <w:b w:val="0"/>
-                <w:i w:val="0"/>
-                <w:color w:val="5A5D6E"/>
-                <w:sz w:val="17"/>
-              </w:rPr>
-              <w:t xml:space="preserve">   |   FAMA Technologies   </w:t>
-            </w:r>
-            <w:r>
-              <w:rPr>
-                <w:rFonts w:ascii="Calibri" w:hAnsi="Calibri"/>
-                <w:b w:val="0"/>
-                <w:i/>
-                <w:color w:val="5A5D6E"/>
-                <w:sz w:val="16"/>
-              </w:rPr>
-              <w:t>Feb 2021 – May 2022</w:t>
-            </w:r>
-          </w:p>
-          <w:p>
-            <w:pPr>
-              <w:spacing w:after="0"/>
-              <w:ind w:left="288"/>
-            </w:pPr>
-            <w:r>
-              <w:rPr>
-                <w:rFonts w:ascii="Calibri" w:hAnsi="Calibri"/>
-                <w:b/>
-                <w:i w:val="0"/>
-                <w:color w:val="2E86AB"/>
-                <w:sz w:val="17"/>
-              </w:rPr>
-              <w:t xml:space="preserve">• </w:t>
-            </w:r>
-            <w:r>
-              <w:rPr>
-                <w:rFonts w:ascii="Calibri" w:hAnsi="Calibri"/>
-                <w:b w:val="0"/>
-                <w:i w:val="0"/>
-                <w:color w:val="2B2D3A"/>
-                <w:sz w:val="17"/>
-              </w:rPr>
-              <w:t>Integrated SEO + PPC + content campaigns; A/B &amp; multivariate CRO testing</w:t>
-            </w:r>
-          </w:p>
-          <w:p>
-            <w:pPr>
-              <w:spacing w:after="0"/>
-              <w:ind w:left="288"/>
-            </w:pPr>
-            <w:r>
-              <w:rPr>
-                <w:rFonts w:ascii="Calibri" w:hAnsi="Calibri"/>
-                <w:b/>
-                <w:i w:val="0"/>
-                <w:color w:val="2E86AB"/>
-                <w:sz w:val="17"/>
-              </w:rPr>
-              <w:t xml:space="preserve">• </w:t>
-            </w:r>
-            <w:r>
-              <w:rPr>
-                <w:rFonts w:ascii="Calibri" w:hAnsi="Calibri"/>
-                <w:b w:val="0"/>
-                <w:i w:val="0"/>
-                <w:color w:val="2B2D3A"/>
-                <w:sz w:val="17"/>
-              </w:rPr>
-              <w:t>Technical SEO audits (crawl errors, speed, schema) fixed with dev</w:t>
-            </w:r>
-          </w:p>
-          <w:p>
-            <w:pPr>
-              <w:spacing w:before="60" w:after="0"/>
-            </w:pPr>
-            <w:r>
-              <w:rPr>
-                <w:rFonts w:ascii="Calibri" w:hAnsi="Calibri"/>
-                <w:b/>
-                <w:i w:val="0"/>
-                <w:color w:val="2FF3C0"/>
-                <w:sz w:val="18"/>
-              </w:rPr>
-              <w:t xml:space="preserve">▸ </w:t>
-            </w:r>
-            <w:r>
-              <w:rPr>
-                <w:rFonts w:ascii="Calibri" w:hAnsi="Calibri"/>
-                <w:b/>
-                <w:i w:val="0"/>
-                <w:color w:val="2B2D3A"/>
-                <w:sz w:val="19"/>
-              </w:rPr>
-              <w:t>Digital Marketing Executive</w:t>
-            </w:r>
-            <w:r>
-              <w:rPr>
-                <w:rFonts w:ascii="Calibri" w:hAnsi="Calibri"/>
-                <w:b w:val="0"/>
-                <w:i w:val="0"/>
-                <w:color w:val="5A5D6E"/>
-                <w:sz w:val="17"/>
-              </w:rPr>
-              <w:t xml:space="preserve">   |   E-Rad Imaging &amp; Reporting   </w:t>
-            </w:r>
-            <w:r>
-              <w:rPr>
-                <w:rFonts w:ascii="Calibri" w:hAnsi="Calibri"/>
-                <w:b w:val="0"/>
-                <w:i/>
-                <w:color w:val="5A5D6E"/>
-                <w:sz w:val="16"/>
-              </w:rPr>
-              <w:t>Jun 2019 – Sep 2020</w:t>
-            </w:r>
-          </w:p>
-          <w:p>
-            <w:pPr>
-              <w:spacing w:after="0"/>
-              <w:ind w:left="288"/>
-            </w:pPr>
-            <w:r>
-              <w:rPr>
-                <w:rFonts w:ascii="Calibri" w:hAnsi="Calibri"/>
-                <w:b/>
-                <w:i w:val="0"/>
-                <w:color w:val="2E86AB"/>
-                <w:sz w:val="17"/>
-              </w:rPr>
-              <w:t xml:space="preserve">• </w:t>
-            </w:r>
-            <w:r>
-              <w:rPr>
-                <w:rFonts w:ascii="Calibri" w:hAnsi="Calibri"/>
-                <w:b w:val="0"/>
-                <w:i w:val="0"/>
-                <w:color w:val="2B2D3A"/>
-                <w:sz w:val="17"/>
-              </w:rPr>
-              <w:t>End-to-end SEO: research, on-page, link building, monthly reporting</w:t>
-            </w:r>
-          </w:p>
-          <w:p>
-            <w:pPr>
-              <w:spacing w:before="60" w:after="0"/>
-            </w:pPr>
-            <w:r>
-              <w:rPr>
-                <w:rFonts w:ascii="Calibri" w:hAnsi="Calibri"/>
-                <w:b/>
-                <w:i w:val="0"/>
-                <w:color w:val="2FF3C0"/>
-                <w:sz w:val="18"/>
-              </w:rPr>
-              <w:t xml:space="preserve">▸ </w:t>
-            </w:r>
-            <w:r>
-              <w:rPr>
-                <w:rFonts w:ascii="Calibri" w:hAnsi="Calibri"/>
-                <w:b/>
-                <w:i w:val="0"/>
-                <w:color w:val="2B2D3A"/>
-                <w:sz w:val="19"/>
-              </w:rPr>
-              <w:t>SEO &amp; SMO Expert</w:t>
-            </w:r>
-            <w:r>
-              <w:rPr>
-                <w:rFonts w:ascii="Calibri" w:hAnsi="Calibri"/>
-                <w:b w:val="0"/>
-                <w:i w:val="0"/>
-                <w:color w:val="5A5D6E"/>
-                <w:sz w:val="17"/>
-              </w:rPr>
-              <w:t xml:space="preserve">   |   Promantra Synergies   </w:t>
-            </w:r>
-            <w:r>
-              <w:rPr>
-                <w:rFonts w:ascii="Calibri" w:hAnsi="Calibri"/>
-                <w:b w:val="0"/>
-                <w:i/>
-                <w:color w:val="5A5D6E"/>
-                <w:sz w:val="16"/>
-              </w:rPr>
-              <w:t>Nov 2017 – May 2019</w:t>
-            </w:r>
-          </w:p>
-          <w:p>
-            <w:pPr>
-              <w:spacing w:after="0"/>
-              <w:ind w:left="288"/>
-            </w:pPr>
-            <w:r>
-              <w:rPr>
-                <w:rFonts w:ascii="Calibri" w:hAnsi="Calibri"/>
-                <w:b/>
-                <w:i w:val="0"/>
-                <w:color w:val="2E86AB"/>
-                <w:sz w:val="17"/>
-              </w:rPr>
-              <w:t xml:space="preserve">• </w:t>
-            </w:r>
-            <w:r>
-              <w:rPr>
-                <w:rFonts w:ascii="Calibri" w:hAnsi="Calibri"/>
-                <w:b w:val="0"/>
-                <w:i w:val="0"/>
-                <w:color w:val="2B2D3A"/>
-                <w:sz w:val="17"/>
-              </w:rPr>
-              <w:t>SEO + social growth, content strategy, competitor benchmarking &amp; outreach</w:t>
-            </w:r>
-          </w:p>
-          <w:p>
-            <w:pPr>
-              <w:spacing w:before="60" w:after="0"/>
-            </w:pPr>
-            <w:r>
-              <w:rPr>
-                <w:rFonts w:ascii="Calibri" w:hAnsi="Calibri"/>
-                <w:b/>
-                <w:i w:val="0"/>
-                <w:color w:val="2FF3C0"/>
-                <w:sz w:val="18"/>
-              </w:rPr>
-              <w:t xml:space="preserve">▸ </w:t>
-            </w:r>
-            <w:r>
-              <w:rPr>
-                <w:rFonts w:ascii="Calibri" w:hAnsi="Calibri"/>
-                <w:b/>
-                <w:i w:val="0"/>
-                <w:color w:val="2B2D3A"/>
-                <w:sz w:val="19"/>
-              </w:rPr>
-              <w:t>SEO Executive</w:t>
-            </w:r>
-            <w:r>
-              <w:rPr>
-                <w:rFonts w:ascii="Calibri" w:hAnsi="Calibri"/>
-                <w:b w:val="0"/>
-                <w:i w:val="0"/>
-                <w:color w:val="5A5D6E"/>
-                <w:sz w:val="17"/>
-              </w:rPr>
-              <w:t xml:space="preserve">   |   Digital Way Soft   </w:t>
-            </w:r>
-            <w:r>
-              <w:rPr>
-                <w:rFonts w:ascii="Calibri" w:hAnsi="Calibri"/>
-                <w:b w:val="0"/>
-                <w:i/>
-                <w:color w:val="5A5D6E"/>
-                <w:sz w:val="16"/>
-              </w:rPr>
-              <w:t>Jan 2015 – Nov 2017</w:t>
-            </w:r>
-          </w:p>
-          <w:p>
-            <w:pPr>
-              <w:spacing w:after="0"/>
-              <w:ind w:left="288"/>
-            </w:pPr>
-            <w:r>
-              <w:rPr>
-                <w:rFonts w:ascii="Calibri" w:hAnsi="Calibri"/>
-                <w:b/>
-                <w:i w:val="0"/>
-                <w:color w:val="2E86AB"/>
-                <w:sz w:val="17"/>
-              </w:rPr>
-              <w:t xml:space="preserve">• </w:t>
-            </w:r>
-            <w:r>
-              <w:rPr>
-                <w:rFonts w:ascii="Calibri" w:hAnsi="Calibri"/>
-                <w:b w:val="0"/>
-                <w:i w:val="0"/>
-                <w:color w:val="2B2D3A"/>
-                <w:sz w:val="17"/>
-              </w:rPr>
-              <w:t>Technical, on-page &amp; off-page SEO across multiple client sites</w:t>
-            </w:r>
-          </w:p>
-          <w:p>
-            <w:pPr>
-              <w:spacing w:before="60" w:after="0"/>
-            </w:pPr>
-            <w:r>
-              <w:rPr>
-                <w:rFonts w:ascii="Calibri" w:hAnsi="Calibri"/>
-                <w:b/>
-                <w:i w:val="0"/>
-                <w:color w:val="2FF3C0"/>
-                <w:sz w:val="18"/>
-              </w:rPr>
-              <w:t xml:space="preserve">▸ </w:t>
-            </w:r>
-            <w:r>
-              <w:rPr>
-                <w:rFonts w:ascii="Calibri" w:hAnsi="Calibri"/>
-                <w:b/>
-                <w:i w:val="0"/>
-                <w:color w:val="2B2D3A"/>
-                <w:sz w:val="19"/>
-              </w:rPr>
-              <w:t>Software / Junior Test Engineer</w:t>
-            </w:r>
-            <w:r>
-              <w:rPr>
-                <w:rFonts w:ascii="Calibri" w:hAnsi="Calibri"/>
-                <w:b w:val="0"/>
-                <w:i w:val="0"/>
-                <w:color w:val="5A5D6E"/>
-                <w:sz w:val="17"/>
-              </w:rPr>
-              <w:t xml:space="preserve">   |   Ainslee &amp; Corbz Data   </w:t>
-            </w:r>
-            <w:r>
-              <w:rPr>
-                <w:rFonts w:ascii="Calibri" w:hAnsi="Calibri"/>
-                <w:b w:val="0"/>
-                <w:i/>
-                <w:color w:val="5A5D6E"/>
-                <w:sz w:val="16"/>
-              </w:rPr>
-              <w:t>May 2007 – Sep 2014</w:t>
-            </w:r>
-          </w:p>
-          <w:p>
-            <w:pPr>
-              <w:spacing w:after="0"/>
-              <w:ind w:left="288"/>
-            </w:pPr>
-            <w:r>
-              <w:rPr>
-                <w:rFonts w:ascii="Calibri" w:hAnsi="Calibri"/>
-                <w:b/>
-                <w:i w:val="0"/>
-                <w:color w:val="2E86AB"/>
-                <w:sz w:val="17"/>
-              </w:rPr>
-              <w:t xml:space="preserve">• </w:t>
-            </w:r>
-            <w:r>
-              <w:rPr>
-                <w:rFonts w:ascii="Calibri" w:hAnsi="Calibri"/>
-                <w:b w:val="0"/>
-                <w:i w:val="0"/>
-                <w:color w:val="2B2D3A"/>
-                <w:sz w:val="17"/>
-              </w:rPr>
-              <w:t>QA foundation — the root-cause discipline behind my data-first marketing</w:t>
-            </w:r>
-          </w:p>
-          <w:p>
-            <w:pPr>
-              <w:spacing w:before="80" w:after="40"/>
-              <w:pBdr>
-                <w:bottom w:val="single" w:sz="8" w:space="2" w:color="2E86AB"/>
-              </w:pBdr>
-            </w:pPr>
-            <w:r>
-              <w:rPr>
-                <w:rFonts w:ascii="Calibri" w:hAnsi="Calibri"/>
-                <w:b/>
-                <w:i w:val="0"/>
-                <w:color w:val="2E86AB"/>
-                <w:sz w:val="22"/>
-              </w:rPr>
-              <w:t>LIVE PRODUCTS — SCAN &amp; TRY THEM</w:t>
-            </w:r>
-          </w:p>
-          <w:tbl>
-            <w:tblPr>
-              <w:tblW w:type="auto" w:w="0"/>
-              <w:tblLook w:firstColumn="1" w:firstRow="1" w:lastColumn="0" w:lastRow="0" w:noHBand="0" w:noVBand="1" w:val="04A0"/>
-              <w:tblBorders>
-                <w:top w:val="none"/>
-                <w:left w:val="none"/>
-                <w:bottom w:val="none"/>
-                <w:right w:val="none"/>
-                <w:insideH w:val="none"/>
-                <w:insideV w:val="none"/>
-              </w:tblBorders>
-            </w:tblPr>
-            <w:tblGrid>
-              <w:gridCol w:w="2664"/>
-              <w:gridCol w:w="2664"/>
-            </w:tblGrid>
-            <w:tr>
-              <w:tc>
-                <w:tcPr>
-                  <w:tcW w:type="dxa" w:w="1368"/>
-                  <w:tcMar>
-                    <w:top w:w="20" w:type="dxa"/>
-                    <w:bottom w:w="20" w:type="dxa"/>
-                    <w:left w:w="20" w:type="dxa"/>
-                    <w:right w:w="40" w:type="dxa"/>
-                  </w:tcMar>
-                </w:tcPr>
-                <w:p>
-                  <w:pPr>
-                    <w:spacing w:after="0"/>
-                  </w:pPr>
-                  <w:r>
-                    <w:drawing>
-                      <wp:inline xmlns:a="http://schemas.openxmlformats.org/drawingml/2006/main" xmlns:pic="http://schemas.openxmlformats.org/drawingml/2006/picture">
-                        <wp:extent cx="822960" cy="822960"/>
-                        <wp:docPr id="1" name="Picture 1"/>
-                        <wp:cNvGraphicFramePr>
-                          <a:graphicFrameLocks noChangeAspect="1"/>
-                        </wp:cNvGraphicFramePr>
-                        <a:graphic>
-                          <a:graphicData uri="http://schemas.openxmlformats.org/drawingml/2006/picture">
-                            <pic:pic>
-                              <pic:nvPicPr>
-                                <pic:cNvPr id="0" name="hookai.png"/>
-                                <pic:cNvPicPr/>
-                              </pic:nvPicPr>
-                              <pic:blipFill>
-                                <a:blip r:embed="rId9"/>
-                                <a:stretch>
-                                  <a:fillRect/>
-                                </a:stretch>
-                              </pic:blipFill>
-                              <pic:spPr>
-                                <a:xfrm>
-                                  <a:off x="0" y="0"/>
-                                  <a:ext cx="822960" cy="822960"/>
-                                </a:xfrm>
-                                <a:prstGeom prst="rect"/>
-                              </pic:spPr>
-                            </pic:pic>
-                          </a:graphicData>
-                        </a:graphic>
-                      </wp:inline>
-                    </w:drawing>
-                  </w:r>
-                </w:p>
-              </w:tc>
-              <w:tc>
-                <w:tcPr>
-                  <w:tcW w:type="dxa" w:w="6048"/>
-                  <w:tcMar>
-                    <w:top w:w="40" w:type="dxa"/>
-                    <w:bottom w:w="20" w:type="dxa"/>
-                    <w:left w:w="40" w:type="dxa"/>
-                    <w:right w:w="20" w:type="dxa"/>
-                  </w:tcMar>
-                </w:tcPr>
-                <w:p>
-                  <w:pPr>
-                    <w:spacing w:after="0"/>
-                  </w:pPr>
-                  <w:r>
-                    <w:rPr>
-                      <w:rFonts w:ascii="Calibri" w:hAnsi="Calibri"/>
-                      <w:b/>
-                      <w:i w:val="0"/>
-                      <w:color w:val="2B2D3A"/>
-                      <w:sz w:val="19"/>
-                    </w:rPr>
-                    <w:t>Hook AI</w:t>
-                  </w:r>
-                </w:p>
-                <w:p>
-                  <w:pPr>
-                    <w:spacing w:after="0"/>
-                  </w:pPr>
-                  <w:r>
-                    <w:rPr>
-                      <w:rFonts w:ascii="Calibri" w:hAnsi="Calibri"/>
-                      <w:b w:val="0"/>
-                      <w:i w:val="0"/>
-                      <w:color w:val="5A5D6E"/>
-                      <w:sz w:val="16"/>
-                    </w:rPr>
-                    <w:t>Marketing copy engine — 15+ niches, SEO program, A/B hero testing</w:t>
-                  </w:r>
-                </w:p>
-                <w:p>
-                  <w:pPr>
-                    <w:spacing w:after="80"/>
-                  </w:pPr>
-                  <w:r>
-                    <w:rPr>
-                      <w:rFonts w:ascii="Calibri" w:hAnsi="Calibri"/>
-                      <w:b/>
-                      <w:i w:val="0"/>
-                      <w:color w:val="2E86AB"/>
-                      <w:sz w:val="15"/>
-                    </w:rPr>
-                    <w:t>hook-ai-marketing-engine.vercel.app</w:t>
-                  </w:r>
-                </w:p>
-              </w:tc>
-            </w:tr>
-          </w:tbl>
-          <w:p/>
-          <w:tbl>
-            <w:tblPr>
-              <w:tblW w:type="auto" w:w="0"/>
-              <w:tblLook w:firstColumn="1" w:firstRow="1" w:lastColumn="0" w:lastRow="0" w:noHBand="0" w:noVBand="1" w:val="04A0"/>
-              <w:tblBorders>
-                <w:top w:val="none"/>
-                <w:left w:val="none"/>
-                <w:bottom w:val="none"/>
-                <w:right w:val="none"/>
-                <w:insideH w:val="none"/>
-                <w:insideV w:val="none"/>
-              </w:tblBorders>
-            </w:tblPr>
-            <w:tblGrid>
-              <w:gridCol w:w="2664"/>
-              <w:gridCol w:w="2664"/>
-            </w:tblGrid>
-            <w:tr>
-              <w:tc>
-                <w:tcPr>
-                  <w:tcW w:type="dxa" w:w="1368"/>
-                  <w:tcMar>
-                    <w:top w:w="20" w:type="dxa"/>
-                    <w:bottom w:w="20" w:type="dxa"/>
-                    <w:left w:w="20" w:type="dxa"/>
-                    <w:right w:w="40" w:type="dxa"/>
-                  </w:tcMar>
-                </w:tcPr>
-                <w:p>
-                  <w:pPr>
-                    <w:spacing w:after="0"/>
-                  </w:pPr>
-                  <w:r>
-                    <w:drawing>
-                      <wp:inline xmlns:a="http://schemas.openxmlformats.org/drawingml/2006/main" xmlns:pic="http://schemas.openxmlformats.org/drawingml/2006/picture">
-                        <wp:extent cx="822960" cy="822960"/>
-                        <wp:docPr id="2" name="Picture 2"/>
-                        <wp:cNvGraphicFramePr>
-                          <a:graphicFrameLocks noChangeAspect="1"/>
-                        </wp:cNvGraphicFramePr>
-                        <a:graphic>
-                          <a:graphicData uri="http://schemas.openxmlformats.org/drawingml/2006/picture">
-                            <pic:pic>
-                              <pic:nvPicPr>
-                                <pic:cNvPr id="0" name="creative.png"/>
-                                <pic:cNvPicPr/>
-                              </pic:nvPicPr>
-                              <pic:blipFill>
-                                <a:blip r:embed="rId10"/>
-                                <a:stretch>
-                                  <a:fillRect/>
-                                </a:stretch>
-                              </pic:blipFill>
-                              <pic:spPr>
-                                <a:xfrm>
-                                  <a:off x="0" y="0"/>
-                                  <a:ext cx="822960" cy="822960"/>
-                                </a:xfrm>
-                                <a:prstGeom prst="rect"/>
-                              </pic:spPr>
-                            </pic:pic>
-                          </a:graphicData>
-                        </a:graphic>
-                      </wp:inline>
-                    </w:drawing>
-                  </w:r>
-                </w:p>
-              </w:tc>
-              <w:tc>
-                <w:tcPr>
-                  <w:tcW w:type="dxa" w:w="6048"/>
-                  <w:tcMar>
-                    <w:top w:w="40" w:type="dxa"/>
-                    <w:bottom w:w="20" w:type="dxa"/>
-                    <w:left w:w="40" w:type="dxa"/>
-                    <w:right w:w="20" w:type="dxa"/>
-                  </w:tcMar>
-                </w:tcPr>
-                <w:p>
-                  <w:pPr>
-                    <w:spacing w:after="0"/>
-                  </w:pPr>
-                  <w:r>
-                    <w:rPr>
-                      <w:rFonts w:ascii="Calibri" w:hAnsi="Calibri"/>
-                      <w:b/>
-                      <w:i w:val="0"/>
-                      <w:color w:val="2B2D3A"/>
-                      <w:sz w:val="19"/>
-                    </w:rPr>
-                    <w:t>Creative Predictor</w:t>
-                  </w:r>
-                </w:p>
-                <w:p>
-                  <w:pPr>
-                    <w:spacing w:after="0"/>
-                  </w:pPr>
-                  <w:r>
-                    <w:rPr>
-                      <w:rFonts w:ascii="Calibri" w:hAnsi="Calibri"/>
-                      <w:b w:val="0"/>
-                      <w:i w:val="0"/>
-                      <w:color w:val="5A5D6E"/>
-                      <w:sz w:val="16"/>
-                    </w:rPr>
-                    <w:t>Ad &amp; CRO suite — predicts CTR/ROAS, 20+ modules, v13.0</w:t>
-                  </w:r>
-                </w:p>
-                <w:p>
-                  <w:pPr>
-                    <w:spacing w:after="80"/>
-                  </w:pPr>
-                  <w:r>
-                    <w:rPr>
-                      <w:rFonts w:ascii="Calibri" w:hAnsi="Calibri"/>
-                      <w:b/>
-                      <w:i w:val="0"/>
-                      <w:color w:val="2E86AB"/>
-                      <w:sz w:val="15"/>
-                    </w:rPr>
-                    <w:t>mvamshi56-creative-predictor.static.hf.space</w:t>
-                  </w:r>
-                </w:p>
-              </w:tc>
-            </w:tr>
-          </w:tbl>
-          <w:p/>
-          <w:tbl>
-            <w:tblPr>
-              <w:tblW w:type="auto" w:w="0"/>
-              <w:tblLook w:firstColumn="1" w:firstRow="1" w:lastColumn="0" w:lastRow="0" w:noHBand="0" w:noVBand="1" w:val="04A0"/>
-              <w:tblBorders>
-                <w:top w:val="none"/>
-                <w:left w:val="none"/>
-                <w:bottom w:val="none"/>
-                <w:right w:val="none"/>
-                <w:insideH w:val="none"/>
-                <w:insideV w:val="none"/>
-              </w:tblBorders>
-            </w:tblPr>
-            <w:tblGrid>
-              <w:gridCol w:w="2664"/>
-              <w:gridCol w:w="2664"/>
-            </w:tblGrid>
-            <w:tr>
-              <w:tc>
-                <w:tcPr>
-                  <w:tcW w:type="dxa" w:w="1368"/>
-                  <w:tcMar>
-                    <w:top w:w="20" w:type="dxa"/>
-                    <w:bottom w:w="20" w:type="dxa"/>
-                    <w:left w:w="20" w:type="dxa"/>
-                    <w:right w:w="40" w:type="dxa"/>
-                  </w:tcMar>
-                </w:tcPr>
-                <w:p>
-                  <w:pPr>
-                    <w:spacing w:after="0"/>
-                  </w:pPr>
-                  <w:r>
-                    <w:drawing>
-                      <wp:inline xmlns:a="http://schemas.openxmlformats.org/drawingml/2006/main" xmlns:pic="http://schemas.openxmlformats.org/drawingml/2006/picture">
-                        <wp:extent cx="822960" cy="822960"/>
-                        <wp:docPr id="3" name="Picture 3"/>
-                        <wp:cNvGraphicFramePr>
-                          <a:graphicFrameLocks noChangeAspect="1"/>
-                        </wp:cNvGraphicFramePr>
-                        <a:graphic>
-                          <a:graphicData uri="http://schemas.openxmlformats.org/drawingml/2006/picture">
-                            <pic:pic>
-                              <pic:nvPicPr>
-                                <pic:cNvPr id="0" name="strategy.png"/>
-                                <pic:cNvPicPr/>
-                              </pic:nvPicPr>
-                              <pic:blipFill>
-                                <a:blip r:embed="rId11"/>
-                                <a:stretch>
-                                  <a:fillRect/>
-                                </a:stretch>
-                              </pic:blipFill>
-                              <pic:spPr>
-                                <a:xfrm>
-                                  <a:off x="0" y="0"/>
-                                  <a:ext cx="822960" cy="822960"/>
-                                </a:xfrm>
-                                <a:prstGeom prst="rect"/>
-                              </pic:spPr>
-                            </pic:pic>
-                          </a:graphicData>
-                        </a:graphic>
-                      </wp:inline>
-                    </w:drawing>
-                  </w:r>
-                </w:p>
-              </w:tc>
-              <w:tc>
-                <w:tcPr>
-                  <w:tcW w:type="dxa" w:w="6048"/>
-                  <w:tcMar>
-                    <w:top w:w="40" w:type="dxa"/>
-                    <w:bottom w:w="20" w:type="dxa"/>
-                    <w:left w:w="40" w:type="dxa"/>
-                    <w:right w:w="20" w:type="dxa"/>
-                  </w:tcMar>
-                </w:tcPr>
-                <w:p>
-                  <w:pPr>
-                    <w:spacing w:after="0"/>
-                  </w:pPr>
-                  <w:r>
-                    <w:rPr>
-                      <w:rFonts w:ascii="Calibri" w:hAnsi="Calibri"/>
-                      <w:b/>
-                      <w:i w:val="0"/>
-                      <w:color w:val="2B2D3A"/>
-                      <w:sz w:val="19"/>
-                    </w:rPr>
-                    <w:t>Growth Strategy Gen</w:t>
-                  </w:r>
-                </w:p>
-                <w:p>
-                  <w:pPr>
-                    <w:spacing w:after="0"/>
-                  </w:pPr>
-                  <w:r>
-                    <w:rPr>
-                      <w:rFonts w:ascii="Calibri" w:hAnsi="Calibri"/>
-                      <w:b w:val="0"/>
-                      <w:i w:val="0"/>
-                      <w:color w:val="5A5D6E"/>
-                      <w:sz w:val="16"/>
-                    </w:rPr>
-                    <w:t>Budget-optimized funnel strategies from real inputs</w:t>
-                  </w:r>
-                </w:p>
-                <w:p>
-                  <w:pPr>
-                    <w:spacing w:after="80"/>
-                  </w:pPr>
-                  <w:r>
-                    <w:rPr>
-                      <w:rFonts w:ascii="Calibri" w:hAnsi="Calibri"/>
-                      <w:b/>
-                      <w:i w:val="0"/>
-                      <w:color w:val="2E86AB"/>
-                      <w:sz w:val="15"/>
-                    </w:rPr>
-                    <w:t>strategy-generator-kwdf-beta.vercel.app</w:t>
-                  </w:r>
-                </w:p>
-              </w:tc>
-            </w:tr>
-          </w:tbl>
-          <w:p/>
-          <w:p>
-            <w:pPr>
-              <w:spacing w:before="120" w:after="0"/>
-              <w:jc w:val="center"/>
-            </w:pPr>
-            <w:r>
-              <w:rPr>
-                <w:rFonts w:ascii="Calibri" w:hAnsi="Calibri"/>
-                <w:b w:val="0"/>
-                <w:i/>
-                <w:color w:val="5A5D6E"/>
-                <w:sz w:val="17"/>
-              </w:rPr>
-              <w:t>—  I build what I market. Scan a product and watch it work.  —</w:t>
-            </w:r>
-          </w:p>
-        </w:tc>
-      </w:tr>
-    </w:tbl>
     <w:p>
       <w:pPr>
-        <w:spacing w:after="200" w:before="0"/>
-        <w:jc w:val="center"/>
+        <w:spacing w:before="0" w:after="20"/>
+      </w:pPr>
+      <w:r>
+        <w:rPr>
+          <w:b/>
+          <w:i w:val="0"/>
+          <w:color w:val="1F3364"/>
+          <w:sz w:val="44"/>
+        </w:rPr>
+        <w:t>VAMSHIDHAR REDDY M</w:t>
+      </w:r>
+    </w:p>
+    <w:p>
+      <w:pPr>
+        <w:spacing w:before="0" w:after="40"/>
+      </w:pPr>
+      <w:r>
+        <w:rPr>
+          <w:b/>
+          <w:i w:val="0"/>
+          <w:color w:val="1A1A1A"/>
+          <w:sz w:val="25"/>
+        </w:rPr>
+        <w:t>AI-Powered Digital Marketing Specialist</w:t>
+      </w:r>
+    </w:p>
+    <w:p>
+      <w:pPr>
+        <w:spacing w:before="0" w:after="60"/>
+      </w:pPr>
+      <w:r>
+        <w:rPr>
+          <w:b w:val="0"/>
+          <w:i w:val="0"/>
+          <w:color w:val="4A4A55"/>
+          <w:sz w:val="19"/>
+        </w:rPr>
+        <w:t>SEO | PPC | AI Automation | Content Strategy | Analytics &amp; Reporting</w:t>
+      </w:r>
+    </w:p>
+    <w:p>
+      <w:pPr>
+        <w:spacing w:before="0" w:after="20"/>
+      </w:pPr>
+      <w:r>
+        <w:rPr>
+          <w:b w:val="0"/>
+          <w:i w:val="0"/>
+          <w:color w:val="1A1A1A"/>
+          <w:sz w:val="19"/>
+        </w:rPr>
+        <w:t>Hyderabad, India | +91-7981719085 | geovamshidhar@gmail.com</w:t>
+      </w:r>
+    </w:p>
+    <w:p>
+      <w:pPr>
+        <w:spacing w:before="0" w:after="60"/>
+      </w:pPr>
+      <w:r>
+        <w:rPr>
+          <w:b w:val="0"/>
+          <w:i w:val="0"/>
+          <w:color w:val="1A1A1A"/>
+          <w:sz w:val="19"/>
+        </w:rPr>
+        <w:t>linkedin.com/in/vamshidharreddym | github.com/gitvamshidhar-m | vamshidhar-ai.netlify.app</w:t>
+      </w:r>
+    </w:p>
+    <w:p>
+      <w:pPr>
+        <w:spacing w:before="0" w:after="120"/>
+      </w:pPr>
+      <w:r>
+        <w:rPr>
+          <w:b/>
+          <w:i w:val="0"/>
+          <w:color w:val="1F3364"/>
+          <w:sz w:val="19"/>
+        </w:rPr>
+        <w:t>8+ Yrs Experience | 15% Organic Traffic | Page-1 Rankings | 70+ Leads/month | Rs.2L+ Ad Spend Managed</w:t>
+      </w:r>
+    </w:p>
+    <w:p>
+      <w:pPr>
+        <w:spacing w:before="160" w:after="60"/>
+        <w:pBdr>
+          <w:bottom w:val="single" w:sz="6" w:space="2" w:color="1F3364"/>
+        </w:pBdr>
+      </w:pPr>
+      <w:r>
+        <w:rPr>
+          <w:b/>
+          <w:color w:val="1F3364"/>
+          <w:sz w:val="24"/>
+        </w:rPr>
+        <w:t>PROFILE</w:t>
+      </w:r>
+    </w:p>
+    <w:p>
+      <w:pPr>
+        <w:spacing w:before="0" w:after="60"/>
+      </w:pPr>
+      <w:r>
+        <w:rPr>
+          <w:b w:val="0"/>
+          <w:i w:val="0"/>
+          <w:color w:val="1A1A1A"/>
+          <w:sz w:val="20"/>
+        </w:rPr>
+        <w:t>AI-Powered Digital Marketing Specialist who turns 8+ years of SEO, PPC, and content expertise into measurable revenue growth: 15% organic traffic growth, first-page Google rankings, and 70+ qualified leads per month while managing Rs.2,00,000+ in monthly ad spend. Self-taught in Generative AI, with live products shipped SOLO on GitHub - a rare hybrid of marketing instinct and hands-on engineering with OpenAI API, Gemini AI, and AI agent design.</w:t>
+      </w:r>
+    </w:p>
+    <w:p>
+      <w:pPr>
+        <w:spacing w:before="0" w:after="80"/>
+      </w:pPr>
+      <w:r>
+        <w:rPr>
+          <w:b/>
+          <w:i w:val="0"/>
+          <w:color w:val="1F3364"/>
+          <w:sz w:val="19"/>
+        </w:rPr>
+        <w:t>Profitable Growth | High-Converting Copy &amp; SEO | Data-Driven A/B Optimization | AI-Augmented Workflows</w:t>
+      </w:r>
+    </w:p>
+    <w:p>
+      <w:pPr>
+        <w:spacing w:before="160" w:after="60"/>
+        <w:pBdr>
+          <w:bottom w:val="single" w:sz="6" w:space="2" w:color="1F3364"/>
+        </w:pBdr>
+      </w:pPr>
+      <w:r>
+        <w:rPr>
+          <w:b/>
+          <w:color w:val="1F3364"/>
+          <w:sz w:val="24"/>
+        </w:rPr>
+        <w:t>PROFESSIONAL EXPERIENCE</w:t>
+      </w:r>
+    </w:p>
+    <w:p>
+      <w:pPr>
+        <w:spacing w:before="100" w:after="20"/>
+      </w:pPr>
+      <w:r>
+        <w:rPr>
+          <w:b/>
+          <w:color w:val="1A1A1A"/>
+          <w:sz w:val="21"/>
+        </w:rPr>
+        <w:t>DIGITAL MARKETING SPECIALIST   |   Autozilla Software Solutions Pvt Ltd</w:t>
+      </w:r>
+    </w:p>
+    <w:p>
+      <w:pPr>
+        <w:spacing w:after="40"/>
       </w:pPr>
       <w:r>
         <w:rPr>
           <w:i/>
-          <w:color w:val="C9CBDE"/>
+          <w:color w:val="4A4A55"/>
           <w:sz w:val="18"/>
         </w:rPr>
-        <w:t>8+ years turning</w:t>
-        <w:br/>
-        <w:t>clicks into revenue.</w:t>
+        <w:t>May 2023 - Present   |   Hyderabad, India</w:t>
       </w:r>
     </w:p>
     <w:p>
       <w:pPr>
-        <w:spacing w:after="40" w:before="120"/>
-        <w:pBdr>
-          <w:bottom w:val="single" w:sz="4" w:space="2" w:color="2F3C50"/>
-        </w:pBdr>
+        <w:spacing w:after="20"/>
+        <w:ind w:left="317" w:hanging="202"/>
       </w:pPr>
       <w:r>
         <w:rPr>
-          <w:rFonts w:ascii="Calibri" w:hAnsi="Calibri"/>
           <w:b/>
-          <w:i w:val="0"/>
-          <w:color w:val="2FF3C0"/>
-          <w:sz w:val="19"/>
+          <w:color w:val="1F3364"/>
         </w:rPr>
-        <w:t>CONTACT</w:t>
+        <w:t xml:space="preserve">• </w:t>
+      </w:r>
+      <w:r>
+        <w:t>Grew organic website traffic by 15% through SEO audits, keyword gap analysis, content optimization, and technical issue resolution</w:t>
       </w:r>
     </w:p>
     <w:p>
       <w:pPr>
-        <w:spacing w:after="20" w:before="0"/>
+        <w:spacing w:after="20"/>
+        <w:ind w:left="317" w:hanging="202"/>
       </w:pPr>
       <w:r>
         <w:rPr>
-          <w:color w:val="2FF3C0"/>
-          <w:sz w:val="16"/>
+          <w:b/>
+          <w:color w:val="1F3364"/>
         </w:rPr>
-        <w:t xml:space="preserve">📍  </w:t>
+        <w:t xml:space="preserve">• </w:t>
+      </w:r>
+      <w:r>
+        <w:t>Secured page-1 Google rankings for high-value competitive keywords, lifting qualified inbound traffic</w:t>
+      </w:r>
+    </w:p>
+    <w:p>
+      <w:pPr>
+        <w:spacing w:after="20"/>
+        <w:ind w:left="317" w:hanging="202"/>
+      </w:pPr>
+      <w:r>
+        <w:rPr>
+          <w:b/>
+          <w:color w:val="1F3364"/>
+        </w:rPr>
+        <w:t xml:space="preserve">• </w:t>
+      </w:r>
+      <w:r>
+        <w:t>Generated 70+ qualified leads per month by aligning SEO, Google Ads, and landing pages into one conversion funnel</w:t>
+      </w:r>
+    </w:p>
+    <w:p>
+      <w:pPr>
+        <w:spacing w:after="20"/>
+        <w:ind w:left="317" w:hanging="202"/>
+      </w:pPr>
+      <w:r>
+        <w:rPr>
+          <w:b/>
+          <w:color w:val="1F3364"/>
+        </w:rPr>
+        <w:t xml:space="preserve">• </w:t>
+      </w:r>
+      <w:r>
+        <w:t>Managed Google Ads budgets exceeding Rs.2,00,000 per month, optimizing cost-per-lead and return on ad spend</w:t>
+      </w:r>
+    </w:p>
+    <w:p>
+      <w:pPr>
+        <w:spacing w:after="20"/>
+        <w:ind w:left="317" w:hanging="202"/>
+      </w:pPr>
+      <w:r>
+        <w:rPr>
+          <w:b/>
+          <w:color w:val="1F3364"/>
+        </w:rPr>
+        <w:t xml:space="preserve">• </w:t>
+      </w:r>
+      <w:r>
+        <w:t>Built AI-assisted content workflows with Generative AI to accelerate production and improve search relevance</w:t>
+      </w:r>
+    </w:p>
+    <w:p>
+      <w:pPr>
+        <w:spacing w:after="20"/>
+        <w:ind w:left="317" w:hanging="202"/>
+      </w:pPr>
+      <w:r>
+        <w:rPr>
+          <w:b/>
+          <w:color w:val="1F3364"/>
+        </w:rPr>
+        <w:t xml:space="preserve">• </w:t>
+      </w:r>
+      <w:r>
+        <w:t>Delivered performance dashboards and actionable insights in GA4 and Looker Studio</w:t>
+      </w:r>
+    </w:p>
+    <w:p>
+      <w:pPr>
+        <w:spacing w:after="20"/>
+        <w:ind w:left="317" w:hanging="202"/>
+      </w:pPr>
+      <w:r>
+        <w:rPr>
+          <w:b/>
+          <w:color w:val="1F3364"/>
+        </w:rPr>
+        <w:t xml:space="preserve">• </w:t>
+      </w:r>
+      <w:r>
+        <w:t>Ran A/B tests on landing pages, ad copy, and CTAs, applying findings to lift conversion rates</w:t>
+      </w:r>
+    </w:p>
+    <w:p>
+      <w:pPr>
+        <w:spacing w:after="20"/>
+        <w:ind w:left="317" w:hanging="202"/>
+      </w:pPr>
+      <w:r>
+        <w:rPr>
+          <w:b/>
+          <w:color w:val="1F3364"/>
+        </w:rPr>
+        <w:t xml:space="preserve">• </w:t>
+      </w:r>
+      <w:r>
+        <w:t>Performed competitor analysis and search-intent mapping to find ranking opportunities and content gaps</w:t>
+      </w:r>
+    </w:p>
+    <w:p>
+      <w:pPr>
+        <w:spacing w:before="100" w:after="20"/>
+      </w:pPr>
+      <w:r>
+        <w:rPr>
+          <w:b/>
+          <w:color w:val="1A1A1A"/>
+          <w:sz w:val="21"/>
+        </w:rPr>
+        <w:t>CAMPAIGN SPECIALIST   |   Pranathi Software Services Pvt Ltd</w:t>
+      </w:r>
+    </w:p>
+    <w:p>
+      <w:pPr>
+        <w:spacing w:after="40"/>
+      </w:pPr>
+      <w:r>
+        <w:rPr>
+          <w:i/>
+          <w:color w:val="4A4A55"/>
+          <w:sz w:val="18"/>
+        </w:rPr>
+        <w:t>Jun 2022 - May 2023   |   Hyderabad, India</w:t>
+      </w:r>
+    </w:p>
+    <w:p>
+      <w:pPr>
+        <w:spacing w:after="20"/>
+        <w:ind w:left="317" w:hanging="202"/>
+      </w:pPr>
+      <w:r>
+        <w:rPr>
+          <w:b/>
+          <w:color w:val="1F3364"/>
+        </w:rPr>
+        <w:t xml:space="preserve">• </w:t>
+      </w:r>
+      <w:r>
+        <w:t>Managed SEO, PPC, and paid social across multiple client accounts, raising quality scores and cutting CPCs</w:t>
+      </w:r>
+    </w:p>
+    <w:p>
+      <w:pPr>
+        <w:spacing w:after="20"/>
+        <w:ind w:left="317" w:hanging="202"/>
+      </w:pPr>
+      <w:r>
+        <w:rPr>
+          <w:b/>
+          <w:color w:val="1F3364"/>
+        </w:rPr>
+        <w:t xml:space="preserve">• </w:t>
+      </w:r>
+      <w:r>
+        <w:t>Planned LinkedIn Ads for B2B lead generation, targeting by industry, job title, and seniority</w:t>
+      </w:r>
+    </w:p>
+    <w:p>
+      <w:pPr>
+        <w:spacing w:after="20"/>
+        <w:ind w:left="317" w:hanging="202"/>
+      </w:pPr>
+      <w:r>
+        <w:rPr>
+          <w:b/>
+          <w:color w:val="1F3364"/>
+        </w:rPr>
+        <w:t xml:space="preserve">• </w:t>
+      </w:r>
+      <w:r>
+        <w:t>Optimized bids, audiences, and schedules to improve ROAS and cut wasted spend</w:t>
+      </w:r>
+    </w:p>
+    <w:p>
+      <w:pPr>
+        <w:spacing w:after="20"/>
+        <w:ind w:left="317" w:hanging="202"/>
+      </w:pPr>
+      <w:r>
+        <w:rPr>
+          <w:b/>
+          <w:color w:val="1F3364"/>
+        </w:rPr>
+        <w:t xml:space="preserve">• </w:t>
+      </w:r>
+      <w:r>
+        <w:t>Built weekly KPI reports on impressions, CTR, conversions, and revenue attribution</w:t>
+      </w:r>
+    </w:p>
+    <w:p>
+      <w:pPr>
+        <w:spacing w:after="20"/>
+        <w:ind w:left="317" w:hanging="202"/>
+      </w:pPr>
+      <w:r>
+        <w:rPr>
+          <w:b/>
+          <w:color w:val="1F3364"/>
+        </w:rPr>
+        <w:t xml:space="preserve">• </w:t>
+      </w:r>
+      <w:r>
+        <w:t>Identified underperforming campaigns in GA and applied fixes that improved click-throughs and conversions</w:t>
+      </w:r>
+    </w:p>
+    <w:p>
+      <w:pPr>
+        <w:spacing w:before="100" w:after="20"/>
+      </w:pPr>
+      <w:r>
+        <w:rPr>
+          <w:b/>
+          <w:color w:val="1A1A1A"/>
+          <w:sz w:val="21"/>
+        </w:rPr>
+        <w:t>DIGITAL MARKETING EXECUTIVE   |   FAMA Technologies</w:t>
+      </w:r>
+    </w:p>
+    <w:p>
+      <w:pPr>
+        <w:spacing w:after="40"/>
+      </w:pPr>
+      <w:r>
+        <w:rPr>
+          <w:i/>
+          <w:color w:val="4A4A55"/>
+          <w:sz w:val="18"/>
+        </w:rPr>
+        <w:t>Feb 2021 - May 2022   |   Hyderabad, India</w:t>
+      </w:r>
+    </w:p>
+    <w:p>
+      <w:pPr>
+        <w:spacing w:after="20"/>
+        <w:ind w:left="317" w:hanging="202"/>
+      </w:pPr>
+      <w:r>
+        <w:rPr>
+          <w:b/>
+          <w:color w:val="1F3364"/>
+        </w:rPr>
+        <w:t xml:space="preserve">• </w:t>
+      </w:r>
+      <w:r>
+        <w:t>Planned integrated SEO, PPC, and content campaigns that raised organic sessions and inbound enquiries</w:t>
+      </w:r>
+    </w:p>
+    <w:p>
+      <w:pPr>
+        <w:spacing w:after="20"/>
+        <w:ind w:left="317" w:hanging="202"/>
+      </w:pPr>
+      <w:r>
+        <w:rPr>
+          <w:b/>
+          <w:color w:val="1F3364"/>
+        </w:rPr>
+        <w:t xml:space="preserve">• </w:t>
+      </w:r>
+      <w:r>
+        <w:t>Ran A/B and multivariate tests on landing pages and creatives, driving CRO improvements</w:t>
+      </w:r>
+    </w:p>
+    <w:p>
+      <w:pPr>
+        <w:spacing w:after="20"/>
+        <w:ind w:left="317" w:hanging="202"/>
+      </w:pPr>
+      <w:r>
+        <w:rPr>
+          <w:b/>
+          <w:color w:val="1F3364"/>
+        </w:rPr>
+        <w:t xml:space="preserve">• </w:t>
+      </w:r>
+      <w:r>
+        <w:t>Conducted technical SEO audits (crawl errors, page speed, schema gaps) and coordinated fixes with dev</w:t>
+      </w:r>
+    </w:p>
+    <w:p>
+      <w:pPr>
+        <w:spacing w:after="20"/>
+        <w:ind w:left="317" w:hanging="202"/>
+      </w:pPr>
+      <w:r>
+        <w:rPr>
+          <w:b/>
+          <w:color w:val="1F3364"/>
+        </w:rPr>
+        <w:t xml:space="preserve">• </w:t>
+      </w:r>
+      <w:r>
+        <w:t>Built search-intent-aligned content to grow topical authority and rankings</w:t>
+      </w:r>
+    </w:p>
+    <w:p>
+      <w:pPr>
+        <w:spacing w:before="100" w:after="20"/>
+      </w:pPr>
+      <w:r>
+        <w:rPr>
+          <w:b/>
+          <w:color w:val="1A1A1A"/>
+          <w:sz w:val="21"/>
+        </w:rPr>
+        <w:t>DIGITAL MARKETING EXECUTIVE   |   E-Rad Imaging &amp; Reporting Services Pvt Ltd</w:t>
+      </w:r>
+    </w:p>
+    <w:p>
+      <w:pPr>
+        <w:spacing w:after="40"/>
+      </w:pPr>
+      <w:r>
+        <w:rPr>
+          <w:i/>
+          <w:color w:val="4A4A55"/>
+          <w:sz w:val="18"/>
+        </w:rPr>
+        <w:t>Jun 2019 - Sep 2020   |   Hyderabad, India</w:t>
+      </w:r>
+    </w:p>
+    <w:p>
+      <w:pPr>
+        <w:spacing w:after="20"/>
+        <w:ind w:left="317" w:hanging="202"/>
+      </w:pPr>
+      <w:r>
+        <w:rPr>
+          <w:b/>
+          <w:color w:val="1F3364"/>
+        </w:rPr>
+        <w:t xml:space="preserve">• </w:t>
+      </w:r>
+      <w:r>
+        <w:t>Managed end-to-end SEO - keyword research, on-page optimization, link building, and monthly reporting</w:t>
+      </w:r>
+    </w:p>
+    <w:p>
+      <w:pPr>
+        <w:spacing w:after="20"/>
+        <w:ind w:left="317" w:hanging="202"/>
+      </w:pPr>
+      <w:r>
+        <w:rPr>
+          <w:b/>
+          <w:color w:val="1F3364"/>
+        </w:rPr>
+        <w:t xml:space="preserve">• </w:t>
+      </w:r>
+      <w:r>
+        <w:t>Delivered monthly audit reports with prioritized actions that lifted domain visibility and rankings</w:t>
+      </w:r>
+    </w:p>
+    <w:p>
+      <w:pPr>
+        <w:spacing w:after="20"/>
+        <w:ind w:left="317" w:hanging="202"/>
+      </w:pPr>
+      <w:r>
+        <w:rPr>
+          <w:b/>
+          <w:color w:val="1F3364"/>
+        </w:rPr>
+        <w:t xml:space="preserve">• </w:t>
+      </w:r>
+      <w:r>
+        <w:t>Executed off-page SEO (guest posts, directories) to build domain authority</w:t>
+      </w:r>
+    </w:p>
+    <w:p>
+      <w:pPr>
+        <w:spacing w:before="100" w:after="20"/>
+      </w:pPr>
+      <w:r>
+        <w:rPr>
+          <w:b/>
+          <w:color w:val="1A1A1A"/>
+          <w:sz w:val="21"/>
+        </w:rPr>
+        <w:t>SEO &amp; SMO EXPERT   |   Promantra Synergies Pvt Ltd</w:t>
+      </w:r>
+    </w:p>
+    <w:p>
+      <w:pPr>
+        <w:spacing w:after="40"/>
+      </w:pPr>
+      <w:r>
+        <w:rPr>
+          <w:i/>
+          <w:color w:val="4A4A55"/>
+          <w:sz w:val="18"/>
+        </w:rPr>
+        <w:t>Nov 2017 - May 2019   |   Hyderabad, India</w:t>
+      </w:r>
+    </w:p>
+    <w:p>
+      <w:pPr>
+        <w:spacing w:after="20"/>
+        <w:ind w:left="317" w:hanging="202"/>
+      </w:pPr>
+      <w:r>
+        <w:rPr>
+          <w:b/>
+          <w:color w:val="1F3364"/>
+        </w:rPr>
+        <w:t xml:space="preserve">• </w:t>
+      </w:r>
+      <w:r>
+        <w:t>Led SEO and social campaigns that grew brand visibility and reach across search and social</w:t>
+      </w:r>
+    </w:p>
+    <w:p>
+      <w:pPr>
+        <w:spacing w:after="20"/>
+        <w:ind w:left="317" w:hanging="202"/>
+      </w:pPr>
+      <w:r>
+        <w:rPr>
+          <w:b/>
+          <w:color w:val="1F3364"/>
+        </w:rPr>
+        <w:t xml:space="preserve">• </w:t>
+      </w:r>
+      <w:r>
+        <w:t>Built content and engagement strategies aligned with keyword and audience targeting</w:t>
+      </w:r>
+    </w:p>
+    <w:p>
+      <w:pPr>
+        <w:spacing w:after="20"/>
+        <w:ind w:left="317" w:hanging="202"/>
+      </w:pPr>
+      <w:r>
+        <w:rPr>
+          <w:b/>
+          <w:color w:val="1F3364"/>
+        </w:rPr>
+        <w:t xml:space="preserve">• </w:t>
+      </w:r>
+      <w:r>
+        <w:t>Ran competitor benchmarking and link-building outreach to strengthen domain authority</w:t>
+      </w:r>
+    </w:p>
+    <w:p>
+      <w:pPr>
+        <w:spacing w:before="100" w:after="20"/>
+      </w:pPr>
+      <w:r>
+        <w:rPr>
+          <w:b/>
+          <w:color w:val="1A1A1A"/>
+          <w:sz w:val="21"/>
+        </w:rPr>
+        <w:t>SEO EXECUTIVE   |   Digital Way Soft</w:t>
+      </w:r>
+    </w:p>
+    <w:p>
+      <w:pPr>
+        <w:spacing w:after="40"/>
+      </w:pPr>
+      <w:r>
+        <w:rPr>
+          <w:i/>
+          <w:color w:val="4A4A55"/>
+          <w:sz w:val="18"/>
+        </w:rPr>
+        <w:t>Jan 2015 - Nov 2017   |   Hyderabad, India</w:t>
+      </w:r>
+    </w:p>
+    <w:p>
+      <w:pPr>
+        <w:spacing w:after="20"/>
+        <w:ind w:left="317" w:hanging="202"/>
+      </w:pPr>
+      <w:r>
+        <w:rPr>
+          <w:b/>
+          <w:color w:val="1F3364"/>
+        </w:rPr>
+        <w:t xml:space="preserve">• </w:t>
+      </w:r>
+      <w:r>
+        <w:t>Managed technical SEO, on-page, off-page, and keyword research across multiple client sites</w:t>
+      </w:r>
+    </w:p>
+    <w:p>
+      <w:pPr>
+        <w:spacing w:after="20"/>
+        <w:ind w:left="317" w:hanging="202"/>
+      </w:pPr>
+      <w:r>
+        <w:rPr>
+          <w:b/>
+          <w:color w:val="1F3364"/>
+        </w:rPr>
+        <w:t xml:space="preserve">• </w:t>
+      </w:r>
+      <w:r>
+        <w:t>Improved organic rankings through content optimization, internal linking, and meta fixes</w:t>
+      </w:r>
+    </w:p>
+    <w:p>
+      <w:pPr>
+        <w:spacing w:before="100" w:after="20"/>
+      </w:pPr>
+      <w:r>
+        <w:rPr>
+          <w:b/>
+          <w:color w:val="1A1A1A"/>
+          <w:sz w:val="21"/>
+        </w:rPr>
+        <w:t>SOFTWARE / JUNIOR TEST ENGINEER   |   Ainslee Software Technologies &amp; Corbz Data Info Solutions</w:t>
+      </w:r>
+    </w:p>
+    <w:p>
+      <w:pPr>
+        <w:spacing w:after="40"/>
+      </w:pPr>
+      <w:r>
+        <w:rPr>
+          <w:i/>
+          <w:color w:val="4A4A55"/>
+          <w:sz w:val="18"/>
+        </w:rPr>
+        <w:t>May 2007 - Sep 2014   |   Hyderabad, India</w:t>
+      </w:r>
+    </w:p>
+    <w:p>
+      <w:pPr>
+        <w:spacing w:after="20"/>
+        <w:ind w:left="317" w:hanging="202"/>
+      </w:pPr>
+      <w:r>
+        <w:rPr>
+          <w:b/>
+          <w:color w:val="1F3364"/>
+        </w:rPr>
+        <w:t xml:space="preserve">• </w:t>
+      </w:r>
+      <w:r>
+        <w:t>Designed test plans, cases, and defect reports for web and enterprise projects (functional, regression, UAT)</w:t>
+      </w:r>
+    </w:p>
+    <w:p>
+      <w:pPr>
+        <w:spacing w:after="20"/>
+        <w:ind w:left="317" w:hanging="202"/>
+      </w:pPr>
+      <w:r>
+        <w:rPr>
+          <w:b/>
+          <w:color w:val="1F3364"/>
+        </w:rPr>
+        <w:t xml:space="preserve">• </w:t>
+      </w:r>
+      <w:r>
+        <w:t>Built the analytical, root-cause base that now drives data-led marketing decisions</w:t>
+      </w:r>
+    </w:p>
+    <w:p>
+      <w:pPr>
+        <w:spacing w:before="160" w:after="60"/>
+        <w:pBdr>
+          <w:bottom w:val="single" w:sz="6" w:space="2" w:color="1F3364"/>
+        </w:pBdr>
+      </w:pPr>
+      <w:r>
+        <w:rPr>
+          <w:b/>
+          <w:color w:val="1F3364"/>
+          <w:sz w:val="24"/>
+        </w:rPr>
+        <w:t>FEATURED PROJECTS</w:t>
+      </w:r>
+    </w:p>
+    <w:p>
+      <w:pPr>
+        <w:spacing w:before="120" w:after="20"/>
+      </w:pPr>
+      <w:r>
+        <w:rPr>
+          <w:b/>
+          <w:color w:val="1F3364"/>
+          <w:sz w:val="20"/>
+        </w:rPr>
+        <w:t>HOOK AI - AI Marketing Copy Engine</w:t>
+      </w:r>
+    </w:p>
+    <w:p>
+      <w:pPr>
+        <w:spacing w:before="0" w:after="40"/>
+      </w:pPr>
+      <w:r>
+        <w:rPr>
+          <w:b w:val="0"/>
+          <w:i w:val="0"/>
+          <w:color w:val="4A4A55"/>
+          <w:sz w:val="19"/>
+        </w:rPr>
+        <w:t>Designed, built &amp; launched SOLO - my own one-person product</w:t>
+      </w:r>
+    </w:p>
+    <w:p>
+      <w:pPr>
+        <w:spacing w:before="0" w:after="40"/>
+      </w:pPr>
+      <w:r>
+        <w:rPr>
+          <w:b w:val="0"/>
+          <w:i w:val="0"/>
+          <w:color w:val="4A4A55"/>
+          <w:sz w:val="19"/>
+        </w:rPr>
+        <w:t>Next.js | Supabase | TypeScript | Stripe &amp; Razorpay | Vercel | Groq AI</w:t>
+      </w:r>
+    </w:p>
+    <w:p>
+      <w:pPr>
+        <w:spacing w:before="0" w:after="40"/>
+      </w:pPr>
+      <w:r>
+        <w:rPr>
+          <w:b w:val="0"/>
+          <w:i w:val="0"/>
+          <w:color w:val="4A4A55"/>
+          <w:sz w:val="19"/>
+        </w:rPr>
+        <w:t>Github: github.com/gitvamshidhar-m/hook-ai-marketing-engine | Live: hook-ai-marketing-engine.vercel.app</w:t>
+      </w:r>
+    </w:p>
+    <w:p>
+      <w:pPr>
+        <w:spacing w:before="60" w:after="20"/>
+      </w:pPr>
+      <w:r>
+        <w:rPr>
+          <w:b/>
+          <w:color w:val="1F3364"/>
+          <w:sz w:val="20"/>
+        </w:rPr>
+        <w:t>WHAT IT IS</w:t>
+      </w:r>
+    </w:p>
+    <w:p>
+      <w:pPr>
+        <w:spacing w:before="0" w:after="40"/>
+      </w:pPr>
+      <w:r>
+        <w:rPr>
+          <w:b w:val="0"/>
+          <w:i w:val="0"/>
+          <w:color w:val="1A1A1A"/>
+          <w:sz w:val="20"/>
+        </w:rPr>
+        <w:t>An AI SaaS that writes conversion-ready marketing hooks, headlines, and ad copy across 15+ niches (real estate, SaaS, fitness, insurance, local SEO, pet, wedding, accounting, photography, career and more) - the complete toolkit a founder needs to win traffic, growth, and revenue.</w:t>
+      </w:r>
+    </w:p>
+    <w:p>
+      <w:pPr>
+        <w:spacing w:before="60" w:after="20"/>
+      </w:pPr>
+      <w:r>
+        <w:rPr>
+          <w:b/>
+          <w:color w:val="1F3364"/>
+          <w:sz w:val="20"/>
+        </w:rPr>
+        <w:t>MARKETING &amp; GROWTH - WHAT I DID</w:t>
+      </w:r>
+    </w:p>
+    <w:p>
+      <w:pPr>
+        <w:spacing w:after="20"/>
+        <w:ind w:left="317" w:hanging="202"/>
+      </w:pPr>
+      <w:r>
+        <w:rPr>
+          <w:b/>
+          <w:color w:val="1F3364"/>
+        </w:rPr>
+        <w:t xml:space="preserve">• </w:t>
+      </w:r>
+      <w:r>
+        <w:t>Owned positioning, strategy, and launch execution for the entire product</w:t>
+      </w:r>
+    </w:p>
+    <w:p>
+      <w:pPr>
+        <w:spacing w:after="20"/>
+        <w:ind w:left="317" w:hanging="202"/>
+      </w:pPr>
+      <w:r>
+        <w:rPr>
+          <w:b/>
+          <w:color w:val="1F3364"/>
+        </w:rPr>
+        <w:t xml:space="preserve">• </w:t>
+      </w:r>
+      <w:r>
+        <w:t>Executed a full SEO program - 30+ long-form blog posts, niche landing pages, auto sitemap, and FAQ/HowTo schema - engineered to win rich results</w:t>
+      </w:r>
+    </w:p>
+    <w:p>
+      <w:pPr>
+        <w:spacing w:after="20"/>
+        <w:ind w:left="317" w:hanging="202"/>
+      </w:pPr>
+      <w:r>
+        <w:rPr>
+          <w:b/>
+          <w:color w:val="1F3364"/>
+        </w:rPr>
+        <w:t xml:space="preserve">• </w:t>
+      </w:r>
+      <w:r>
+        <w:t>Built the acquisition funnel - scheduled email flows, exit-intent lead capture, referral program, and A/B hero testing with statistical-significance reporting to lift CTR</w:t>
+      </w:r>
+    </w:p>
+    <w:p>
+      <w:pPr>
+        <w:spacing w:after="20"/>
+        <w:ind w:left="317" w:hanging="202"/>
+      </w:pPr>
+      <w:r>
+        <w:rPr>
+          <w:b/>
+          <w:color w:val="1F3364"/>
+        </w:rPr>
+        <w:t xml:space="preserve">• </w:t>
+      </w:r>
+      <w:r>
+        <w:t>Leveraged GA4-style dashboards and growth metrics to steer the funnel day-to-day</w:t>
+      </w:r>
+    </w:p>
+    <w:p>
+      <w:pPr>
+        <w:spacing w:before="60" w:after="20"/>
+      </w:pPr>
+      <w:r>
+        <w:rPr>
+          <w:b/>
+          <w:color w:val="1F3364"/>
+          <w:sz w:val="20"/>
+        </w:rPr>
+        <w:t>ENGINEERING - WHAT I BUILT</w:t>
+      </w:r>
+    </w:p>
+    <w:p>
+      <w:pPr>
+        <w:spacing w:after="20"/>
+        <w:ind w:left="317" w:hanging="202"/>
+      </w:pPr>
+      <w:r>
+        <w:rPr>
+          <w:b/>
+          <w:color w:val="1F3364"/>
+        </w:rPr>
+        <w:t xml:space="preserve">• </w:t>
+      </w:r>
+      <w:r>
+        <w:t>Full-stack Next.js app with Supabase database, authentication, and real-time features</w:t>
+      </w:r>
+    </w:p>
+    <w:p>
+      <w:pPr>
+        <w:spacing w:after="20"/>
+        <w:ind w:left="317" w:hanging="202"/>
+      </w:pPr>
+      <w:r>
+        <w:rPr>
+          <w:b/>
+          <w:color w:val="1F3364"/>
+        </w:rPr>
+        <w:t xml:space="preserve">• </w:t>
+      </w:r>
+      <w:r>
+        <w:t>Paid subscription billing wired with Stripe &amp; Razorpay; credits, referrals, and saved projects</w:t>
+      </w:r>
+    </w:p>
+    <w:p>
+      <w:pPr>
+        <w:spacing w:after="20"/>
+        <w:ind w:left="317" w:hanging="202"/>
+      </w:pPr>
+      <w:r>
+        <w:rPr>
+          <w:b/>
+          <w:color w:val="1F3364"/>
+        </w:rPr>
+        <w:t xml:space="preserve">• </w:t>
+      </w:r>
+      <w:r>
+        <w:t>15+ niche AI copy generators powered by Groq AI, plus a community hooks feed for social proof</w:t>
+      </w:r>
+    </w:p>
+    <w:p>
+      <w:pPr>
+        <w:spacing w:after="20"/>
+        <w:ind w:left="317" w:hanging="202"/>
+      </w:pPr>
+      <w:r>
+        <w:rPr>
+          <w:b/>
+          <w:color w:val="1F3364"/>
+        </w:rPr>
+        <w:t xml:space="preserve">• </w:t>
+      </w:r>
+      <w:r>
+        <w:t>Shipped and scaled solo on the Vercel free tier - auth, billing, analytics, and growth dashboards all live</w:t>
+      </w:r>
+    </w:p>
+    <w:p>
+      <w:pPr>
+        <w:spacing w:before="60" w:after="20"/>
+      </w:pPr>
+      <w:r>
+        <w:rPr>
+          <w:b/>
+          <w:color w:val="1F3364"/>
+          <w:sz w:val="20"/>
+        </w:rPr>
+        <w:t>PROOF - LIVE TODAY</w:t>
+      </w:r>
+    </w:p>
+    <w:p>
+      <w:pPr>
+        <w:spacing w:after="20"/>
+        <w:ind w:left="317" w:hanging="202"/>
+      </w:pPr>
+      <w:r>
+        <w:rPr>
+          <w:b/>
+          <w:color w:val="1F3364"/>
+        </w:rPr>
+        <w:t xml:space="preserve">• </w:t>
+      </w:r>
+      <w:r>
+        <w:t>Product is deployed and running in production, open on GitHub, with working auth and payments</w:t>
+      </w:r>
+    </w:p>
+    <w:p>
+      <w:pPr>
+        <w:spacing w:after="20"/>
+        <w:ind w:left="317" w:hanging="202"/>
+      </w:pPr>
+      <w:r>
+        <w:rPr>
+          <w:b/>
+          <w:color w:val="1F3364"/>
+        </w:rPr>
+        <w:t xml:space="preserve">• </w:t>
+      </w:r>
+      <w:r>
+        <w:t>Complete SEO site structure and content engine running without any agency or help</w:t>
+      </w:r>
+    </w:p>
+    <w:p>
+      <w:pPr>
+        <w:spacing w:after="20"/>
+        <w:ind w:left="317" w:hanging="202"/>
+      </w:pPr>
+      <w:r>
+        <w:rPr>
+          <w:b/>
+          <w:color w:val="1F3364"/>
+        </w:rPr>
+        <w:t xml:space="preserve">• </w:t>
+      </w:r>
+      <w:r>
+        <w:t>The strongest available proof of a digital marketer who can also engineer - rare in one person</w:t>
+      </w:r>
+    </w:p>
+    <w:p>
+      <w:pPr>
+        <w:spacing w:before="120" w:after="20"/>
+      </w:pPr>
+      <w:r>
+        <w:rPr>
+          <w:b/>
+          <w:color w:val="1F3364"/>
+          <w:sz w:val="20"/>
+        </w:rPr>
+        <w:t>CREATIVE PREDICTOR - AI AD TESTING SUITE (v13.0)</w:t>
+      </w:r>
+    </w:p>
+    <w:p>
+      <w:pPr>
+        <w:spacing w:before="0" w:after="40"/>
+      </w:pPr>
+      <w:r>
+        <w:rPr>
+          <w:b w:val="0"/>
+          <w:i w:val="0"/>
+          <w:color w:val="4A4A55"/>
+          <w:sz w:val="19"/>
+        </w:rPr>
+        <w:t>My second live product - a full paid-media &amp; CRO intelligence suite</w:t>
+      </w:r>
+    </w:p>
+    <w:p>
+      <w:pPr>
+        <w:spacing w:before="0" w:after="40"/>
+      </w:pPr>
+      <w:r>
+        <w:rPr>
+          <w:b w:val="0"/>
+          <w:i w:val="0"/>
+          <w:color w:val="4A4A55"/>
+          <w:sz w:val="19"/>
+        </w:rPr>
+        <w:t>HTML/JS front-end | Groq AI (Llama 3.3 70B) | OpenAI | HuggingFace Spaces</w:t>
+      </w:r>
+    </w:p>
+    <w:p>
+      <w:pPr>
+        <w:spacing w:before="0" w:after="40"/>
+      </w:pPr>
+      <w:r>
+        <w:rPr>
+          <w:b w:val="0"/>
+          <w:i w:val="0"/>
+          <w:color w:val="4A4A55"/>
+          <w:sz w:val="19"/>
+        </w:rPr>
+        <w:t>Live: mvamshi56-creative-predictor.static.hf.space</w:t>
+      </w:r>
+    </w:p>
+    <w:p>
+      <w:pPr>
+        <w:spacing w:before="60" w:after="20"/>
+      </w:pPr>
+      <w:r>
+        <w:rPr>
+          <w:b/>
+          <w:color w:val="1F3364"/>
+          <w:sz w:val="20"/>
+        </w:rPr>
+        <w:t>WHAT IT IS</w:t>
+      </w:r>
+    </w:p>
+    <w:p>
+      <w:pPr>
+        <w:spacing w:before="0" w:after="40"/>
+      </w:pPr>
+      <w:r>
+        <w:rPr>
+          <w:b w:val="0"/>
+          <w:i w:val="0"/>
+          <w:color w:val="1A1A1A"/>
+          <w:sz w:val="20"/>
+        </w:rPr>
+        <w:t>An all-in-one ad and landing-page intelligence suite for paid-media teams: paste any ad creative and receive a scored prediction, a full marketing analysis, and clear next actions - in seconds.</w:t>
+      </w:r>
+    </w:p>
+    <w:p>
+      <w:pPr>
+        <w:spacing w:before="60" w:after="20"/>
+      </w:pPr>
+      <w:r>
+        <w:rPr>
+          <w:b/>
+          <w:color w:val="1F3364"/>
+          <w:sz w:val="20"/>
+        </w:rPr>
+        <w:t>WHAT I BUILT</w:t>
+      </w:r>
+    </w:p>
+    <w:p>
+      <w:pPr>
+        <w:spacing w:after="20"/>
+        <w:ind w:left="317" w:hanging="202"/>
+      </w:pPr>
+      <w:r>
+        <w:rPr>
+          <w:b/>
+          <w:color w:val="1F3364"/>
+        </w:rPr>
+        <w:t xml:space="preserve">• </w:t>
+      </w:r>
+      <w:r>
+        <w:t>Ad Creative Analyzer - predicts overall creative score, CTR, engagement, and conversion per platform (Meta, Google, LinkedIn, Instagram/Reels, TikTok)</w:t>
+      </w:r>
+    </w:p>
+    <w:p>
+      <w:pPr>
+        <w:spacing w:after="20"/>
+        <w:ind w:left="317" w:hanging="202"/>
+      </w:pPr>
+      <w:r>
+        <w:rPr>
+          <w:b/>
+          <w:color w:val="1F3364"/>
+        </w:rPr>
+        <w:t xml:space="preserve">• </w:t>
+      </w:r>
+      <w:r>
+        <w:t>20+ decision modules - quality score, campaign budget estimator, emotional arc, copy-length optimizer, ad-fatigue estimator, psychological triggers, CTA deep analyzer, CRO checklist, funnel-stage analysis, ROAS calculator, customer avatar, attention heatmap, word-impact and persona targeting</w:t>
+      </w:r>
+    </w:p>
+    <w:p>
+      <w:pPr>
+        <w:spacing w:after="20"/>
+        <w:ind w:left="317" w:hanging="202"/>
+      </w:pPr>
+      <w:r>
+        <w:rPr>
+          <w:b/>
+          <w:color w:val="1F3364"/>
+        </w:rPr>
+        <w:t xml:space="preserve">• </w:t>
+      </w:r>
+      <w:r>
+        <w:t>Full A/B testing toolkit - side-by-side Version A vs B comparison, statistical-significance calculator, and A/B test idea generator</w:t>
+      </w:r>
+    </w:p>
+    <w:p>
+      <w:pPr>
+        <w:spacing w:after="20"/>
+        <w:ind w:left="317" w:hanging="202"/>
+      </w:pPr>
+      <w:r>
+        <w:rPr>
+          <w:b/>
+          <w:color w:val="1F3364"/>
+        </w:rPr>
+        <w:t xml:space="preserve">• </w:t>
+      </w:r>
+      <w:r>
+        <w:t>Competitor Ad Decoder - paste any competitor ad copy to decode positioning, find weaknesses, and get counter-strategies</w:t>
+      </w:r>
+    </w:p>
+    <w:p>
+      <w:pPr>
+        <w:spacing w:after="20"/>
+        <w:ind w:left="317" w:hanging="202"/>
+      </w:pPr>
+      <w:r>
+        <w:rPr>
+          <w:b/>
+          <w:color w:val="1F3364"/>
+        </w:rPr>
+        <w:t xml:space="preserve">• </w:t>
+      </w:r>
+      <w:r>
+        <w:t>Landing Page Analyzer - any URL (or pasted HTML) analyzed for SEO, GEO, AEO, CRO, and growth opportunities; export to PDF report or PPT</w:t>
+      </w:r>
+    </w:p>
+    <w:p>
+      <w:pPr>
+        <w:spacing w:after="20"/>
+        <w:ind w:left="317" w:hanging="202"/>
+      </w:pPr>
+      <w:r>
+        <w:rPr>
+          <w:b/>
+          <w:color w:val="1F3364"/>
+        </w:rPr>
+        <w:t xml:space="preserve">• </w:t>
+      </w:r>
+      <w:r>
+        <w:t>AI engine switchable across Groq (Llama 3.3 70B), OpenAI, and HuggingFace, with saved analyses and history</w:t>
+      </w:r>
+    </w:p>
+    <w:p>
+      <w:pPr>
+        <w:spacing w:before="60" w:after="20"/>
+      </w:pPr>
+      <w:r>
+        <w:rPr>
+          <w:b/>
+          <w:color w:val="1F3364"/>
+          <w:sz w:val="20"/>
+        </w:rPr>
+        <w:t>WHY IT MATTERS ON THE CV</w:t>
+      </w:r>
+    </w:p>
+    <w:p>
+      <w:pPr>
+        <w:spacing w:after="20"/>
+        <w:ind w:left="317" w:hanging="202"/>
+      </w:pPr>
+      <w:r>
+        <w:rPr>
+          <w:b/>
+          <w:color w:val="1F3364"/>
+        </w:rPr>
+        <w:t xml:space="preserve">• </w:t>
+      </w:r>
+      <w:r>
+        <w:t>I built the exact toolkit a PPC and CRO specialist uses daily - CTR, ROAS, quality score, fatigue, and funnel leaks</w:t>
+      </w:r>
+    </w:p>
+    <w:p>
+      <w:pPr>
+        <w:spacing w:after="20"/>
+        <w:ind w:left="317" w:hanging="202"/>
+      </w:pPr>
+      <w:r>
+        <w:rPr>
+          <w:b/>
+          <w:color w:val="1F3364"/>
+        </w:rPr>
+        <w:t xml:space="preserve">• </w:t>
+      </w:r>
+      <w:r>
+        <w:t>Shipped 13 product iterations (v13.0) - real iteration, not a one-day demo</w:t>
+      </w:r>
+    </w:p>
+    <w:p>
+      <w:pPr>
+        <w:spacing w:after="20"/>
+        <w:ind w:left="317" w:hanging="202"/>
+      </w:pPr>
+      <w:r>
+        <w:rPr>
+          <w:b/>
+          <w:color w:val="1F3364"/>
+        </w:rPr>
+        <w:t xml:space="preserve">• </w:t>
+      </w:r>
+      <w:r>
+        <w:t>Live and clickable; pairs with Hook AI - one productizes growth strategy, this productizes paid media &amp; CRO</w:t>
+      </w:r>
+    </w:p>
+    <w:p>
+      <w:pPr>
+        <w:spacing w:before="120" w:after="20"/>
+      </w:pPr>
+      <w:r>
+        <w:rPr>
+          <w:b/>
+          <w:color w:val="1F3364"/>
+          <w:sz w:val="20"/>
+        </w:rPr>
+        <w:t>AI GROWTH STRATEGY GENERATOR</w:t>
+      </w:r>
+    </w:p>
+    <w:p>
+      <w:pPr>
+        <w:spacing w:before="0" w:after="40"/>
+      </w:pPr>
+      <w:r>
+        <w:rPr>
+          <w:b w:val="0"/>
+          <w:i w:val="0"/>
+          <w:color w:val="4A4A55"/>
+          <w:sz w:val="19"/>
+        </w:rPr>
+        <w:t>My third live product - a funnel-based growth strategist</w:t>
+      </w:r>
+    </w:p>
+    <w:p>
+      <w:pPr>
+        <w:spacing w:before="0" w:after="40"/>
+      </w:pPr>
+      <w:r>
+        <w:rPr>
+          <w:b w:val="0"/>
+          <w:i w:val="0"/>
+          <w:color w:val="4A4A55"/>
+          <w:sz w:val="19"/>
+        </w:rPr>
+        <w:t>Next.js | Vercel</w:t>
+      </w:r>
+    </w:p>
+    <w:p>
+      <w:pPr>
+        <w:spacing w:before="0" w:after="40"/>
+      </w:pPr>
+      <w:r>
+        <w:rPr>
+          <w:b w:val="0"/>
+          <w:i w:val="0"/>
+          <w:color w:val="4A4A55"/>
+          <w:sz w:val="19"/>
+        </w:rPr>
+        <w:t>Live: strategy-generator-kwdf-beta.vercel.app</w:t>
+      </w:r>
+    </w:p>
+    <w:p>
+      <w:pPr>
+        <w:spacing w:before="60" w:after="20"/>
+      </w:pPr>
+      <w:r>
+        <w:rPr>
+          <w:b/>
+          <w:color w:val="1F3364"/>
+          <w:sz w:val="20"/>
+        </w:rPr>
+        <w:t>WHAT IT IS</w:t>
+      </w:r>
+    </w:p>
+    <w:p>
+      <w:pPr>
+        <w:spacing w:before="0" w:after="40"/>
+      </w:pPr>
+      <w:r>
+        <w:rPr>
+          <w:b w:val="0"/>
+          <w:i w:val="0"/>
+          <w:color w:val="1A1A1A"/>
+          <w:sz w:val="20"/>
+        </w:rPr>
+        <w:t>An AI-powered, funnel-based strategy generator that does in seconds what a growth consultant maps over days: take real business inputs and return a personalized, budget-optimized marketing strategy.</w:t>
+      </w:r>
+    </w:p>
+    <w:p>
+      <w:pPr>
+        <w:spacing w:before="60" w:after="20"/>
+      </w:pPr>
+      <w:r>
+        <w:rPr>
+          <w:b/>
+          <w:color w:val="1F3364"/>
+          <w:sz w:val="20"/>
+        </w:rPr>
+        <w:t>WHAT I BUILT - INPUTS &amp; LOGIC</w:t>
+      </w:r>
+    </w:p>
+    <w:p>
+      <w:pPr>
+        <w:spacing w:after="20"/>
+        <w:ind w:left="317" w:hanging="202"/>
+      </w:pPr>
+      <w:r>
+        <w:rPr>
+          <w:b/>
+          <w:color w:val="1F3364"/>
+        </w:rPr>
+        <w:t xml:space="preserve">• </w:t>
+      </w:r>
+      <w:r>
+        <w:t>Designed a guided conversion wizard that captures the essentials a strategist truly needs - industry, monthly budget ($), primary goal, and strategy style (balanced / aggressive / conservative)</w:t>
+      </w:r>
+    </w:p>
+    <w:p>
+      <w:pPr>
+        <w:spacing w:after="20"/>
+        <w:ind w:left="317" w:hanging="202"/>
+      </w:pPr>
+      <w:r>
+        <w:rPr>
+          <w:b/>
+          <w:color w:val="1F3364"/>
+        </w:rPr>
+        <w:t xml:space="preserve">• </w:t>
+      </w:r>
+      <w:r>
+        <w:t>Added optional KPI targets (target CPA, ROAS, conversion rate) and competitor mapping - used to sharpen recommendations and run an instant SWOT</w:t>
+      </w:r>
+    </w:p>
+    <w:p>
+      <w:pPr>
+        <w:spacing w:after="20"/>
+        <w:ind w:left="317" w:hanging="202"/>
+      </w:pPr>
+      <w:r>
+        <w:rPr>
+          <w:b/>
+          <w:color w:val="1F3364"/>
+        </w:rPr>
+        <w:t xml:space="preserve">• </w:t>
+      </w:r>
+      <w:r>
+        <w:t>Collects current channels (SEO, PPC, social, email, content, paid social) and goal, and outputs a prioritized plan divided by impact</w:t>
+      </w:r>
+    </w:p>
+    <w:p>
+      <w:pPr>
+        <w:spacing w:after="20"/>
+        <w:ind w:left="317" w:hanging="202"/>
+      </w:pPr>
+      <w:r>
+        <w:rPr>
+          <w:b/>
+          <w:color w:val="1F3364"/>
+        </w:rPr>
+        <w:t xml:space="preserve">• </w:t>
+      </w:r>
+      <w:r>
+        <w:t>Built the scoring engine, funnel split (awareness to loyalty), and budget allocation logic in Next.js</w:t>
+      </w:r>
+    </w:p>
+    <w:p>
+      <w:pPr>
+        <w:spacing w:before="60" w:after="20"/>
+      </w:pPr>
+      <w:r>
+        <w:rPr>
+          <w:b/>
+          <w:color w:val="1F3364"/>
+          <w:sz w:val="20"/>
+        </w:rPr>
+        <w:t>WHAT THE OUTPUT GIVES THE USER</w:t>
+      </w:r>
+    </w:p>
+    <w:p>
+      <w:pPr>
+        <w:spacing w:after="20"/>
+        <w:ind w:left="317" w:hanging="202"/>
+      </w:pPr>
+      <w:r>
+        <w:rPr>
+          <w:b/>
+          <w:color w:val="1F3364"/>
+        </w:rPr>
+        <w:t xml:space="preserve">• </w:t>
+      </w:r>
+      <w:r>
+        <w:t>A clear, actionable roadmap - every move scored by effort vs. impact so effort goes where ROI is highest</w:t>
+      </w:r>
+    </w:p>
+    <w:p>
+      <w:pPr>
+        <w:spacing w:after="20"/>
+        <w:ind w:left="317" w:hanging="202"/>
+      </w:pPr>
+      <w:r>
+        <w:rPr>
+          <w:b/>
+          <w:color w:val="1F3364"/>
+        </w:rPr>
+        <w:t xml:space="preserve">• </w:t>
+      </w:r>
+      <w:r>
+        <w:t>Smart budget allocation across channels instead of guesses, in an awareness-to-loyalty funnel structure</w:t>
+      </w:r>
+    </w:p>
+    <w:p>
+      <w:pPr>
+        <w:spacing w:after="20"/>
+        <w:ind w:left="317" w:hanging="202"/>
+      </w:pPr>
+      <w:r>
+        <w:rPr>
+          <w:b/>
+          <w:color w:val="1F3364"/>
+        </w:rPr>
+        <w:t xml:space="preserve">• </w:t>
+      </w:r>
+      <w:r>
+        <w:t>Ready to execute same-day - the whole point being useful, not just impressive</w:t>
+      </w:r>
+    </w:p>
+    <w:p>
+      <w:pPr>
+        <w:spacing w:before="60" w:after="20"/>
+      </w:pPr>
+      <w:r>
+        <w:rPr>
+          <w:b/>
+          <w:color w:val="1F3364"/>
+          <w:sz w:val="20"/>
+        </w:rPr>
+        <w:t>WHY IT IS ON THE CV</w:t>
+      </w:r>
+    </w:p>
+    <w:p>
+      <w:pPr>
+        <w:spacing w:after="20"/>
+        <w:ind w:left="317" w:hanging="202"/>
+      </w:pPr>
+      <w:r>
+        <w:rPr>
+          <w:b/>
+          <w:color w:val="1F3364"/>
+        </w:rPr>
+        <w:t xml:space="preserve">• </w:t>
+      </w:r>
+      <w:r>
+        <w:t>First-hand proof I can productize the structured thinking behind paid media and growth strategy</w:t>
+      </w:r>
+    </w:p>
+    <w:p>
+      <w:pPr>
+        <w:spacing w:after="20"/>
+        <w:ind w:left="317" w:hanging="202"/>
+      </w:pPr>
+      <w:r>
+        <w:rPr>
+          <w:b/>
+          <w:color w:val="1F3364"/>
+        </w:rPr>
+        <w:t xml:space="preserve">• </w:t>
+      </w:r>
+      <w:r>
+        <w:t>A second self-shipped AI tool - proof the approach repeats, not a one-hit; live and clickable for recruiters</w:t>
+      </w:r>
+    </w:p>
+    <w:p>
+      <w:pPr>
+        <w:spacing w:before="160" w:after="60"/>
+        <w:pBdr>
+          <w:bottom w:val="single" w:sz="6" w:space="2" w:color="1F3364"/>
+        </w:pBdr>
+      </w:pPr>
+      <w:r>
+        <w:rPr>
+          <w:b/>
+          <w:color w:val="1F3364"/>
+          <w:sz w:val="24"/>
+        </w:rPr>
+        <w:t>TECHNICAL SKILLS</w:t>
+      </w:r>
+    </w:p>
+    <w:p>
+      <w:pPr>
+        <w:spacing w:after="40"/>
+      </w:pPr>
+      <w:r>
+        <w:rPr>
+          <w:b/>
+          <w:color w:val="1F3364"/>
+          <w:sz w:val="19"/>
+        </w:rPr>
+        <w:t xml:space="preserve">AI &amp; AUTOMATION:  </w:t>
       </w:r>
       <w:r>
         <w:rPr>
-          <w:color w:val="E4E5F0"/>
-          <w:sz w:val="15"/>
+          <w:sz w:val="19"/>
         </w:rPr>
-        <w:t>Hyderabad, India</w:t>
+        <w:t>Generative AI, Prompt Engineering, AI Agents, ChatGPT, Claude AI, Gemini AI, Perplexity AI, Marketing Automation, Workflow Automation</w:t>
       </w:r>
     </w:p>
     <w:p>
       <w:pPr>
-        <w:spacing w:after="20" w:before="0"/>
+        <w:spacing w:after="40"/>
       </w:pPr>
       <w:r>
         <w:rPr>
-          <w:color w:val="2FF3C0"/>
-          <w:sz w:val="16"/>
+          <w:b/>
+          <w:color w:val="1F3364"/>
+          <w:sz w:val="19"/>
         </w:rPr>
-        <w:t xml:space="preserve">📞  </w:t>
+        <w:t xml:space="preserve">SEO &amp; SEARCH:  </w:t>
       </w:r>
       <w:r>
         <w:rPr>
-          <w:color w:val="E4E5F0"/>
-          <w:sz w:val="15"/>
+          <w:sz w:val="19"/>
         </w:rPr>
-        <w:t>+91-7981719085</w:t>
+        <w:t>Technical SEO, Enterprise SEO, Local SEO, On-Page / Off-Page, E-E-A-T, Keyword Research, Competitor Analysis, Link Building, SEO Audits, AI-Powered SEO</w:t>
       </w:r>
     </w:p>
     <w:p>
       <w:pPr>
-        <w:spacing w:after="20" w:before="0"/>
+        <w:spacing w:after="40"/>
       </w:pPr>
       <w:r>
         <w:rPr>
-          <w:color w:val="2FF3C0"/>
-          <w:sz w:val="16"/>
+          <w:b/>
+          <w:color w:val="1F3364"/>
+          <w:sz w:val="19"/>
         </w:rPr>
-        <w:t xml:space="preserve">✉️  </w:t>
+        <w:t xml:space="preserve">PAID MEDIA:  </w:t>
       </w:r>
       <w:r>
         <w:rPr>
-          <w:color w:val="E4E5F0"/>
-          <w:sz w:val="15"/>
+          <w:sz w:val="19"/>
         </w:rPr>
-        <w:t>geovamshidhar@gmail.com</w:t>
+        <w:t>PPC (Google Ads), LinkedIn Ads, Display &amp; Search, Lead Generation, CRO, Landing Page Optimization, Audience Segmentation, Funnel Optimization</w:t>
       </w:r>
     </w:p>
     <w:p>
       <w:pPr>
-        <w:spacing w:after="20" w:before="0"/>
+        <w:spacing w:after="40"/>
       </w:pPr>
       <w:r>
         <w:rPr>
-          <w:color w:val="2FF3C0"/>
-          <w:sz w:val="16"/>
+          <w:b/>
+          <w:color w:val="1F3364"/>
+          <w:sz w:val="19"/>
         </w:rPr>
-        <w:t xml:space="preserve">in  </w:t>
+        <w:t xml:space="preserve">ANALYTICS:  </w:t>
       </w:r>
       <w:r>
         <w:rPr>
-          <w:color w:val="E4E5F0"/>
-          <w:sz w:val="15"/>
+          <w:sz w:val="19"/>
         </w:rPr>
-        <w:t>linkedin.com/in/vamshidharreddym</w:t>
+        <w:t>GA4, Looker Studio, Tableau, Data Visualization, Attribution Analysis, KPI Reporting, Conversion Tracking, ROI Measurement</w:t>
       </w:r>
     </w:p>
     <w:p>
       <w:pPr>
-        <w:spacing w:after="20" w:before="0"/>
+        <w:spacing w:after="40"/>
       </w:pPr>
       <w:r>
         <w:rPr>
-          <w:color w:val="2FF3C0"/>
-          <w:sz w:val="16"/>
+          <w:b/>
+          <w:color w:val="1F3364"/>
+          <w:sz w:val="19"/>
         </w:rPr>
-        <w:t xml:space="preserve">gh  </w:t>
+        <w:t xml:space="preserve">TOOLS &amp; PLATFORMS:  </w:t>
       </w:r>
       <w:r>
         <w:rPr>
-          <w:color w:val="E4E5F0"/>
-          <w:sz w:val="15"/>
+          <w:sz w:val="19"/>
         </w:rPr>
-        <w:t>github.com/gitvamshidhar-m</w:t>
+        <w:t>SEMrush, Ahrefs, Moz, SpyFu, SimilarWeb, Screaming Frog, Search Console, Keyword Planner, Google Trends, Meta Business</w:t>
       </w:r>
     </w:p>
     <w:p>
       <w:pPr>
-        <w:spacing w:after="20" w:before="0"/>
+        <w:spacing w:before="160" w:after="60"/>
+        <w:pBdr>
+          <w:bottom w:val="single" w:sz="6" w:space="2" w:color="1F3364"/>
+        </w:pBdr>
       </w:pPr>
       <w:r>
         <w:rPr>
-          <w:color w:val="2FF3C0"/>
-          <w:sz w:val="16"/>
+          <w:b/>
+          <w:color w:val="1F3364"/>
+          <w:sz w:val="24"/>
         </w:rPr>
-        <w:t xml:space="preserve">↗  </w:t>
+        <w:t>EDUCATION</w:t>
+      </w:r>
+    </w:p>
+    <w:p>
+      <w:pPr>
+        <w:spacing w:after="20"/>
+      </w:pPr>
+      <w:r>
+        <w:rPr>
+          <w:b/>
+          <w:sz w:val="19"/>
+        </w:rPr>
+        <w:t>M.TECH - POWER ELECTRONICS</w:t>
       </w:r>
       <w:r>
         <w:rPr>
-          <w:color w:val="E4E5F0"/>
-          <w:sz w:val="15"/>
+          <w:color w:val="4A4A55"/>
+          <w:sz w:val="19"/>
         </w:rPr>
-        <w:t>vamshidharm.vercel.app</w:t>
+        <w:t xml:space="preserve">   |   P.D.A College of Engineering, Karnataka (VTU)</w:t>
       </w:r>
     </w:p>
     <w:p>
       <w:pPr>
-        <w:spacing w:after="40" w:before="120"/>
-        <w:pBdr>
-          <w:bottom w:val="single" w:sz="4" w:space="2" w:color="2F3C50"/>
-        </w:pBdr>
+        <w:spacing w:after="20"/>
       </w:pPr>
       <w:r>
         <w:rPr>
-          <w:rFonts w:ascii="Calibri" w:hAnsi="Calibri"/>
           <w:b/>
-          <w:i w:val="0"/>
-          <w:color w:val="2FF3C0"/>
           <w:sz w:val="19"/>
         </w:rPr>
-        <w:t>OPEN TO</w:t>
+        <w:t>B.E. - ELECTRONICS &amp; COMMUNICATION</w:t>
+      </w:r>
+      <w:r>
+        <w:rPr>
+          <w:color w:val="4A4A55"/>
+          <w:sz w:val="19"/>
+        </w:rPr>
+        <w:t xml:space="preserve">   |   Bellary Engineering College, Karnataka (VTU)</w:t>
       </w:r>
     </w:p>
     <w:p>
       <w:pPr>
-        <w:spacing w:after="40" w:before="0"/>
+        <w:spacing w:before="160" w:after="60"/>
+        <w:pBdr>
+          <w:bottom w:val="single" w:sz="6" w:space="2" w:color="1F3364"/>
+        </w:pBdr>
       </w:pPr>
       <w:r>
         <w:rPr>
-          <w:rFonts w:ascii="Calibri" w:hAnsi="Calibri"/>
-          <w:b w:val="0"/>
-          <w:i w:val="0"/>
-          <w:color w:val="D9DAEA"/>
-          <w:sz w:val="16"/>
+          <w:b/>
+          <w:color w:val="1F3364"/>
+          <w:sz w:val="24"/>
         </w:rPr>
-        <w:t>Performance Marketing</w:t>
+        <w:t>CERTIFICATIONS</w:t>
       </w:r>
     </w:p>
     <w:p>
       <w:pPr>
-        <w:spacing w:after="40" w:before="0"/>
+        <w:spacing w:after="20"/>
       </w:pPr>
       <w:r>
         <w:rPr>
-          <w:rFonts w:ascii="Calibri" w:hAnsi="Calibri"/>
-          <w:b w:val="0"/>
-          <w:i w:val="0"/>
-          <w:color w:val="D9DAEA"/>
-          <w:sz w:val="16"/>
+          <w:b/>
+          <w:sz w:val="19"/>
         </w:rPr>
-        <w:t>SEO · Paid Media · CRO</w:t>
+        <w:t>Generative AI Mastermind</w:t>
+      </w:r>
+      <w:r>
+        <w:rPr>
+          <w:color w:val="4A4A55"/>
+          <w:sz w:val="19"/>
+        </w:rPr>
+        <w:t xml:space="preserve">   |   Outskill</w:t>
       </w:r>
     </w:p>
     <w:p>
       <w:pPr>
-        <w:spacing w:after="40" w:before="0"/>
+        <w:spacing w:after="20"/>
       </w:pPr>
       <w:r>
         <w:rPr>
-          <w:rFonts w:ascii="Calibri" w:hAnsi="Calibri"/>
-          <w:b w:val="0"/>
-          <w:i w:val="0"/>
-          <w:color w:val="D9DAEA"/>
-          <w:sz w:val="16"/>
+          <w:b/>
+          <w:sz w:val="19"/>
         </w:rPr>
-        <w:t>AI-Augmented Marketing</w:t>
+        <w:t>Advanced SEO: Search Factors</w:t>
+      </w:r>
+      <w:r>
+        <w:rPr>
+          <w:color w:val="4A4A55"/>
+          <w:sz w:val="19"/>
+        </w:rPr>
+        <w:t xml:space="preserve">   |   LinkedIn Learning</w:t>
       </w:r>
     </w:p>
     <w:p>
       <w:pPr>
-        <w:spacing w:after="40" w:before="0"/>
+        <w:spacing w:after="20"/>
       </w:pPr>
       <w:r>
         <w:rPr>
-          <w:rFonts w:ascii="Calibri" w:hAnsi="Calibri"/>
-          <w:b w:val="0"/>
-          <w:i w:val="0"/>
-          <w:color w:val="D9DAEA"/>
-          <w:sz w:val="16"/>
+          <w:b/>
+          <w:sz w:val="19"/>
         </w:rPr>
-        <w:t>Remote · Hyderabad (IST)</w:t>
+        <w:t>Marketing Tools: Growth Marketing</w:t>
+      </w:r>
+      <w:r>
+        <w:rPr>
+          <w:color w:val="4A4A55"/>
+          <w:sz w:val="19"/>
+        </w:rPr>
+        <w:t xml:space="preserve">   |   LinkedIn Learning</w:t>
       </w:r>
     </w:p>
     <w:p>
       <w:pPr>
-        <w:spacing w:after="40" w:before="120"/>
+        <w:spacing w:before="160" w:after="60"/>
         <w:pBdr>
-          <w:bottom w:val="single" w:sz="4" w:space="2" w:color="2F3C50"/>
+          <w:bottom w:val="single" w:sz="6" w:space="2" w:color="1F3364"/>
         </w:pBdr>
       </w:pPr>
       <w:r>
         <w:rPr>
-          <w:rFonts w:ascii="Calibri" w:hAnsi="Calibri"/>
           <w:b/>
-          <w:i w:val="0"/>
-          <w:color w:val="2FF3C0"/>
-          <w:sz w:val="19"/>
-        </w:rPr>
-        <w:t>SKILLS</w:t>
-      </w:r>
-    </w:p>
-    <w:p>
-      <w:pPr>
-        <w:spacing w:after="20" w:before="0"/>
-      </w:pPr>
-      <w:r>
-        <w:rPr>
-          <w:rFonts w:ascii="Calibri" w:hAnsi="Calibri"/>
-          <w:b/>
-          <w:i w:val="0"/>
-          <w:color w:val="D9DAEA"/>
-          <w:sz w:val="15"/>
-        </w:rPr>
-        <w:t>Paid Media / PPC</w:t>
-      </w:r>
-    </w:p>
-    <w:p>
-      <w:pPr>
-        <w:spacing w:after="80" w:before="0"/>
-      </w:pPr>
-      <w:r>
-        <w:rPr>
-          <w:rFonts w:ascii="Calibri" w:hAnsi="Calibri"/>
-          <w:b w:val="0"/>
-          <w:i w:val="0"/>
-          <w:color w:val="2FF3C0"/>
-          <w:sz w:val="13"/>
-        </w:rPr>
-        <w:t>▮▮▮▮▮▮▮</w:t>
-      </w:r>
-      <w:r>
-        <w:rPr>
-          <w:rFonts w:ascii="Calibri" w:hAnsi="Calibri"/>
-          <w:b w:val="0"/>
-          <w:i w:val="0"/>
-          <w:color w:val="3A3D55"/>
-          <w:sz w:val="13"/>
-        </w:rPr>
-        <w:t>▯</w:t>
-      </w:r>
-      <w:r>
-        <w:rPr>
-          <w:rFonts w:ascii="Calibri" w:hAnsi="Calibri"/>
-          <w:b/>
-          <w:i w:val="0"/>
-          <w:color w:val="C9CBDE"/>
-          <w:sz w:val="15"/>
-        </w:rPr>
-        <w:t xml:space="preserve">  95%</w:t>
-      </w:r>
-    </w:p>
-    <w:p>
-      <w:pPr>
-        <w:spacing w:after="20" w:before="0"/>
-      </w:pPr>
-      <w:r>
-        <w:rPr>
-          <w:rFonts w:ascii="Calibri" w:hAnsi="Calibri"/>
-          <w:b/>
-          <w:i w:val="0"/>
-          <w:color w:val="D9DAEA"/>
-          <w:sz w:val="15"/>
-        </w:rPr>
-        <w:t>SEO &amp; Content</w:t>
-      </w:r>
-    </w:p>
-    <w:p>
-      <w:pPr>
-        <w:spacing w:after="80" w:before="0"/>
-      </w:pPr>
-      <w:r>
-        <w:rPr>
-          <w:rFonts w:ascii="Calibri" w:hAnsi="Calibri"/>
-          <w:b w:val="0"/>
-          <w:i w:val="0"/>
-          <w:color w:val="2FF3C0"/>
-          <w:sz w:val="13"/>
-        </w:rPr>
-        <w:t>▮▮▮▮▮▮▮</w:t>
-      </w:r>
-      <w:r>
-        <w:rPr>
-          <w:rFonts w:ascii="Calibri" w:hAnsi="Calibri"/>
-          <w:b w:val="0"/>
-          <w:i w:val="0"/>
-          <w:color w:val="3A3D55"/>
-          <w:sz w:val="13"/>
-        </w:rPr>
-        <w:t>▯</w:t>
-      </w:r>
-      <w:r>
-        <w:rPr>
-          <w:rFonts w:ascii="Calibri" w:hAnsi="Calibri"/>
-          <w:b/>
-          <w:i w:val="0"/>
-          <w:color w:val="C9CBDE"/>
-          <w:sz w:val="15"/>
-        </w:rPr>
-        <w:t xml:space="preserve">  93%</w:t>
-      </w:r>
-    </w:p>
-    <w:p>
-      <w:pPr>
-        <w:spacing w:after="20" w:before="0"/>
-      </w:pPr>
-      <w:r>
-        <w:rPr>
-          <w:rFonts w:ascii="Calibri" w:hAnsi="Calibri"/>
-          <w:b/>
-          <w:i w:val="0"/>
-          <w:color w:val="D9DAEA"/>
-          <w:sz w:val="15"/>
-        </w:rPr>
-        <w:t>AI &amp; Automation</w:t>
-      </w:r>
-    </w:p>
-    <w:p>
-      <w:pPr>
-        <w:spacing w:after="80" w:before="0"/>
-      </w:pPr>
-      <w:r>
-        <w:rPr>
-          <w:rFonts w:ascii="Calibri" w:hAnsi="Calibri"/>
-          <w:b w:val="0"/>
-          <w:i w:val="0"/>
-          <w:color w:val="2FF3C0"/>
-          <w:sz w:val="13"/>
-        </w:rPr>
-        <w:t>▮▮▮▮▮▮▮</w:t>
-      </w:r>
-      <w:r>
-        <w:rPr>
-          <w:rFonts w:ascii="Calibri" w:hAnsi="Calibri"/>
-          <w:b w:val="0"/>
-          <w:i w:val="0"/>
-          <w:color w:val="3A3D55"/>
-          <w:sz w:val="13"/>
-        </w:rPr>
-        <w:t>▯</w:t>
-      </w:r>
-      <w:r>
-        <w:rPr>
-          <w:rFonts w:ascii="Calibri" w:hAnsi="Calibri"/>
-          <w:b/>
-          <w:i w:val="0"/>
-          <w:color w:val="C9CBDE"/>
-          <w:sz w:val="15"/>
-        </w:rPr>
-        <w:t xml:space="preserve">  90%</w:t>
-      </w:r>
-    </w:p>
-    <w:p>
-      <w:pPr>
-        <w:spacing w:after="20" w:before="0"/>
-      </w:pPr>
-      <w:r>
-        <w:rPr>
-          <w:rFonts w:ascii="Calibri" w:hAnsi="Calibri"/>
-          <w:b/>
-          <w:i w:val="0"/>
-          <w:color w:val="D9DAEA"/>
-          <w:sz w:val="15"/>
-        </w:rPr>
-        <w:t>Analytics &amp; GA4</w:t>
-      </w:r>
-    </w:p>
-    <w:p>
-      <w:pPr>
-        <w:spacing w:after="80" w:before="0"/>
-      </w:pPr>
-      <w:r>
-        <w:rPr>
-          <w:rFonts w:ascii="Calibri" w:hAnsi="Calibri"/>
-          <w:b w:val="0"/>
-          <w:i w:val="0"/>
-          <w:color w:val="2FF3C0"/>
-          <w:sz w:val="13"/>
-        </w:rPr>
-        <w:t>▮▮▮▮▮▮▮</w:t>
-      </w:r>
-      <w:r>
-        <w:rPr>
-          <w:rFonts w:ascii="Calibri" w:hAnsi="Calibri"/>
-          <w:b w:val="0"/>
-          <w:i w:val="0"/>
-          <w:color w:val="3A3D55"/>
-          <w:sz w:val="13"/>
-        </w:rPr>
-        <w:t>▯</w:t>
-      </w:r>
-      <w:r>
-        <w:rPr>
-          <w:rFonts w:ascii="Calibri" w:hAnsi="Calibri"/>
-          <w:b/>
-          <w:i w:val="0"/>
-          <w:color w:val="C9CBDE"/>
-          <w:sz w:val="15"/>
-        </w:rPr>
-        <w:t xml:space="preserve">  88%</w:t>
-      </w:r>
-    </w:p>
-    <w:p>
-      <w:pPr>
-        <w:spacing w:after="20" w:before="0"/>
-      </w:pPr>
-      <w:r>
-        <w:rPr>
-          <w:rFonts w:ascii="Calibri" w:hAnsi="Calibri"/>
-          <w:b/>
-          <w:i w:val="0"/>
-          <w:color w:val="D9DAEA"/>
-          <w:sz w:val="15"/>
-        </w:rPr>
-        <w:t>Development</w:t>
-      </w:r>
-    </w:p>
-    <w:p>
-      <w:pPr>
-        <w:spacing w:after="80" w:before="0"/>
-      </w:pPr>
-      <w:r>
-        <w:rPr>
-          <w:rFonts w:ascii="Calibri" w:hAnsi="Calibri"/>
-          <w:b w:val="0"/>
-          <w:i w:val="0"/>
-          <w:color w:val="2FF3C0"/>
-          <w:sz w:val="13"/>
-        </w:rPr>
-        <w:t>▮▮▮▮▮▮</w:t>
-      </w:r>
-      <w:r>
-        <w:rPr>
-          <w:rFonts w:ascii="Calibri" w:hAnsi="Calibri"/>
-          <w:b w:val="0"/>
-          <w:i w:val="0"/>
-          <w:color w:val="3A3D55"/>
-          <w:sz w:val="13"/>
-        </w:rPr>
-        <w:t>▯▯</w:t>
-      </w:r>
-      <w:r>
-        <w:rPr>
-          <w:rFonts w:ascii="Calibri" w:hAnsi="Calibri"/>
-          <w:b/>
-          <w:i w:val="0"/>
-          <w:color w:val="C9CBDE"/>
-          <w:sz w:val="15"/>
-        </w:rPr>
-        <w:t xml:space="preserve">  78%</w:t>
-      </w:r>
-    </w:p>
-    <w:p>
-      <w:pPr>
-        <w:spacing w:after="40" w:before="120"/>
-        <w:pBdr>
-          <w:bottom w:val="single" w:sz="4" w:space="2" w:color="2F3C50"/>
-        </w:pBdr>
-      </w:pPr>
-      <w:r>
-        <w:rPr>
-          <w:rFonts w:ascii="Calibri" w:hAnsi="Calibri"/>
-          <w:b/>
-          <w:i w:val="0"/>
-          <w:color w:val="2FF3C0"/>
-          <w:sz w:val="19"/>
+          <w:color w:val="1F3364"/>
+          <w:sz w:val="24"/>
         </w:rPr>
         <w:t>LANGUAGES</w:t>
       </w:r>
     </w:p>
     <w:p>
       <w:pPr>
-        <w:spacing w:after="40" w:before="0"/>
+        <w:spacing w:before="0" w:after="40"/>
       </w:pPr>
       <w:r>
         <w:rPr>
-          <w:rFonts w:ascii="Calibri" w:hAnsi="Calibri"/>
           <w:b w:val="0"/>
           <w:i w:val="0"/>
-          <w:color w:val="D9DAEA"/>
-          <w:sz w:val="16"/>
+          <w:color w:val="1A1A1A"/>
+          <w:sz w:val="20"/>
         </w:rPr>
-        <w:t>English · Hindi · Telugu · Kannada</w:t>
-      </w:r>
-    </w:p>
-    <w:p>
-      <w:pPr>
-        <w:spacing w:after="40" w:before="120"/>
-        <w:pBdr>
-          <w:bottom w:val="single" w:sz="4" w:space="2" w:color="2F3C50"/>
-        </w:pBdr>
-      </w:pPr>
-      <w:r>
-        <w:rPr>
-          <w:rFonts w:ascii="Calibri" w:hAnsi="Calibri"/>
-          <w:b/>
-          <w:i w:val="0"/>
-          <w:color w:val="2FF3C0"/>
-          <w:sz w:val="19"/>
-        </w:rPr>
-        <w:t>CERTIFICATIONS</w:t>
-      </w:r>
-    </w:p>
-    <w:p>
-      <w:pPr>
-        <w:spacing w:after="40" w:before="0"/>
-      </w:pPr>
-      <w:r>
-        <w:rPr>
-          <w:rFonts w:ascii="Calibri" w:hAnsi="Calibri"/>
-          <w:b w:val="0"/>
-          <w:i w:val="0"/>
-          <w:color w:val="C9CBDE"/>
-          <w:sz w:val="15"/>
-        </w:rPr>
-        <w:t>✓ Generative AI Mastermind — Outskill</w:t>
-      </w:r>
-    </w:p>
-    <w:p>
-      <w:pPr>
-        <w:spacing w:after="40" w:before="0"/>
-      </w:pPr>
-      <w:r>
-        <w:rPr>
-          <w:rFonts w:ascii="Calibri" w:hAnsi="Calibri"/>
-          <w:b w:val="0"/>
-          <w:i w:val="0"/>
-          <w:color w:val="C9CBDE"/>
-          <w:sz w:val="15"/>
-        </w:rPr>
-        <w:t>✓ Advanced SEO: Search Factors — LinkedIn Learning</w:t>
-      </w:r>
-    </w:p>
-    <w:p>
-      <w:pPr>
-        <w:spacing w:after="40" w:before="0"/>
-      </w:pPr>
-      <w:r>
-        <w:rPr>
-          <w:rFonts w:ascii="Calibri" w:hAnsi="Calibri"/>
-          <w:b w:val="0"/>
-          <w:i w:val="0"/>
-          <w:color w:val="C9CBDE"/>
-          <w:sz w:val="15"/>
-        </w:rPr>
-        <w:t>✓ Growth Marketing Tools — LinkedIn Learning</w:t>
+        <w:t>English  |  Hindi  |  Telugu  |  Kannada</w:t>
       </w:r>
     </w:p>
     <w:sectPr>
       <w:pgSz w:w="12240" w:h="15840"/>
-      <w:pgMar w:top="720" w:right="792" w:bottom="720" w:left="792" w:header="720" w:footer="720" w:gutter="0"/>
+      <w:pgMar w:top="720" w:right="1008" w:bottom="720" w:left="1008" w:header="720" w:footer="720" w:gutter="0"/>
       <w:cols w:space="720"/>
       <w:docGrid w:linePitch="360"/>
     </w:sectPr>
@@ -2349,11 +2232,11 @@
     <w:qFormat/>
     <w:rsid w:val="00FC693F"/>
     <w:pPr>
-      <w:spacing w:after="80" w:line="264" w:lineRule="auto"/>
+      <w:spacing w:after="60" w:line="264" w:lineRule="auto"/>
     </w:pPr>
     <w:rPr>
       <w:rFonts w:ascii="Calibri" w:hAnsi="Calibri" w:eastAsia="Calibri"/>
-      <w:color w:val="2B2D3A"/>
+      <w:color w:val="1A1A1A"/>
       <w:sz w:val="20"/>
     </w:rPr>
   </w:style>

</xml_diff>

<commit_message>
fix: CV redesigned to clean 3-page layout — header band, stat strip, right-aligned dates, condensed projects, no orphaned headings
</commit_message>
<xml_diff>
--- a/public/Vamshidhar_Reddy_M_CV.docx
+++ b/public/Vamshidhar_Reddy_M_CV.docx
@@ -4,55 +4,61 @@
   <w:body>
     <w:p>
       <w:pPr>
-        <w:spacing w:before="0" w:after="20"/>
+        <w:spacing w:before="0" w:after="0"/>
+        <w:shd w:val="clear" w:color="auto" w:fill="EEF2F8"/>
       </w:pPr>
       <w:r>
         <w:rPr>
           <w:b/>
           <w:i w:val="0"/>
           <w:color w:val="1F3364"/>
-          <w:sz w:val="44"/>
+          <w:sz w:val="40"/>
         </w:rPr>
         <w:t>VAMSHIDHAR REDDY M</w:t>
       </w:r>
     </w:p>
     <w:p>
       <w:pPr>
-        <w:spacing w:before="0" w:after="40"/>
+        <w:spacing w:before="0" w:after="0"/>
+        <w:shd w:val="clear" w:color="auto" w:fill="EEF2F8"/>
       </w:pPr>
       <w:r>
         <w:rPr>
           <w:b/>
           <w:i w:val="0"/>
-          <w:color w:val="1A1A1A"/>
-          <w:sz w:val="25"/>
+          <w:color w:val="0E7C7B"/>
+          <w:sz w:val="23"/>
         </w:rPr>
         <w:t>AI-Powered Digital Marketing Specialist</w:t>
       </w:r>
     </w:p>
     <w:p>
       <w:pPr>
-        <w:spacing w:before="0" w:after="60"/>
+        <w:spacing w:before="0" w:after="20"/>
+        <w:shd w:val="clear" w:color="auto" w:fill="EEF2F8"/>
+        <w:pBdr>
+          <w:bottom w:val="single" w:sz="8" w:space="2" w:color="1F3364"/>
+        </w:pBdr>
       </w:pPr>
       <w:r>
         <w:rPr>
           <w:b w:val="0"/>
           <w:i w:val="0"/>
           <w:color w:val="4A4A55"/>
-          <w:sz w:val="19"/>
+          <w:sz w:val="18"/>
         </w:rPr>
         <w:t>SEO | PPC | AI Automation | Content Strategy | Analytics &amp; Reporting</w:t>
       </w:r>
     </w:p>
     <w:p>
       <w:pPr>
-        <w:spacing w:before="0" w:after="20"/>
+        <w:spacing w:before="60" w:after="20"/>
       </w:pPr>
       <w:r>
         <w:rPr>
           <w:b w:val="0"/>
           <w:i w:val="0"/>
-          <w:color w:val="1A1A1A"/>
+          <w:color w:val="171717"/>
           <w:sz w:val="19"/>
         </w:rPr>
         <w:t>Hyderabad, India | +91-7981719085 | geovamshidhar@gmail.com</w:t>
@@ -66,7 +72,7 @@
         <w:rPr>
           <w:b w:val="0"/>
           <w:i w:val="0"/>
-          <w:color w:val="1A1A1A"/>
+          <w:color w:val="171717"/>
           <w:sz w:val="19"/>
         </w:rPr>
         <w:t>linkedin.com/in/vamshidharreddym | github.com/gitvamshidhar-m | vamshidharm.vercel.app</w:t>
@@ -74,14 +80,18 @@
     </w:p>
     <w:p>
       <w:pPr>
-        <w:spacing w:before="0" w:after="120"/>
+        <w:spacing w:before="0" w:after="0"/>
+        <w:shd w:val="clear" w:color="auto" w:fill="E8F3F2"/>
+        <w:pBdr>
+          <w:bottom w:val="single" w:sz="4" w:space="2" w:color="0E7C7B"/>
+        </w:pBdr>
       </w:pPr>
       <w:r>
         <w:rPr>
           <w:b/>
           <w:i w:val="0"/>
           <w:color w:val="1F3364"/>
-          <w:sz w:val="19"/>
+          <w:sz w:val="18"/>
         </w:rPr>
         <w:t>8+ Yrs Experience | 15% Organic Traffic | Page-1 Rankings | 70+ Leads/month | Rs.2L+ Ad Spend Managed</w:t>
       </w:r>
@@ -90,14 +100,14 @@
       <w:pPr>
         <w:spacing w:before="160" w:after="60"/>
         <w:pBdr>
-          <w:bottom w:val="single" w:sz="6" w:space="2" w:color="1F3364"/>
+          <w:bottom w:val="single" w:sz="10" w:space="2" w:color="0E7C7B"/>
         </w:pBdr>
       </w:pPr>
       <w:r>
         <w:rPr>
           <w:b/>
           <w:color w:val="1F3364"/>
-          <w:sz w:val="24"/>
+          <w:sz w:val="22"/>
         </w:rPr>
         <w:t>PROFILE</w:t>
       </w:r>
@@ -110,7 +120,7 @@
         <w:rPr>
           <w:b w:val="0"/>
           <w:i w:val="0"/>
-          <w:color w:val="1A1A1A"/>
+          <w:color w:val="171717"/>
           <w:sz w:val="20"/>
         </w:rPr>
         <w:t>AI-Powered Digital Marketing Specialist who turns 8+ years of SEO, PPC, and content expertise into measurable revenue growth: 15% organic traffic growth, first-page Google rankings, and 70+ qualified leads per month while managing Rs.2,00,000+ in monthly ad spend. Self-taught in Generative AI, with live products shipped SOLO on GitHub - a rare hybrid of marketing instinct and hands-on engineering with OpenAI API, Gemini AI, and AI agent design.</w:t>
@@ -118,13 +128,13 @@
     </w:p>
     <w:p>
       <w:pPr>
-        <w:spacing w:before="0" w:after="80"/>
+        <w:spacing w:before="0" w:after="40"/>
       </w:pPr>
       <w:r>
         <w:rPr>
           <w:b/>
           <w:i w:val="0"/>
-          <w:color w:val="1F3364"/>
+          <w:color w:val="0E7C7B"/>
           <w:sz w:val="19"/>
         </w:rPr>
         <w:t>Profitable Growth | High-Converting Copy &amp; SEO | Data-Driven A/B Optimization | AI-Augmented Workflows</w:t>
@@ -134,33 +144,47 @@
       <w:pPr>
         <w:spacing w:before="160" w:after="60"/>
         <w:pBdr>
-          <w:bottom w:val="single" w:sz="6" w:space="2" w:color="1F3364"/>
+          <w:bottom w:val="single" w:sz="10" w:space="2" w:color="0E7C7B"/>
         </w:pBdr>
       </w:pPr>
       <w:r>
         <w:rPr>
           <w:b/>
           <w:color w:val="1F3364"/>
-          <w:sz w:val="24"/>
+          <w:sz w:val="22"/>
         </w:rPr>
         <w:t>PROFESSIONAL EXPERIENCE</w:t>
       </w:r>
     </w:p>
     <w:p>
       <w:pPr>
-        <w:spacing w:before="100" w:after="20"/>
+        <w:keepNext/>
+        <w:tabs>
+          <w:tab w:pos="10224" w:val="right"/>
+        </w:tabs>
+        <w:spacing w:before="80" w:after="20"/>
       </w:pPr>
       <w:r>
         <w:rPr>
           <w:b/>
-          <w:color w:val="1A1A1A"/>
+          <w:color w:val="171717"/>
           <w:sz w:val="21"/>
         </w:rPr>
-        <w:t>DIGITAL MARKETING SPECIALIST   |   Autozilla Software Solutions Pvt Ltd</w:t>
+        <w:t>DIGITAL MARKETING SPECIALIST  |  Autozilla Software Solutions Pvt Ltd</w:t>
+      </w:r>
+      <w:r>
+        <w:rPr>
+          <w:b/>
+          <w:color w:val="0E7C7B"/>
+          <w:sz w:val="18"/>
+        </w:rPr>
+        <w:tab/>
+        <w:t>May 2023 - Present</w:t>
       </w:r>
     </w:p>
     <w:p>
       <w:pPr>
+        <w:keepNext/>
         <w:spacing w:after="40"/>
       </w:pPr>
       <w:r>
@@ -169,20 +193,20 @@
           <w:color w:val="4A4A55"/>
           <w:sz w:val="18"/>
         </w:rPr>
-        <w:t>May 2023 - Present   |   Hyderabad, India</w:t>
+        <w:t>Hyderabad, India</w:t>
       </w:r>
     </w:p>
     <w:p>
       <w:pPr>
         <w:spacing w:after="20"/>
-        <w:ind w:left="317" w:hanging="202"/>
+        <w:ind w:left="346" w:hanging="202"/>
       </w:pPr>
       <w:r>
         <w:rPr>
           <w:b/>
-          <w:color w:val="1F3364"/>
+          <w:color w:val="0E7C7B"/>
         </w:rPr>
-        <w:t xml:space="preserve">• </w:t>
+        <w:t xml:space="preserve">•  </w:t>
       </w:r>
       <w:r>
         <w:t>Grew organic website traffic by 15% through SEO audits, keyword gap analysis, content optimization, and technical issue resolution</w:t>
@@ -191,14 +215,14 @@
     <w:p>
       <w:pPr>
         <w:spacing w:after="20"/>
-        <w:ind w:left="317" w:hanging="202"/>
+        <w:ind w:left="346" w:hanging="202"/>
       </w:pPr>
       <w:r>
         <w:rPr>
           <w:b/>
-          <w:color w:val="1F3364"/>
+          <w:color w:val="0E7C7B"/>
         </w:rPr>
-        <w:t xml:space="preserve">• </w:t>
+        <w:t xml:space="preserve">•  </w:t>
       </w:r>
       <w:r>
         <w:t>Secured page-1 Google rankings for high-value competitive keywords, lifting qualified inbound traffic</w:t>
@@ -207,14 +231,14 @@
     <w:p>
       <w:pPr>
         <w:spacing w:after="20"/>
-        <w:ind w:left="317" w:hanging="202"/>
+        <w:ind w:left="346" w:hanging="202"/>
       </w:pPr>
       <w:r>
         <w:rPr>
           <w:b/>
-          <w:color w:val="1F3364"/>
+          <w:color w:val="0E7C7B"/>
         </w:rPr>
-        <w:t xml:space="preserve">• </w:t>
+        <w:t xml:space="preserve">•  </w:t>
       </w:r>
       <w:r>
         <w:t>Generated 70+ qualified leads per month by aligning SEO, Google Ads, and landing pages into one conversion funnel</w:t>
@@ -223,14 +247,14 @@
     <w:p>
       <w:pPr>
         <w:spacing w:after="20"/>
-        <w:ind w:left="317" w:hanging="202"/>
+        <w:ind w:left="346" w:hanging="202"/>
       </w:pPr>
       <w:r>
         <w:rPr>
           <w:b/>
-          <w:color w:val="1F3364"/>
+          <w:color w:val="0E7C7B"/>
         </w:rPr>
-        <w:t xml:space="preserve">• </w:t>
+        <w:t xml:space="preserve">•  </w:t>
       </w:r>
       <w:r>
         <w:t>Managed Google Ads budgets exceeding Rs.2,00,000 per month, optimizing cost-per-lead and return on ad spend</w:t>
@@ -239,14 +263,14 @@
     <w:p>
       <w:pPr>
         <w:spacing w:after="20"/>
-        <w:ind w:left="317" w:hanging="202"/>
+        <w:ind w:left="346" w:hanging="202"/>
       </w:pPr>
       <w:r>
         <w:rPr>
           <w:b/>
-          <w:color w:val="1F3364"/>
+          <w:color w:val="0E7C7B"/>
         </w:rPr>
-        <w:t xml:space="preserve">• </w:t>
+        <w:t xml:space="preserve">•  </w:t>
       </w:r>
       <w:r>
         <w:t>Built AI-assisted content workflows with Generative AI to accelerate production and improve search relevance</w:t>
@@ -255,14 +279,14 @@
     <w:p>
       <w:pPr>
         <w:spacing w:after="20"/>
-        <w:ind w:left="317" w:hanging="202"/>
+        <w:ind w:left="346" w:hanging="202"/>
       </w:pPr>
       <w:r>
         <w:rPr>
           <w:b/>
-          <w:color w:val="1F3364"/>
+          <w:color w:val="0E7C7B"/>
         </w:rPr>
-        <w:t xml:space="preserve">• </w:t>
+        <w:t xml:space="preserve">•  </w:t>
       </w:r>
       <w:r>
         <w:t>Delivered performance dashboards and actionable insights in GA4 and Looker Studio</w:t>
@@ -271,14 +295,14 @@
     <w:p>
       <w:pPr>
         <w:spacing w:after="20"/>
-        <w:ind w:left="317" w:hanging="202"/>
+        <w:ind w:left="346" w:hanging="202"/>
       </w:pPr>
       <w:r>
         <w:rPr>
           <w:b/>
-          <w:color w:val="1F3364"/>
+          <w:color w:val="0E7C7B"/>
         </w:rPr>
-        <w:t xml:space="preserve">• </w:t>
+        <w:t xml:space="preserve">•  </w:t>
       </w:r>
       <w:r>
         <w:t>Ran A/B tests on landing pages, ad copy, and CTAs, applying findings to lift conversion rates</w:t>
@@ -287,14 +311,14 @@
     <w:p>
       <w:pPr>
         <w:spacing w:after="20"/>
-        <w:ind w:left="317" w:hanging="202"/>
+        <w:ind w:left="346" w:hanging="202"/>
       </w:pPr>
       <w:r>
         <w:rPr>
           <w:b/>
-          <w:color w:val="1F3364"/>
+          <w:color w:val="0E7C7B"/>
         </w:rPr>
-        <w:t xml:space="preserve">• </w:t>
+        <w:t xml:space="preserve">•  </w:t>
       </w:r>
       <w:r>
         <w:t>Performed competitor analysis and search-intent mapping to find ranking opportunities and content gaps</w:t>
@@ -302,19 +326,33 @@
     </w:p>
     <w:p>
       <w:pPr>
-        <w:spacing w:before="100" w:after="20"/>
+        <w:keepNext/>
+        <w:tabs>
+          <w:tab w:pos="10224" w:val="right"/>
+        </w:tabs>
+        <w:spacing w:before="80" w:after="20"/>
       </w:pPr>
       <w:r>
         <w:rPr>
           <w:b/>
-          <w:color w:val="1A1A1A"/>
+          <w:color w:val="171717"/>
           <w:sz w:val="21"/>
         </w:rPr>
-        <w:t>CAMPAIGN SPECIALIST   |   Pranathi Software Services Pvt Ltd</w:t>
+        <w:t>CAMPAIGN SPECIALIST  |  Pranathi Software Services Pvt Ltd</w:t>
+      </w:r>
+      <w:r>
+        <w:rPr>
+          <w:b/>
+          <w:color w:val="0E7C7B"/>
+          <w:sz w:val="18"/>
+        </w:rPr>
+        <w:tab/>
+        <w:t>Jun 2022 - May 2023</w:t>
       </w:r>
     </w:p>
     <w:p>
       <w:pPr>
+        <w:keepNext/>
         <w:spacing w:after="40"/>
       </w:pPr>
       <w:r>
@@ -323,20 +361,20 @@
           <w:color w:val="4A4A55"/>
           <w:sz w:val="18"/>
         </w:rPr>
-        <w:t>Jun 2022 - May 2023   |   Hyderabad, India</w:t>
+        <w:t>Hyderabad, India</w:t>
       </w:r>
     </w:p>
     <w:p>
       <w:pPr>
         <w:spacing w:after="20"/>
-        <w:ind w:left="317" w:hanging="202"/>
+        <w:ind w:left="346" w:hanging="202"/>
       </w:pPr>
       <w:r>
         <w:rPr>
           <w:b/>
-          <w:color w:val="1F3364"/>
+          <w:color w:val="0E7C7B"/>
         </w:rPr>
-        <w:t xml:space="preserve">• </w:t>
+        <w:t xml:space="preserve">•  </w:t>
       </w:r>
       <w:r>
         <w:t>Managed SEO, PPC, and paid social across multiple client accounts, raising quality scores and cutting CPCs</w:t>
@@ -345,14 +383,14 @@
     <w:p>
       <w:pPr>
         <w:spacing w:after="20"/>
-        <w:ind w:left="317" w:hanging="202"/>
+        <w:ind w:left="346" w:hanging="202"/>
       </w:pPr>
       <w:r>
         <w:rPr>
           <w:b/>
-          <w:color w:val="1F3364"/>
+          <w:color w:val="0E7C7B"/>
         </w:rPr>
-        <w:t xml:space="preserve">• </w:t>
+        <w:t xml:space="preserve">•  </w:t>
       </w:r>
       <w:r>
         <w:t>Planned LinkedIn Ads for B2B lead generation, targeting by industry, job title, and seniority</w:t>
@@ -361,14 +399,14 @@
     <w:p>
       <w:pPr>
         <w:spacing w:after="20"/>
-        <w:ind w:left="317" w:hanging="202"/>
+        <w:ind w:left="346" w:hanging="202"/>
       </w:pPr>
       <w:r>
         <w:rPr>
           <w:b/>
-          <w:color w:val="1F3364"/>
+          <w:color w:val="0E7C7B"/>
         </w:rPr>
-        <w:t xml:space="preserve">• </w:t>
+        <w:t xml:space="preserve">•  </w:t>
       </w:r>
       <w:r>
         <w:t>Optimized bids, audiences, and schedules to improve ROAS and cut wasted spend</w:t>
@@ -377,14 +415,14 @@
     <w:p>
       <w:pPr>
         <w:spacing w:after="20"/>
-        <w:ind w:left="317" w:hanging="202"/>
+        <w:ind w:left="346" w:hanging="202"/>
       </w:pPr>
       <w:r>
         <w:rPr>
           <w:b/>
-          <w:color w:val="1F3364"/>
+          <w:color w:val="0E7C7B"/>
         </w:rPr>
-        <w:t xml:space="preserve">• </w:t>
+        <w:t xml:space="preserve">•  </w:t>
       </w:r>
       <w:r>
         <w:t>Built weekly KPI reports on impressions, CTR, conversions, and revenue attribution</w:t>
@@ -393,14 +431,14 @@
     <w:p>
       <w:pPr>
         <w:spacing w:after="20"/>
-        <w:ind w:left="317" w:hanging="202"/>
+        <w:ind w:left="346" w:hanging="202"/>
       </w:pPr>
       <w:r>
         <w:rPr>
           <w:b/>
-          <w:color w:val="1F3364"/>
+          <w:color w:val="0E7C7B"/>
         </w:rPr>
-        <w:t xml:space="preserve">• </w:t>
+        <w:t xml:space="preserve">•  </w:t>
       </w:r>
       <w:r>
         <w:t>Identified underperforming campaigns in GA and applied fixes that improved click-throughs and conversions</w:t>
@@ -408,19 +446,33 @@
     </w:p>
     <w:p>
       <w:pPr>
-        <w:spacing w:before="100" w:after="20"/>
+        <w:keepNext/>
+        <w:tabs>
+          <w:tab w:pos="10224" w:val="right"/>
+        </w:tabs>
+        <w:spacing w:before="80" w:after="20"/>
       </w:pPr>
       <w:r>
         <w:rPr>
           <w:b/>
-          <w:color w:val="1A1A1A"/>
+          <w:color w:val="171717"/>
           <w:sz w:val="21"/>
         </w:rPr>
-        <w:t>DIGITAL MARKETING EXECUTIVE   |   FAMA Technologies</w:t>
+        <w:t>DIGITAL MARKETING EXECUTIVE  |  FAMA Technologies</w:t>
+      </w:r>
+      <w:r>
+        <w:rPr>
+          <w:b/>
+          <w:color w:val="0E7C7B"/>
+          <w:sz w:val="18"/>
+        </w:rPr>
+        <w:tab/>
+        <w:t>Feb 2021 - May 2022</w:t>
       </w:r>
     </w:p>
     <w:p>
       <w:pPr>
+        <w:keepNext/>
         <w:spacing w:after="40"/>
       </w:pPr>
       <w:r>
@@ -429,20 +481,20 @@
           <w:color w:val="4A4A55"/>
           <w:sz w:val="18"/>
         </w:rPr>
-        <w:t>Feb 2021 - May 2022   |   Hyderabad, India</w:t>
+        <w:t>Hyderabad, India</w:t>
       </w:r>
     </w:p>
     <w:p>
       <w:pPr>
         <w:spacing w:after="20"/>
-        <w:ind w:left="317" w:hanging="202"/>
+        <w:ind w:left="346" w:hanging="202"/>
       </w:pPr>
       <w:r>
         <w:rPr>
           <w:b/>
-          <w:color w:val="1F3364"/>
+          <w:color w:val="0E7C7B"/>
         </w:rPr>
-        <w:t xml:space="preserve">• </w:t>
+        <w:t xml:space="preserve">•  </w:t>
       </w:r>
       <w:r>
         <w:t>Planned integrated SEO, PPC, and content campaigns that raised organic sessions and inbound enquiries</w:t>
@@ -451,14 +503,14 @@
     <w:p>
       <w:pPr>
         <w:spacing w:after="20"/>
-        <w:ind w:left="317" w:hanging="202"/>
+        <w:ind w:left="346" w:hanging="202"/>
       </w:pPr>
       <w:r>
         <w:rPr>
           <w:b/>
-          <w:color w:val="1F3364"/>
+          <w:color w:val="0E7C7B"/>
         </w:rPr>
-        <w:t xml:space="preserve">• </w:t>
+        <w:t xml:space="preserve">•  </w:t>
       </w:r>
       <w:r>
         <w:t>Ran A/B and multivariate tests on landing pages and creatives, driving CRO improvements</w:t>
@@ -467,14 +519,14 @@
     <w:p>
       <w:pPr>
         <w:spacing w:after="20"/>
-        <w:ind w:left="317" w:hanging="202"/>
+        <w:ind w:left="346" w:hanging="202"/>
       </w:pPr>
       <w:r>
         <w:rPr>
           <w:b/>
-          <w:color w:val="1F3364"/>
+          <w:color w:val="0E7C7B"/>
         </w:rPr>
-        <w:t xml:space="preserve">• </w:t>
+        <w:t xml:space="preserve">•  </w:t>
       </w:r>
       <w:r>
         <w:t>Conducted technical SEO audits (crawl errors, page speed, schema gaps) and coordinated fixes with dev</w:t>
@@ -483,14 +535,14 @@
     <w:p>
       <w:pPr>
         <w:spacing w:after="20"/>
-        <w:ind w:left="317" w:hanging="202"/>
+        <w:ind w:left="346" w:hanging="202"/>
       </w:pPr>
       <w:r>
         <w:rPr>
           <w:b/>
-          <w:color w:val="1F3364"/>
+          <w:color w:val="0E7C7B"/>
         </w:rPr>
-        <w:t xml:space="preserve">• </w:t>
+        <w:t xml:space="preserve">•  </w:t>
       </w:r>
       <w:r>
         <w:t>Built search-intent-aligned content to grow topical authority and rankings</w:t>
@@ -498,19 +550,33 @@
     </w:p>
     <w:p>
       <w:pPr>
-        <w:spacing w:before="100" w:after="20"/>
+        <w:keepNext/>
+        <w:tabs>
+          <w:tab w:pos="10224" w:val="right"/>
+        </w:tabs>
+        <w:spacing w:before="80" w:after="20"/>
       </w:pPr>
       <w:r>
         <w:rPr>
           <w:b/>
-          <w:color w:val="1A1A1A"/>
+          <w:color w:val="171717"/>
           <w:sz w:val="21"/>
         </w:rPr>
-        <w:t>DIGITAL MARKETING EXECUTIVE   |   E-Rad Imaging &amp; Reporting Services Pvt Ltd</w:t>
+        <w:t>DIGITAL MARKETING EXECUTIVE  |  E-Rad Imaging &amp; Reporting Services Pvt Ltd</w:t>
+      </w:r>
+      <w:r>
+        <w:rPr>
+          <w:b/>
+          <w:color w:val="0E7C7B"/>
+          <w:sz w:val="18"/>
+        </w:rPr>
+        <w:tab/>
+        <w:t>Jun 2019 - Sep 2020</w:t>
       </w:r>
     </w:p>
     <w:p>
       <w:pPr>
+        <w:keepNext/>
         <w:spacing w:after="40"/>
       </w:pPr>
       <w:r>
@@ -519,20 +585,20 @@
           <w:color w:val="4A4A55"/>
           <w:sz w:val="18"/>
         </w:rPr>
-        <w:t>Jun 2019 - Sep 2020   |   Hyderabad, India</w:t>
+        <w:t>Hyderabad, India</w:t>
       </w:r>
     </w:p>
     <w:p>
       <w:pPr>
         <w:spacing w:after="20"/>
-        <w:ind w:left="317" w:hanging="202"/>
+        <w:ind w:left="346" w:hanging="202"/>
       </w:pPr>
       <w:r>
         <w:rPr>
           <w:b/>
-          <w:color w:val="1F3364"/>
+          <w:color w:val="0E7C7B"/>
         </w:rPr>
-        <w:t xml:space="preserve">• </w:t>
+        <w:t xml:space="preserve">•  </w:t>
       </w:r>
       <w:r>
         <w:t>Managed end-to-end SEO - keyword research, on-page optimization, link building, and monthly reporting</w:t>
@@ -541,14 +607,14 @@
     <w:p>
       <w:pPr>
         <w:spacing w:after="20"/>
-        <w:ind w:left="317" w:hanging="202"/>
+        <w:ind w:left="346" w:hanging="202"/>
       </w:pPr>
       <w:r>
         <w:rPr>
           <w:b/>
-          <w:color w:val="1F3364"/>
+          <w:color w:val="0E7C7B"/>
         </w:rPr>
-        <w:t xml:space="preserve">• </w:t>
+        <w:t xml:space="preserve">•  </w:t>
       </w:r>
       <w:r>
         <w:t>Delivered monthly audit reports with prioritized actions that lifted domain visibility and rankings</w:t>
@@ -557,14 +623,14 @@
     <w:p>
       <w:pPr>
         <w:spacing w:after="20"/>
-        <w:ind w:left="317" w:hanging="202"/>
+        <w:ind w:left="346" w:hanging="202"/>
       </w:pPr>
       <w:r>
         <w:rPr>
           <w:b/>
-          <w:color w:val="1F3364"/>
+          <w:color w:val="0E7C7B"/>
         </w:rPr>
-        <w:t xml:space="preserve">• </w:t>
+        <w:t xml:space="preserve">•  </w:t>
       </w:r>
       <w:r>
         <w:t>Executed off-page SEO (guest posts, directories) to build domain authority</w:t>
@@ -572,19 +638,33 @@
     </w:p>
     <w:p>
       <w:pPr>
-        <w:spacing w:before="100" w:after="20"/>
+        <w:keepNext/>
+        <w:tabs>
+          <w:tab w:pos="10224" w:val="right"/>
+        </w:tabs>
+        <w:spacing w:before="80" w:after="20"/>
       </w:pPr>
       <w:r>
         <w:rPr>
           <w:b/>
-          <w:color w:val="1A1A1A"/>
+          <w:color w:val="171717"/>
           <w:sz w:val="21"/>
         </w:rPr>
-        <w:t>SEO &amp; SMO EXPERT   |   Promantra Synergies Pvt Ltd</w:t>
+        <w:t>SEO &amp; SMO EXPERT  |  Promantra Synergies Pvt Ltd</w:t>
+      </w:r>
+      <w:r>
+        <w:rPr>
+          <w:b/>
+          <w:color w:val="0E7C7B"/>
+          <w:sz w:val="18"/>
+        </w:rPr>
+        <w:tab/>
+        <w:t>Nov 2017 - May 2019</w:t>
       </w:r>
     </w:p>
     <w:p>
       <w:pPr>
+        <w:keepNext/>
         <w:spacing w:after="40"/>
       </w:pPr>
       <w:r>
@@ -593,20 +673,20 @@
           <w:color w:val="4A4A55"/>
           <w:sz w:val="18"/>
         </w:rPr>
-        <w:t>Nov 2017 - May 2019   |   Hyderabad, India</w:t>
+        <w:t>Hyderabad, India</w:t>
       </w:r>
     </w:p>
     <w:p>
       <w:pPr>
         <w:spacing w:after="20"/>
-        <w:ind w:left="317" w:hanging="202"/>
+        <w:ind w:left="346" w:hanging="202"/>
       </w:pPr>
       <w:r>
         <w:rPr>
           <w:b/>
-          <w:color w:val="1F3364"/>
+          <w:color w:val="0E7C7B"/>
         </w:rPr>
-        <w:t xml:space="preserve">• </w:t>
+        <w:t xml:space="preserve">•  </w:t>
       </w:r>
       <w:r>
         <w:t>Led SEO and social campaigns that grew brand visibility and reach across search and social</w:t>
@@ -615,14 +695,14 @@
     <w:p>
       <w:pPr>
         <w:spacing w:after="20"/>
-        <w:ind w:left="317" w:hanging="202"/>
+        <w:ind w:left="346" w:hanging="202"/>
       </w:pPr>
       <w:r>
         <w:rPr>
           <w:b/>
-          <w:color w:val="1F3364"/>
+          <w:color w:val="0E7C7B"/>
         </w:rPr>
-        <w:t xml:space="preserve">• </w:t>
+        <w:t xml:space="preserve">•  </w:t>
       </w:r>
       <w:r>
         <w:t>Built content and engagement strategies aligned with keyword and audience targeting</w:t>
@@ -631,14 +711,14 @@
     <w:p>
       <w:pPr>
         <w:spacing w:after="20"/>
-        <w:ind w:left="317" w:hanging="202"/>
+        <w:ind w:left="346" w:hanging="202"/>
       </w:pPr>
       <w:r>
         <w:rPr>
           <w:b/>
-          <w:color w:val="1F3364"/>
+          <w:color w:val="0E7C7B"/>
         </w:rPr>
-        <w:t xml:space="preserve">• </w:t>
+        <w:t xml:space="preserve">•  </w:t>
       </w:r>
       <w:r>
         <w:t>Ran competitor benchmarking and link-building outreach to strengthen domain authority</w:t>
@@ -646,19 +726,33 @@
     </w:p>
     <w:p>
       <w:pPr>
-        <w:spacing w:before="100" w:after="20"/>
+        <w:keepNext/>
+        <w:tabs>
+          <w:tab w:pos="10224" w:val="right"/>
+        </w:tabs>
+        <w:spacing w:before="80" w:after="20"/>
       </w:pPr>
       <w:r>
         <w:rPr>
           <w:b/>
-          <w:color w:val="1A1A1A"/>
+          <w:color w:val="171717"/>
           <w:sz w:val="21"/>
         </w:rPr>
-        <w:t>SEO EXECUTIVE   |   Digital Way Soft</w:t>
+        <w:t>SEO EXECUTIVE  |  Digital Way Soft</w:t>
+      </w:r>
+      <w:r>
+        <w:rPr>
+          <w:b/>
+          <w:color w:val="0E7C7B"/>
+          <w:sz w:val="18"/>
+        </w:rPr>
+        <w:tab/>
+        <w:t>Jan 2015 - Nov 2017</w:t>
       </w:r>
     </w:p>
     <w:p>
       <w:pPr>
+        <w:keepNext/>
         <w:spacing w:after="40"/>
       </w:pPr>
       <w:r>
@@ -667,20 +761,20 @@
           <w:color w:val="4A4A55"/>
           <w:sz w:val="18"/>
         </w:rPr>
-        <w:t>Jan 2015 - Nov 2017   |   Hyderabad, India</w:t>
+        <w:t>Hyderabad, India</w:t>
       </w:r>
     </w:p>
     <w:p>
       <w:pPr>
         <w:spacing w:after="20"/>
-        <w:ind w:left="317" w:hanging="202"/>
+        <w:ind w:left="346" w:hanging="202"/>
       </w:pPr>
       <w:r>
         <w:rPr>
           <w:b/>
-          <w:color w:val="1F3364"/>
+          <w:color w:val="0E7C7B"/>
         </w:rPr>
-        <w:t xml:space="preserve">• </w:t>
+        <w:t xml:space="preserve">•  </w:t>
       </w:r>
       <w:r>
         <w:t>Managed technical SEO, on-page, off-page, and keyword research across multiple client sites</w:t>
@@ -689,14 +783,14 @@
     <w:p>
       <w:pPr>
         <w:spacing w:after="20"/>
-        <w:ind w:left="317" w:hanging="202"/>
+        <w:ind w:left="346" w:hanging="202"/>
       </w:pPr>
       <w:r>
         <w:rPr>
           <w:b/>
-          <w:color w:val="1F3364"/>
+          <w:color w:val="0E7C7B"/>
         </w:rPr>
-        <w:t xml:space="preserve">• </w:t>
+        <w:t xml:space="preserve">•  </w:t>
       </w:r>
       <w:r>
         <w:t>Improved organic rankings through content optimization, internal linking, and meta fixes</w:t>
@@ -704,19 +798,33 @@
     </w:p>
     <w:p>
       <w:pPr>
-        <w:spacing w:before="100" w:after="20"/>
+        <w:keepNext/>
+        <w:tabs>
+          <w:tab w:pos="10224" w:val="right"/>
+        </w:tabs>
+        <w:spacing w:before="80" w:after="20"/>
       </w:pPr>
       <w:r>
         <w:rPr>
           <w:b/>
-          <w:color w:val="1A1A1A"/>
+          <w:color w:val="171717"/>
           <w:sz w:val="21"/>
         </w:rPr>
-        <w:t>SOFTWARE / JUNIOR TEST ENGINEER   |   Ainslee Software Technologies &amp; Corbz Data Info Solutions</w:t>
+        <w:t>SOFTWARE / JUNIOR TEST ENGINEER  |  Ainslee Software Technologies &amp; Corbz Data Info Solutions</w:t>
+      </w:r>
+      <w:r>
+        <w:rPr>
+          <w:b/>
+          <w:color w:val="0E7C7B"/>
+          <w:sz w:val="18"/>
+        </w:rPr>
+        <w:tab/>
+        <w:t>May 2007 - Sep 2014</w:t>
       </w:r>
     </w:p>
     <w:p>
       <w:pPr>
+        <w:keepNext/>
         <w:spacing w:after="40"/>
       </w:pPr>
       <w:r>
@@ -725,20 +833,20 @@
           <w:color w:val="4A4A55"/>
           <w:sz w:val="18"/>
         </w:rPr>
-        <w:t>May 2007 - Sep 2014   |   Hyderabad, India</w:t>
+        <w:t>Hyderabad, India</w:t>
       </w:r>
     </w:p>
     <w:p>
       <w:pPr>
         <w:spacing w:after="20"/>
-        <w:ind w:left="317" w:hanging="202"/>
+        <w:ind w:left="346" w:hanging="202"/>
       </w:pPr>
       <w:r>
         <w:rPr>
           <w:b/>
-          <w:color w:val="1F3364"/>
+          <w:color w:val="0E7C7B"/>
         </w:rPr>
-        <w:t xml:space="preserve">• </w:t>
+        <w:t xml:space="preserve">•  </w:t>
       </w:r>
       <w:r>
         <w:t>Designed test plans, cases, and defect reports for web and enterprise projects (functional, regression, UAT)</w:t>
@@ -747,14 +855,14 @@
     <w:p>
       <w:pPr>
         <w:spacing w:after="20"/>
-        <w:ind w:left="317" w:hanging="202"/>
+        <w:ind w:left="346" w:hanging="202"/>
       </w:pPr>
       <w:r>
         <w:rPr>
           <w:b/>
-          <w:color w:val="1F3364"/>
+          <w:color w:val="0E7C7B"/>
         </w:rPr>
-        <w:t xml:space="preserve">• </w:t>
+        <w:t xml:space="preserve">•  </w:t>
       </w:r>
       <w:r>
         <w:t>Built the analytical, root-cause base that now drives data-led marketing decisions</w:t>
@@ -764,33 +872,35 @@
       <w:pPr>
         <w:spacing w:before="160" w:after="60"/>
         <w:pBdr>
-          <w:bottom w:val="single" w:sz="6" w:space="2" w:color="1F3364"/>
+          <w:bottom w:val="single" w:sz="10" w:space="2" w:color="0E7C7B"/>
         </w:pBdr>
       </w:pPr>
       <w:r>
         <w:rPr>
           <w:b/>
           <w:color w:val="1F3364"/>
-          <w:sz w:val="24"/>
+          <w:sz w:val="22"/>
         </w:rPr>
         <w:t>FEATURED PROJECTS</w:t>
       </w:r>
     </w:p>
     <w:p>
       <w:pPr>
-        <w:spacing w:before="120" w:after="20"/>
+        <w:keepNext/>
+        <w:spacing w:before="100" w:after="20"/>
       </w:pPr>
       <w:r>
         <w:rPr>
           <w:b/>
           <w:color w:val="1F3364"/>
-          <w:sz w:val="20"/>
+          <w:sz w:val="21"/>
         </w:rPr>
         <w:t>HOOK AI - AI Marketing Copy Engine</w:t>
       </w:r>
     </w:p>
     <w:p>
       <w:pPr>
+        <w:keepNext/>
         <w:spacing w:before="0" w:after="40"/>
       </w:pPr>
       <w:r>
@@ -798,13 +908,92 @@
           <w:b w:val="0"/>
           <w:i w:val="0"/>
           <w:color w:val="4A4A55"/>
-          <w:sz w:val="19"/>
+          <w:sz w:val="18"/>
         </w:rPr>
-        <w:t>Designed, built &amp; launched SOLO - my own one-person product</w:t>
+        <w:t>Designed, built &amp; launched SOLO. Next.js | Supabase | TypeScript | Stripe &amp; Razorpay | Vercel | Groq AI. Github: github.com/gitvamshidhar-m/hook-ai-marketing-engine | Live: hook-ai-marketing-engine.vercel.app</w:t>
       </w:r>
     </w:p>
     <w:p>
       <w:pPr>
+        <w:spacing w:after="20"/>
+        <w:ind w:left="346" w:hanging="202"/>
+      </w:pPr>
+      <w:r>
+        <w:rPr>
+          <w:b/>
+          <w:color w:val="0E7C7B"/>
+        </w:rPr>
+        <w:t xml:space="preserve">•  </w:t>
+      </w:r>
+      <w:r>
+        <w:t>AI SaaS that writes conversion-ready hooks, headlines, and ad copy across 15+ niches - the complete toolkit a founder needs to win traffic and revenue</w:t>
+      </w:r>
+    </w:p>
+    <w:p>
+      <w:pPr>
+        <w:spacing w:after="20"/>
+        <w:ind w:left="346" w:hanging="202"/>
+      </w:pPr>
+      <w:r>
+        <w:rPr>
+          <w:b/>
+          <w:color w:val="0E7C7B"/>
+        </w:rPr>
+        <w:t xml:space="preserve">•  </w:t>
+      </w:r>
+      <w:r>
+        <w:t>Owned positioning, strategy, and launch; full SEO program (30+ blog posts, niche landing pages, auto sitemap, FAQ/HowTo schema) engineered to win rich results</w:t>
+      </w:r>
+    </w:p>
+    <w:p>
+      <w:pPr>
+        <w:spacing w:after="20"/>
+        <w:ind w:left="346" w:hanging="202"/>
+      </w:pPr>
+      <w:r>
+        <w:rPr>
+          <w:b/>
+          <w:color w:val="0E7C7B"/>
+        </w:rPr>
+        <w:t xml:space="preserve">•  </w:t>
+      </w:r>
+      <w:r>
+        <w:t>Built the acquisition funnel - scheduled email flows, exit-intent capture, referral program, A/B hero testing with statistical-significance reporting</w:t>
+      </w:r>
+    </w:p>
+    <w:p>
+      <w:pPr>
+        <w:spacing w:after="20"/>
+        <w:ind w:left="346" w:hanging="202"/>
+      </w:pPr>
+      <w:r>
+        <w:rPr>
+          <w:b/>
+          <w:color w:val="0E7C7B"/>
+        </w:rPr>
+        <w:t xml:space="preserve">•  </w:t>
+      </w:r>
+      <w:r>
+        <w:t>Full-stack Next.js + Supabase with Stripe &amp; Razorpay billing; 15+ niche AI copy generators powered by Groq AI; shipped solo on Vercel free tier</w:t>
+      </w:r>
+    </w:p>
+    <w:p>
+      <w:pPr>
+        <w:keepNext/>
+        <w:spacing w:before="100" w:after="20"/>
+      </w:pPr>
+      <w:r>
+        <w:rPr>
+          <w:b/>
+          <w:color w:val="1F3364"/>
+          <w:sz w:val="21"/>
+        </w:rPr>
+        <w:t>CREATIVE PREDICTOR - AI AD TESTING SUITE (v13.0)</w:t>
+      </w:r>
+    </w:p>
+    <w:p>
+      <w:pPr>
+        <w:keepNext/>
         <w:spacing w:before="0" w:after="40"/>
       </w:pPr>
       <w:r>
@@ -812,13 +1001,92 @@
           <w:b w:val="0"/>
           <w:i w:val="0"/>
           <w:color w:val="4A4A55"/>
-          <w:sz w:val="19"/>
+          <w:sz w:val="18"/>
         </w:rPr>
-        <w:t>Next.js | Supabase | TypeScript | Stripe &amp; Razorpay | Vercel | Groq AI</w:t>
+        <w:t>My second live product - a paid-media &amp; CRO intelligence suite. HTML/JS | Groq AI (Llama 3.3 70B) | OpenAI | HuggingFace Spaces. Live: mvamshi56-creative-predictor.static.hf.space</w:t>
       </w:r>
     </w:p>
     <w:p>
       <w:pPr>
+        <w:spacing w:after="20"/>
+        <w:ind w:left="346" w:hanging="202"/>
+      </w:pPr>
+      <w:r>
+        <w:rPr>
+          <w:b/>
+          <w:color w:val="0E7C7B"/>
+        </w:rPr>
+        <w:t xml:space="preserve">•  </w:t>
+      </w:r>
+      <w:r>
+        <w:t>Paste any ad creative and get a scored prediction of CTR, engagement, and conversion per platform (Meta, Google, LinkedIn, Instagram/Reels, TikTok)</w:t>
+      </w:r>
+    </w:p>
+    <w:p>
+      <w:pPr>
+        <w:spacing w:after="20"/>
+        <w:ind w:left="346" w:hanging="202"/>
+      </w:pPr>
+      <w:r>
+        <w:rPr>
+          <w:b/>
+          <w:color w:val="0E7C7B"/>
+        </w:rPr>
+        <w:t xml:space="preserve">•  </w:t>
+      </w:r>
+      <w:r>
+        <w:t>20+ decision modules - quality score, budget estimator, emotional arc, ad-fatigue, CRO checklist, ROAS calculator, attention heatmap, persona targeting</w:t>
+      </w:r>
+    </w:p>
+    <w:p>
+      <w:pPr>
+        <w:spacing w:after="20"/>
+        <w:ind w:left="346" w:hanging="202"/>
+      </w:pPr>
+      <w:r>
+        <w:rPr>
+          <w:b/>
+          <w:color w:val="0E7C7B"/>
+        </w:rPr>
+        <w:t xml:space="preserve">•  </w:t>
+      </w:r>
+      <w:r>
+        <w:t>Full A/B testing toolkit - side-by-side Version A vs B, statistical-significance calculator, and test-idea generator; Competitor Ad Decoder and Landing Page Analyzer</w:t>
+      </w:r>
+    </w:p>
+    <w:p>
+      <w:pPr>
+        <w:spacing w:after="20"/>
+        <w:ind w:left="346" w:hanging="202"/>
+      </w:pPr>
+      <w:r>
+        <w:rPr>
+          <w:b/>
+          <w:color w:val="0E7C7B"/>
+        </w:rPr>
+        <w:t xml:space="preserve">•  </w:t>
+      </w:r>
+      <w:r>
+        <w:t>AI engine switchable across Groq, OpenAI, and HuggingFace; shipped 13 product iterations (v13.0) - real iteration, not a one-day demo</w:t>
+      </w:r>
+    </w:p>
+    <w:p>
+      <w:pPr>
+        <w:keepNext/>
+        <w:spacing w:before="100" w:after="20"/>
+      </w:pPr>
+      <w:r>
+        <w:rPr>
+          <w:b/>
+          <w:color w:val="1F3364"/>
+          <w:sz w:val="21"/>
+        </w:rPr>
+        <w:t>AI GROWTH STRATEGY GENERATOR</w:t>
+      </w:r>
+    </w:p>
+    <w:p>
+      <w:pPr>
+        <w:keepNext/>
         <w:spacing w:before="0" w:after="40"/>
       </w:pPr>
       <w:r>
@@ -826,782 +1094,87 @@
           <w:b w:val="0"/>
           <w:i w:val="0"/>
           <w:color w:val="4A4A55"/>
-          <w:sz w:val="19"/>
+          <w:sz w:val="18"/>
         </w:rPr>
-        <w:t>Github: github.com/gitvamshidhar-m/hook-ai-marketing-engine | Live: hook-ai-marketing-engine.vercel.app</w:t>
-      </w:r>
-    </w:p>
-    <w:p>
-      <w:pPr>
-        <w:spacing w:before="60" w:after="20"/>
-      </w:pPr>
-      <w:r>
-        <w:rPr>
-          <w:b/>
-          <w:color w:val="1F3364"/>
-          <w:sz w:val="20"/>
-        </w:rPr>
-        <w:t>WHAT IT IS</w:t>
-      </w:r>
-    </w:p>
-    <w:p>
-      <w:pPr>
-        <w:spacing w:before="0" w:after="40"/>
-      </w:pPr>
-      <w:r>
-        <w:rPr>
-          <w:b w:val="0"/>
-          <w:i w:val="0"/>
-          <w:color w:val="1A1A1A"/>
-          <w:sz w:val="20"/>
-        </w:rPr>
-        <w:t>An AI SaaS that writes conversion-ready marketing hooks, headlines, and ad copy across 15+ niches (real estate, SaaS, fitness, insurance, local SEO, pet, wedding, accounting, photography, career and more) - the complete toolkit a founder needs to win traffic, growth, and revenue.</w:t>
-      </w:r>
-    </w:p>
-    <w:p>
-      <w:pPr>
-        <w:spacing w:before="60" w:after="20"/>
-      </w:pPr>
-      <w:r>
-        <w:rPr>
-          <w:b/>
-          <w:color w:val="1F3364"/>
-          <w:sz w:val="20"/>
-        </w:rPr>
-        <w:t>MARKETING &amp; GROWTH - WHAT I DID</w:t>
+        <w:t>My third live product - a funnel-based growth strategist. Next.js | Vercel. Live: strategy-generator-kwdf-beta.vercel.app</w:t>
       </w:r>
     </w:p>
     <w:p>
       <w:pPr>
         <w:spacing w:after="20"/>
-        <w:ind w:left="317" w:hanging="202"/>
+        <w:ind w:left="346" w:hanging="202"/>
       </w:pPr>
       <w:r>
         <w:rPr>
           <w:b/>
-          <w:color w:val="1F3364"/>
+          <w:color w:val="0E7C7B"/>
         </w:rPr>
-        <w:t xml:space="preserve">• </w:t>
+        <w:t xml:space="preserve">•  </w:t>
       </w:r>
       <w:r>
-        <w:t>Owned positioning, strategy, and launch execution for the entire product</w:t>
+        <w:t>AI-powered strategy generator: real business inputs in, a personalized budget-optimized marketing strategy out - in seconds</w:t>
       </w:r>
     </w:p>
     <w:p>
       <w:pPr>
         <w:spacing w:after="20"/>
-        <w:ind w:left="317" w:hanging="202"/>
+        <w:ind w:left="346" w:hanging="202"/>
       </w:pPr>
       <w:r>
         <w:rPr>
           <w:b/>
-          <w:color w:val="1F3364"/>
+          <w:color w:val="0E7C7B"/>
         </w:rPr>
-        <w:t xml:space="preserve">• </w:t>
+        <w:t xml:space="preserve">•  </w:t>
       </w:r>
       <w:r>
-        <w:t>Executed a full SEO program - 30+ long-form blog posts, niche landing pages, auto sitemap, and FAQ/HowTo schema - engineered to win rich results</w:t>
+        <w:t>Guided wizard (industry, budget, goal, strategy style) with optional KPI targets and competitor mapping for an instant SWOT</w:t>
       </w:r>
     </w:p>
     <w:p>
       <w:pPr>
         <w:spacing w:after="20"/>
-        <w:ind w:left="317" w:hanging="202"/>
+        <w:ind w:left="346" w:hanging="202"/>
       </w:pPr>
       <w:r>
         <w:rPr>
           <w:b/>
-          <w:color w:val="1F3364"/>
+          <w:color w:val="0E7C7B"/>
         </w:rPr>
-        <w:t xml:space="preserve">• </w:t>
+        <w:t xml:space="preserve">•  </w:t>
       </w:r>
       <w:r>
-        <w:t>Built the acquisition funnel - scheduled email flows, exit-intent lead capture, referral program, and A/B hero testing with statistical-significance reporting to lift CTR</w:t>
+        <w:t>Scoring engine + funnel split (awareness to loyalty) produce a prioritized roadmap scored by effort vs. impact</w:t>
       </w:r>
     </w:p>
     <w:p>
       <w:pPr>
         <w:spacing w:after="20"/>
-        <w:ind w:left="317" w:hanging="202"/>
+        <w:ind w:left="346" w:hanging="202"/>
       </w:pPr>
       <w:r>
         <w:rPr>
           <w:b/>
-          <w:color w:val="1F3364"/>
+          <w:color w:val="0E7C7B"/>
         </w:rPr>
-        <w:t xml:space="preserve">• </w:t>
+        <w:t xml:space="preserve">•  </w:t>
       </w:r>
       <w:r>
-        <w:t>Leveraged GA4-style dashboards and growth metrics to steer the funnel day-to-day</w:t>
-      </w:r>
-    </w:p>
-    <w:p>
-      <w:pPr>
-        <w:spacing w:before="60" w:after="20"/>
-      </w:pPr>
-      <w:r>
-        <w:rPr>
-          <w:b/>
-          <w:color w:val="1F3364"/>
-          <w:sz w:val="20"/>
-        </w:rPr>
-        <w:t>ENGINEERING - WHAT I BUILT</w:t>
-      </w:r>
-    </w:p>
-    <w:p>
-      <w:pPr>
-        <w:spacing w:after="20"/>
-        <w:ind w:left="317" w:hanging="202"/>
-      </w:pPr>
-      <w:r>
-        <w:rPr>
-          <w:b/>
-          <w:color w:val="1F3364"/>
-        </w:rPr>
-        <w:t xml:space="preserve">• </w:t>
-      </w:r>
-      <w:r>
-        <w:t>Full-stack Next.js app with Supabase database, authentication, and real-time features</w:t>
-      </w:r>
-    </w:p>
-    <w:p>
-      <w:pPr>
-        <w:spacing w:after="20"/>
-        <w:ind w:left="317" w:hanging="202"/>
-      </w:pPr>
-      <w:r>
-        <w:rPr>
-          <w:b/>
-          <w:color w:val="1F3364"/>
-        </w:rPr>
-        <w:t xml:space="preserve">• </w:t>
-      </w:r>
-      <w:r>
-        <w:t>Paid subscription billing wired with Stripe &amp; Razorpay; credits, referrals, and saved projects</w:t>
-      </w:r>
-    </w:p>
-    <w:p>
-      <w:pPr>
-        <w:spacing w:after="20"/>
-        <w:ind w:left="317" w:hanging="202"/>
-      </w:pPr>
-      <w:r>
-        <w:rPr>
-          <w:b/>
-          <w:color w:val="1F3364"/>
-        </w:rPr>
-        <w:t xml:space="preserve">• </w:t>
-      </w:r>
-      <w:r>
-        <w:t>15+ niche AI copy generators powered by Groq AI, plus a community hooks feed for social proof</w:t>
-      </w:r>
-    </w:p>
-    <w:p>
-      <w:pPr>
-        <w:spacing w:after="20"/>
-        <w:ind w:left="317" w:hanging="202"/>
-      </w:pPr>
-      <w:r>
-        <w:rPr>
-          <w:b/>
-          <w:color w:val="1F3364"/>
-        </w:rPr>
-        <w:t xml:space="preserve">• </w:t>
-      </w:r>
-      <w:r>
-        <w:t>Shipped and scaled solo on the Vercel free tier - auth, billing, analytics, and growth dashboards all live</w:t>
-      </w:r>
-    </w:p>
-    <w:p>
-      <w:pPr>
-        <w:spacing w:before="60" w:after="20"/>
-      </w:pPr>
-      <w:r>
-        <w:rPr>
-          <w:b/>
-          <w:color w:val="1F3364"/>
-          <w:sz w:val="20"/>
-        </w:rPr>
-        <w:t>PROOF - LIVE TODAY</w:t>
-      </w:r>
-    </w:p>
-    <w:p>
-      <w:pPr>
-        <w:spacing w:after="20"/>
-        <w:ind w:left="317" w:hanging="202"/>
-      </w:pPr>
-      <w:r>
-        <w:rPr>
-          <w:b/>
-          <w:color w:val="1F3364"/>
-        </w:rPr>
-        <w:t xml:space="preserve">• </w:t>
-      </w:r>
-      <w:r>
-        <w:t>Product is deployed and running in production, open on GitHub, with working auth and payments</w:t>
-      </w:r>
-    </w:p>
-    <w:p>
-      <w:pPr>
-        <w:spacing w:after="20"/>
-        <w:ind w:left="317" w:hanging="202"/>
-      </w:pPr>
-      <w:r>
-        <w:rPr>
-          <w:b/>
-          <w:color w:val="1F3364"/>
-        </w:rPr>
-        <w:t xml:space="preserve">• </w:t>
-      </w:r>
-      <w:r>
-        <w:t>Complete SEO site structure and content engine running without any agency or help</w:t>
-      </w:r>
-    </w:p>
-    <w:p>
-      <w:pPr>
-        <w:spacing w:after="20"/>
-        <w:ind w:left="317" w:hanging="202"/>
-      </w:pPr>
-      <w:r>
-        <w:rPr>
-          <w:b/>
-          <w:color w:val="1F3364"/>
-        </w:rPr>
-        <w:t xml:space="preserve">• </w:t>
-      </w:r>
-      <w:r>
-        <w:t>The strongest available proof of a digital marketer who can also engineer - rare in one person</w:t>
-      </w:r>
-    </w:p>
-    <w:p>
-      <w:pPr>
-        <w:spacing w:before="120" w:after="20"/>
-      </w:pPr>
-      <w:r>
-        <w:rPr>
-          <w:b/>
-          <w:color w:val="1F3364"/>
-          <w:sz w:val="20"/>
-        </w:rPr>
-        <w:t>CREATIVE PREDICTOR - AI AD TESTING SUITE (v13.0)</w:t>
-      </w:r>
-    </w:p>
-    <w:p>
-      <w:pPr>
-        <w:spacing w:before="0" w:after="40"/>
-      </w:pPr>
-      <w:r>
-        <w:rPr>
-          <w:b w:val="0"/>
-          <w:i w:val="0"/>
-          <w:color w:val="4A4A55"/>
-          <w:sz w:val="19"/>
-        </w:rPr>
-        <w:t>My second live product - a full paid-media &amp; CRO intelligence suite</w:t>
-      </w:r>
-    </w:p>
-    <w:p>
-      <w:pPr>
-        <w:spacing w:before="0" w:after="40"/>
-      </w:pPr>
-      <w:r>
-        <w:rPr>
-          <w:b w:val="0"/>
-          <w:i w:val="0"/>
-          <w:color w:val="4A4A55"/>
-          <w:sz w:val="19"/>
-        </w:rPr>
-        <w:t>HTML/JS front-end | Groq AI (Llama 3.3 70B) | OpenAI | HuggingFace Spaces</w:t>
-      </w:r>
-    </w:p>
-    <w:p>
-      <w:pPr>
-        <w:spacing w:before="0" w:after="40"/>
-      </w:pPr>
-      <w:r>
-        <w:rPr>
-          <w:b w:val="0"/>
-          <w:i w:val="0"/>
-          <w:color w:val="4A4A55"/>
-          <w:sz w:val="19"/>
-        </w:rPr>
-        <w:t>Live: mvamshi56-creative-predictor.static.hf.space</w:t>
-      </w:r>
-    </w:p>
-    <w:p>
-      <w:pPr>
-        <w:spacing w:before="60" w:after="20"/>
-      </w:pPr>
-      <w:r>
-        <w:rPr>
-          <w:b/>
-          <w:color w:val="1F3364"/>
-          <w:sz w:val="20"/>
-        </w:rPr>
-        <w:t>WHAT IT IS</w:t>
-      </w:r>
-    </w:p>
-    <w:p>
-      <w:pPr>
-        <w:spacing w:before="0" w:after="40"/>
-      </w:pPr>
-      <w:r>
-        <w:rPr>
-          <w:b w:val="0"/>
-          <w:i w:val="0"/>
-          <w:color w:val="1A1A1A"/>
-          <w:sz w:val="20"/>
-        </w:rPr>
-        <w:t>An all-in-one ad and landing-page intelligence suite for paid-media teams: paste any ad creative and receive a scored prediction, a full marketing analysis, and clear next actions - in seconds.</w:t>
-      </w:r>
-    </w:p>
-    <w:p>
-      <w:pPr>
-        <w:spacing w:before="60" w:after="20"/>
-      </w:pPr>
-      <w:r>
-        <w:rPr>
-          <w:b/>
-          <w:color w:val="1F3364"/>
-          <w:sz w:val="20"/>
-        </w:rPr>
-        <w:t>WHAT I BUILT</w:t>
-      </w:r>
-    </w:p>
-    <w:p>
-      <w:pPr>
-        <w:spacing w:after="20"/>
-        <w:ind w:left="317" w:hanging="202"/>
-      </w:pPr>
-      <w:r>
-        <w:rPr>
-          <w:b/>
-          <w:color w:val="1F3364"/>
-        </w:rPr>
-        <w:t xml:space="preserve">• </w:t>
-      </w:r>
-      <w:r>
-        <w:t>Ad Creative Analyzer - predicts overall creative score, CTR, engagement, and conversion per platform (Meta, Google, LinkedIn, Instagram/Reels, TikTok)</w:t>
-      </w:r>
-    </w:p>
-    <w:p>
-      <w:pPr>
-        <w:spacing w:after="20"/>
-        <w:ind w:left="317" w:hanging="202"/>
-      </w:pPr>
-      <w:r>
-        <w:rPr>
-          <w:b/>
-          <w:color w:val="1F3364"/>
-        </w:rPr>
-        <w:t xml:space="preserve">• </w:t>
-      </w:r>
-      <w:r>
-        <w:t>20+ decision modules - quality score, campaign budget estimator, emotional arc, copy-length optimizer, ad-fatigue estimator, psychological triggers, CTA deep analyzer, CRO checklist, funnel-stage analysis, ROAS calculator, customer avatar, attention heatmap, word-impact and persona targeting</w:t>
-      </w:r>
-    </w:p>
-    <w:p>
-      <w:pPr>
-        <w:spacing w:after="20"/>
-        <w:ind w:left="317" w:hanging="202"/>
-      </w:pPr>
-      <w:r>
-        <w:rPr>
-          <w:b/>
-          <w:color w:val="1F3364"/>
-        </w:rPr>
-        <w:t xml:space="preserve">• </w:t>
-      </w:r>
-      <w:r>
-        <w:t>Full A/B testing toolkit - side-by-side Version A vs B comparison, statistical-significance calculator, and A/B test idea generator</w:t>
-      </w:r>
-    </w:p>
-    <w:p>
-      <w:pPr>
-        <w:spacing w:after="20"/>
-        <w:ind w:left="317" w:hanging="202"/>
-      </w:pPr>
-      <w:r>
-        <w:rPr>
-          <w:b/>
-          <w:color w:val="1F3364"/>
-        </w:rPr>
-        <w:t xml:space="preserve">• </w:t>
-      </w:r>
-      <w:r>
-        <w:t>Competitor Ad Decoder - paste any competitor ad copy to decode positioning, find weaknesses, and get counter-strategies</w:t>
-      </w:r>
-    </w:p>
-    <w:p>
-      <w:pPr>
-        <w:spacing w:after="20"/>
-        <w:ind w:left="317" w:hanging="202"/>
-      </w:pPr>
-      <w:r>
-        <w:rPr>
-          <w:b/>
-          <w:color w:val="1F3364"/>
-        </w:rPr>
-        <w:t xml:space="preserve">• </w:t>
-      </w:r>
-      <w:r>
-        <w:t>Landing Page Analyzer - any URL (or pasted HTML) analyzed for SEO, GEO, AEO, CRO, and growth opportunities; export to PDF report or PPT</w:t>
-      </w:r>
-    </w:p>
-    <w:p>
-      <w:pPr>
-        <w:spacing w:after="20"/>
-        <w:ind w:left="317" w:hanging="202"/>
-      </w:pPr>
-      <w:r>
-        <w:rPr>
-          <w:b/>
-          <w:color w:val="1F3364"/>
-        </w:rPr>
-        <w:t xml:space="preserve">• </w:t>
-      </w:r>
-      <w:r>
-        <w:t>AI engine switchable across Groq (Llama 3.3 70B), OpenAI, and HuggingFace, with saved analyses and history</w:t>
-      </w:r>
-    </w:p>
-    <w:p>
-      <w:pPr>
-        <w:spacing w:before="60" w:after="20"/>
-      </w:pPr>
-      <w:r>
-        <w:rPr>
-          <w:b/>
-          <w:color w:val="1F3364"/>
-          <w:sz w:val="20"/>
-        </w:rPr>
-        <w:t>WHY IT MATTERS ON THE CV</w:t>
-      </w:r>
-    </w:p>
-    <w:p>
-      <w:pPr>
-        <w:spacing w:after="20"/>
-        <w:ind w:left="317" w:hanging="202"/>
-      </w:pPr>
-      <w:r>
-        <w:rPr>
-          <w:b/>
-          <w:color w:val="1F3364"/>
-        </w:rPr>
-        <w:t xml:space="preserve">• </w:t>
-      </w:r>
-      <w:r>
-        <w:t>I built the exact toolkit a PPC and CRO specialist uses daily - CTR, ROAS, quality score, fatigue, and funnel leaks</w:t>
-      </w:r>
-    </w:p>
-    <w:p>
-      <w:pPr>
-        <w:spacing w:after="20"/>
-        <w:ind w:left="317" w:hanging="202"/>
-      </w:pPr>
-      <w:r>
-        <w:rPr>
-          <w:b/>
-          <w:color w:val="1F3364"/>
-        </w:rPr>
-        <w:t xml:space="preserve">• </w:t>
-      </w:r>
-      <w:r>
-        <w:t>Shipped 13 product iterations (v13.0) - real iteration, not a one-day demo</w:t>
-      </w:r>
-    </w:p>
-    <w:p>
-      <w:pPr>
-        <w:spacing w:after="20"/>
-        <w:ind w:left="317" w:hanging="202"/>
-      </w:pPr>
-      <w:r>
-        <w:rPr>
-          <w:b/>
-          <w:color w:val="1F3364"/>
-        </w:rPr>
-        <w:t xml:space="preserve">• </w:t>
-      </w:r>
-      <w:r>
-        <w:t>Live and clickable; pairs with Hook AI - one productizes growth strategy, this productizes paid media &amp; CRO</w:t>
-      </w:r>
-    </w:p>
-    <w:p>
-      <w:pPr>
-        <w:spacing w:before="120" w:after="20"/>
-      </w:pPr>
-      <w:r>
-        <w:rPr>
-          <w:b/>
-          <w:color w:val="1F3364"/>
-          <w:sz w:val="20"/>
-        </w:rPr>
-        <w:t>AI GROWTH STRATEGY GENERATOR</w:t>
-      </w:r>
-    </w:p>
-    <w:p>
-      <w:pPr>
-        <w:spacing w:before="0" w:after="40"/>
-      </w:pPr>
-      <w:r>
-        <w:rPr>
-          <w:b w:val="0"/>
-          <w:i w:val="0"/>
-          <w:color w:val="4A4A55"/>
-          <w:sz w:val="19"/>
-        </w:rPr>
-        <w:t>My third live product - a funnel-based growth strategist</w:t>
-      </w:r>
-    </w:p>
-    <w:p>
-      <w:pPr>
-        <w:spacing w:before="0" w:after="40"/>
-      </w:pPr>
-      <w:r>
-        <w:rPr>
-          <w:b w:val="0"/>
-          <w:i w:val="0"/>
-          <w:color w:val="4A4A55"/>
-          <w:sz w:val="19"/>
-        </w:rPr>
-        <w:t>Next.js | Vercel</w:t>
-      </w:r>
-    </w:p>
-    <w:p>
-      <w:pPr>
-        <w:spacing w:before="0" w:after="40"/>
-      </w:pPr>
-      <w:r>
-        <w:rPr>
-          <w:b w:val="0"/>
-          <w:i w:val="0"/>
-          <w:color w:val="4A4A55"/>
-          <w:sz w:val="19"/>
-        </w:rPr>
-        <w:t>Live: strategy-generator-kwdf-beta.vercel.app</w:t>
-      </w:r>
-    </w:p>
-    <w:p>
-      <w:pPr>
-        <w:spacing w:before="60" w:after="20"/>
-      </w:pPr>
-      <w:r>
-        <w:rPr>
-          <w:b/>
-          <w:color w:val="1F3364"/>
-          <w:sz w:val="20"/>
-        </w:rPr>
-        <w:t>WHAT IT IS</w:t>
-      </w:r>
-    </w:p>
-    <w:p>
-      <w:pPr>
-        <w:spacing w:before="0" w:after="40"/>
-      </w:pPr>
-      <w:r>
-        <w:rPr>
-          <w:b w:val="0"/>
-          <w:i w:val="0"/>
-          <w:color w:val="1A1A1A"/>
-          <w:sz w:val="20"/>
-        </w:rPr>
-        <w:t>An AI-powered, funnel-based strategy generator that does in seconds what a growth consultant maps over days: take real business inputs and return a personalized, budget-optimized marketing strategy.</w:t>
-      </w:r>
-    </w:p>
-    <w:p>
-      <w:pPr>
-        <w:spacing w:before="60" w:after="20"/>
-      </w:pPr>
-      <w:r>
-        <w:rPr>
-          <w:b/>
-          <w:color w:val="1F3364"/>
-          <w:sz w:val="20"/>
-        </w:rPr>
-        <w:t>WHAT I BUILT - INPUTS &amp; LOGIC</w:t>
-      </w:r>
-    </w:p>
-    <w:p>
-      <w:pPr>
-        <w:spacing w:after="20"/>
-        <w:ind w:left="317" w:hanging="202"/>
-      </w:pPr>
-      <w:r>
-        <w:rPr>
-          <w:b/>
-          <w:color w:val="1F3364"/>
-        </w:rPr>
-        <w:t xml:space="preserve">• </w:t>
-      </w:r>
-      <w:r>
-        <w:t>Designed a guided conversion wizard that captures the essentials a strategist truly needs - industry, monthly budget ($), primary goal, and strategy style (balanced / aggressive / conservative)</w:t>
-      </w:r>
-    </w:p>
-    <w:p>
-      <w:pPr>
-        <w:spacing w:after="20"/>
-        <w:ind w:left="317" w:hanging="202"/>
-      </w:pPr>
-      <w:r>
-        <w:rPr>
-          <w:b/>
-          <w:color w:val="1F3364"/>
-        </w:rPr>
-        <w:t xml:space="preserve">• </w:t>
-      </w:r>
-      <w:r>
-        <w:t>Added optional KPI targets (target CPA, ROAS, conversion rate) and competitor mapping - used to sharpen recommendations and run an instant SWOT</w:t>
-      </w:r>
-    </w:p>
-    <w:p>
-      <w:pPr>
-        <w:spacing w:after="20"/>
-        <w:ind w:left="317" w:hanging="202"/>
-      </w:pPr>
-      <w:r>
-        <w:rPr>
-          <w:b/>
-          <w:color w:val="1F3364"/>
-        </w:rPr>
-        <w:t xml:space="preserve">• </w:t>
-      </w:r>
-      <w:r>
-        <w:t>Collects current channels (SEO, PPC, social, email, content, paid social) and goal, and outputs a prioritized plan divided by impact</w:t>
-      </w:r>
-    </w:p>
-    <w:p>
-      <w:pPr>
-        <w:spacing w:after="20"/>
-        <w:ind w:left="317" w:hanging="202"/>
-      </w:pPr>
-      <w:r>
-        <w:rPr>
-          <w:b/>
-          <w:color w:val="1F3364"/>
-        </w:rPr>
-        <w:t xml:space="preserve">• </w:t>
-      </w:r>
-      <w:r>
-        <w:t>Built the scoring engine, funnel split (awareness to loyalty), and budget allocation logic in Next.js</w:t>
-      </w:r>
-    </w:p>
-    <w:p>
-      <w:pPr>
-        <w:spacing w:before="60" w:after="20"/>
-      </w:pPr>
-      <w:r>
-        <w:rPr>
-          <w:b/>
-          <w:color w:val="1F3364"/>
-          <w:sz w:val="20"/>
-        </w:rPr>
-        <w:t>WHAT THE OUTPUT GIVES THE USER</w:t>
-      </w:r>
-    </w:p>
-    <w:p>
-      <w:pPr>
-        <w:spacing w:after="20"/>
-        <w:ind w:left="317" w:hanging="202"/>
-      </w:pPr>
-      <w:r>
-        <w:rPr>
-          <w:b/>
-          <w:color w:val="1F3364"/>
-        </w:rPr>
-        <w:t xml:space="preserve">• </w:t>
-      </w:r>
-      <w:r>
-        <w:t>A clear, actionable roadmap - every move scored by effort vs. impact so effort goes where ROI is highest</w:t>
-      </w:r>
-    </w:p>
-    <w:p>
-      <w:pPr>
-        <w:spacing w:after="20"/>
-        <w:ind w:left="317" w:hanging="202"/>
-      </w:pPr>
-      <w:r>
-        <w:rPr>
-          <w:b/>
-          <w:color w:val="1F3364"/>
-        </w:rPr>
-        <w:t xml:space="preserve">• </w:t>
-      </w:r>
-      <w:r>
-        <w:t>Smart budget allocation across channels instead of guesses, in an awareness-to-loyalty funnel structure</w:t>
-      </w:r>
-    </w:p>
-    <w:p>
-      <w:pPr>
-        <w:spacing w:after="20"/>
-        <w:ind w:left="317" w:hanging="202"/>
-      </w:pPr>
-      <w:r>
-        <w:rPr>
-          <w:b/>
-          <w:color w:val="1F3364"/>
-        </w:rPr>
-        <w:t xml:space="preserve">• </w:t>
-      </w:r>
-      <w:r>
-        <w:t>Ready to execute same-day - the whole point being useful, not just impressive</w:t>
-      </w:r>
-    </w:p>
-    <w:p>
-      <w:pPr>
-        <w:spacing w:before="60" w:after="20"/>
-      </w:pPr>
-      <w:r>
-        <w:rPr>
-          <w:b/>
-          <w:color w:val="1F3364"/>
-          <w:sz w:val="20"/>
-        </w:rPr>
-        <w:t>WHY IT IS ON THE CV</w:t>
-      </w:r>
-    </w:p>
-    <w:p>
-      <w:pPr>
-        <w:spacing w:after="20"/>
-        <w:ind w:left="317" w:hanging="202"/>
-      </w:pPr>
-      <w:r>
-        <w:rPr>
-          <w:b/>
-          <w:color w:val="1F3364"/>
-        </w:rPr>
-        <w:t xml:space="preserve">• </w:t>
-      </w:r>
-      <w:r>
-        <w:t>First-hand proof I can productize the structured thinking behind paid media and growth strategy</w:t>
-      </w:r>
-    </w:p>
-    <w:p>
-      <w:pPr>
-        <w:spacing w:after="20"/>
-        <w:ind w:left="317" w:hanging="202"/>
-      </w:pPr>
-      <w:r>
-        <w:rPr>
-          <w:b/>
-          <w:color w:val="1F3364"/>
-        </w:rPr>
-        <w:t xml:space="preserve">• </w:t>
-      </w:r>
-      <w:r>
-        <w:t>A second self-shipped AI tool - proof the approach repeats, not a one-hit; live and clickable for recruiters</w:t>
+        <w:t>Second self-shipped AI tool - proof the approach repeats, not a one-hit; live and clickable for recruiters</w:t>
       </w:r>
     </w:p>
     <w:p>
       <w:pPr>
         <w:spacing w:before="160" w:after="60"/>
         <w:pBdr>
-          <w:bottom w:val="single" w:sz="6" w:space="2" w:color="1F3364"/>
+          <w:bottom w:val="single" w:sz="10" w:space="2" w:color="0E7C7B"/>
         </w:pBdr>
       </w:pPr>
       <w:r>
         <w:rPr>
           <w:b/>
           <w:color w:val="1F3364"/>
-          <w:sz w:val="24"/>
+          <w:sz w:val="22"/>
         </w:rPr>
         <w:t>TECHNICAL SKILLS</w:t>
       </w:r>
@@ -1705,14 +1278,14 @@
       <w:pPr>
         <w:spacing w:before="160" w:after="60"/>
         <w:pBdr>
-          <w:bottom w:val="single" w:sz="6" w:space="2" w:color="1F3364"/>
+          <w:bottom w:val="single" w:sz="10" w:space="2" w:color="0E7C7B"/>
         </w:pBdr>
       </w:pPr>
       <w:r>
         <w:rPr>
           <w:b/>
           <w:color w:val="1F3364"/>
-          <w:sz w:val="24"/>
+          <w:sz w:val="22"/>
         </w:rPr>
         <w:t>EDUCATION</w:t>
       </w:r>
@@ -1759,14 +1332,14 @@
       <w:pPr>
         <w:spacing w:before="160" w:after="60"/>
         <w:pBdr>
-          <w:bottom w:val="single" w:sz="6" w:space="2" w:color="1F3364"/>
+          <w:bottom w:val="single" w:sz="10" w:space="2" w:color="0E7C7B"/>
         </w:pBdr>
       </w:pPr>
       <w:r>
         <w:rPr>
           <w:b/>
           <w:color w:val="1F3364"/>
-          <w:sz w:val="24"/>
+          <w:sz w:val="22"/>
         </w:rPr>
         <w:t>CERTIFICATIONS</w:t>
       </w:r>
@@ -1832,14 +1405,14 @@
       <w:pPr>
         <w:spacing w:before="160" w:after="60"/>
         <w:pBdr>
-          <w:bottom w:val="single" w:sz="6" w:space="2" w:color="1F3364"/>
+          <w:bottom w:val="single" w:sz="10" w:space="2" w:color="0E7C7B"/>
         </w:pBdr>
       </w:pPr>
       <w:r>
         <w:rPr>
           <w:b/>
           <w:color w:val="1F3364"/>
-          <w:sz w:val="24"/>
+          <w:sz w:val="22"/>
         </w:rPr>
         <w:t>LANGUAGES</w:t>
       </w:r>
@@ -1852,7 +1425,7 @@
         <w:rPr>
           <w:b w:val="0"/>
           <w:i w:val="0"/>
-          <w:color w:val="1A1A1A"/>
+          <w:color w:val="171717"/>
           <w:sz w:val="20"/>
         </w:rPr>
         <w:t>English  |  Hindi  |  Telugu  |  Kannada</w:t>
@@ -1860,7 +1433,7 @@
     </w:p>
     <w:sectPr>
       <w:pgSz w:w="12240" w:h="15840"/>
-      <w:pgMar w:top="720" w:right="1008" w:bottom="720" w:left="1008" w:header="720" w:footer="720" w:gutter="0"/>
+      <w:pgMar w:top="792" w:right="1008" w:bottom="792" w:left="1008" w:header="720" w:footer="720" w:gutter="0"/>
       <w:cols w:space="720"/>
       <w:docGrid w:linePitch="360"/>
     </w:sectPr>
@@ -2236,7 +1809,7 @@
     </w:pPr>
     <w:rPr>
       <w:rFonts w:ascii="Calibri" w:hAnsi="Calibri" w:eastAsia="Calibri"/>
-      <w:color w:val="1A1A1A"/>
+      <w:color w:val="171717"/>
       <w:sz w:val="20"/>
     </w:rPr>
   </w:style>

</xml_diff>